<commit_message>
Add printable Oath/Law/Sign resources with official logo; restart Word list numbering; refresh downloads
</commit_message>
<xml_diff>
--- a/downloads/Den Guide - Arrow of Light.docx
+++ b/downloads/Den Guide - Arrow of Light.docx
@@ -235,7 +235,11 @@
     </w:p>
     <w:p>
       <w:pPr>
-        <w:pStyle w:val="ListNumber"/>
+        <w:spacing w:after="20"/>
+        <w:numPr>
+          <w:ilvl w:val="0"/>
+          <w:numId w:val="10"/>
+        </w:numPr>
       </w:pPr>
       <w:r>
         <w:t>Before (10 min): Den Chief + adult leader set up. Lay out materials. Write tonight's plan on a board or paper so everyone can see it.</w:t>
@@ -243,7 +247,11 @@
     </w:p>
     <w:p>
       <w:pPr>
-        <w:pStyle w:val="ListNumber"/>
+        <w:spacing w:after="20"/>
+        <w:numPr>
+          <w:ilvl w:val="0"/>
+          <w:numId w:val="10"/>
+        </w:numPr>
       </w:pPr>
       <w:r>
         <w:t>Gathering (10 min): As Scouts arrive they jump straight into the gathering game so no one is standing around. The host adult/Den Chief runs it while the leader takes attendance and collects any dues.</w:t>
@@ -251,7 +259,11 @@
     </w:p>
     <w:p>
       <w:pPr>
-        <w:pStyle w:val="ListNumber"/>
+        <w:spacing w:after="20"/>
+        <w:numPr>
+          <w:ilvl w:val="0"/>
+          <w:numId w:val="10"/>
+        </w:numPr>
       </w:pPr>
       <w:r>
         <w:t>Opening (5 min): Everyone stands. Do the flag/opening ceremony: Pledge of Allegiance, Scout Oath, and Scout Law. Keep it crisp.</w:t>
@@ -259,7 +271,11 @@
     </w:p>
     <w:p>
       <w:pPr>
-        <w:pStyle w:val="ListNumber"/>
+        <w:spacing w:after="20"/>
+        <w:numPr>
+          <w:ilvl w:val="0"/>
+          <w:numId w:val="10"/>
+        </w:numPr>
       </w:pPr>
       <w:r>
         <w:t>Activities (25-30 min): The main event - the adventure activities for tonight. This is where the requirements get done.</w:t>
@@ -267,7 +283,11 @@
     </w:p>
     <w:p>
       <w:pPr>
-        <w:pStyle w:val="ListNumber"/>
+        <w:spacing w:after="20"/>
+        <w:numPr>
+          <w:ilvl w:val="0"/>
+          <w:numId w:val="10"/>
+        </w:numPr>
       </w:pPr>
       <w:r>
         <w:t>Closing (5 min): Leader gives reminders (next meeting date, what to bring). Den Chief leads a short closing thought and the Living Circle.</w:t>
@@ -275,7 +295,11 @@
     </w:p>
     <w:p>
       <w:pPr>
-        <w:pStyle w:val="ListNumber"/>
+        <w:spacing w:after="20"/>
+        <w:numPr>
+          <w:ilvl w:val="0"/>
+          <w:numId w:val="10"/>
+        </w:numPr>
       </w:pPr>
       <w:r>
         <w:t>After (5 min): Scouts help put the room back in order. Leader + Den Chief quickly preview next week.</w:t>
@@ -562,7 +586,11 @@
     </w:p>
     <w:p>
       <w:pPr>
-        <w:pStyle w:val="ListNumber"/>
+        <w:spacing w:after="20"/>
+        <w:numPr>
+          <w:ilvl w:val="0"/>
+          <w:numId w:val="11"/>
+        </w:numPr>
       </w:pPr>
       <w:r>
         <w:t>As Scouts arrive, each writes or sketches one patrol-name idea on the board.</w:t>
@@ -570,7 +598,11 @@
     </w:p>
     <w:p>
       <w:pPr>
-        <w:pStyle w:val="ListNumber"/>
+        <w:spacing w:after="20"/>
+        <w:numPr>
+          <w:ilvl w:val="0"/>
+          <w:numId w:val="11"/>
+        </w:numPr>
       </w:pPr>
       <w:r>
         <w:t>Den Chief groups similar ideas and asks Scouts to add one symbol or cheer idea.</w:t>
@@ -578,7 +610,11 @@
     </w:p>
     <w:p>
       <w:pPr>
-        <w:pStyle w:val="ListNumber"/>
+        <w:spacing w:after="20"/>
+        <w:numPr>
+          <w:ilvl w:val="0"/>
+          <w:numId w:val="11"/>
+        </w:numPr>
       </w:pPr>
       <w:r>
         <w:t>Patrol leader candidates prepare a 20-second pitch for how they would help the patrol.</w:t>
@@ -597,7 +633,11 @@
     </w:p>
     <w:p>
       <w:pPr>
-        <w:pStyle w:val="ListNumber"/>
+        <w:spacing w:after="20"/>
+        <w:numPr>
+          <w:ilvl w:val="0"/>
+          <w:numId w:val="12"/>
+        </w:numPr>
       </w:pPr>
       <w:r>
         <w:t>Form up in a horseshoe or circle. Ask a Scout to lead the Pledge of Allegiance to the flag.</w:t>
@@ -605,7 +645,11 @@
     </w:p>
     <w:p>
       <w:pPr>
-        <w:pStyle w:val="ListNumber"/>
+        <w:spacing w:after="20"/>
+        <w:numPr>
+          <w:ilvl w:val="0"/>
+          <w:numId w:val="12"/>
+        </w:numPr>
       </w:pPr>
       <w:r>
         <w:t>Everyone gives the Cub Scout sign and recites the Scout Oath together.</w:t>
@@ -613,7 +657,11 @@
     </w:p>
     <w:p>
       <w:pPr>
-        <w:pStyle w:val="ListNumber"/>
+        <w:spacing w:after="20"/>
+        <w:numPr>
+          <w:ilvl w:val="0"/>
+          <w:numId w:val="12"/>
+        </w:numPr>
       </w:pPr>
       <w:r>
         <w:t>Recite the Scout Law together. Younger dens may say it line-by-line after the Den Chief.</w:t>
@@ -632,7 +680,11 @@
     </w:p>
     <w:p>
       <w:pPr>
-        <w:pStyle w:val="ListNumber"/>
+        <w:spacing w:after="20"/>
+        <w:numPr>
+          <w:ilvl w:val="0"/>
+          <w:numId w:val="13"/>
+        </w:numPr>
       </w:pPr>
       <w:r>
         <w:t>Den Chief explains that patrols plan, lead, and take care of each other - adults coach from the side.</w:t>
@@ -640,7 +692,11 @@
     </w:p>
     <w:p>
       <w:pPr>
-        <w:pStyle w:val="ListNumber"/>
+        <w:spacing w:after="20"/>
+        <w:numPr>
+          <w:ilvl w:val="0"/>
+          <w:numId w:val="13"/>
+        </w:numPr>
       </w:pPr>
       <w:r>
         <w:t>Scouts vote on a patrol name and elect a patrol leader for the month.</w:t>
@@ -648,7 +704,11 @@
     </w:p>
     <w:p>
       <w:pPr>
-        <w:pStyle w:val="ListNumber"/>
+        <w:spacing w:after="20"/>
+        <w:numPr>
+          <w:ilvl w:val="0"/>
+          <w:numId w:val="13"/>
+        </w:numPr>
       </w:pPr>
       <w:r>
         <w:t>Discuss benefits: everyone has a job, decisions are shared, and leadership rotates.</w:t>
@@ -679,7 +739,11 @@
     </w:p>
     <w:p>
       <w:pPr>
-        <w:pStyle w:val="ListNumber"/>
+        <w:spacing w:after="20"/>
+        <w:numPr>
+          <w:ilvl w:val="0"/>
+          <w:numId w:val="14"/>
+        </w:numPr>
       </w:pPr>
       <w:r>
         <w:t>Patrol leader runs a quick brainstorm: what makes meetings safe, respectful, and fun?</w:t>
@@ -687,7 +751,11 @@
     </w:p>
     <w:p>
       <w:pPr>
-        <w:pStyle w:val="ListNumber"/>
+        <w:spacing w:after="20"/>
+        <w:numPr>
+          <w:ilvl w:val="0"/>
+          <w:numId w:val="14"/>
+        </w:numPr>
       </w:pPr>
       <w:r>
         <w:t>Turn the best ideas into 5-7 clear rules using Scout Law words.</w:t>
@@ -695,7 +763,11 @@
     </w:p>
     <w:p>
       <w:pPr>
-        <w:pStyle w:val="ListNumber"/>
+        <w:spacing w:after="20"/>
+        <w:numPr>
+          <w:ilvl w:val="0"/>
+          <w:numId w:val="14"/>
+        </w:numPr>
       </w:pPr>
       <w:r>
         <w:t>Every Scout signs the code; post it at future meetings.</w:t>
@@ -726,7 +798,11 @@
     </w:p>
     <w:p>
       <w:pPr>
-        <w:pStyle w:val="ListNumber"/>
+        <w:spacing w:after="20"/>
+        <w:numPr>
+          <w:ilvl w:val="0"/>
+          <w:numId w:val="15"/>
+        </w:numPr>
       </w:pPr>
       <w:r>
         <w:t>Pair Scouts for 2-minute interviews: school, hobby, favorite camp food, one skill they can teach.</w:t>
@@ -734,7 +810,11 @@
     </w:p>
     <w:p>
       <w:pPr>
-        <w:pStyle w:val="ListNumber"/>
+        <w:spacing w:after="20"/>
+        <w:numPr>
+          <w:ilvl w:val="0"/>
+          <w:numId w:val="15"/>
+        </w:numPr>
       </w:pPr>
       <w:r>
         <w:t>Each Scout introduces their partner to the patrol.</w:t>
@@ -742,7 +822,11 @@
     </w:p>
     <w:p>
       <w:pPr>
-        <w:pStyle w:val="ListNumber"/>
+        <w:spacing w:after="20"/>
+        <w:numPr>
+          <w:ilvl w:val="0"/>
+          <w:numId w:val="15"/>
+        </w:numPr>
       </w:pPr>
       <w:r>
         <w:t>Patrol leader notes skills that can help future meetings.</w:t>
@@ -773,7 +857,11 @@
     </w:p>
     <w:p>
       <w:pPr>
-        <w:pStyle w:val="ListNumber"/>
+        <w:spacing w:after="20"/>
+        <w:numPr>
+          <w:ilvl w:val="0"/>
+          <w:numId w:val="16"/>
+        </w:numPr>
       </w:pPr>
       <w:r>
         <w:t>Form a circle. Everyone puts their left hand toward the center, little fingers linked to the next Scout.</w:t>
@@ -781,7 +869,11 @@
     </w:p>
     <w:p>
       <w:pPr>
-        <w:pStyle w:val="ListNumber"/>
+        <w:spacing w:after="20"/>
+        <w:numPr>
+          <w:ilvl w:val="0"/>
+          <w:numId w:val="16"/>
+        </w:numPr>
       </w:pPr>
       <w:r>
         <w:t>Den Chief shares a 1-sentence thought tied to tonight (e.g., 'Tonight we practiced being Helpful.').</w:t>
@@ -789,7 +881,11 @@
     </w:p>
     <w:p>
       <w:pPr>
-        <w:pStyle w:val="ListNumber"/>
+        <w:spacing w:after="20"/>
+        <w:numPr>
+          <w:ilvl w:val="0"/>
+          <w:numId w:val="16"/>
+        </w:numPr>
       </w:pPr>
       <w:r>
         <w:t>On the Den Chief's signal, everyone raises the circle and gives a quiet 'Do Your Best!' Dismiss.</w:t>
@@ -935,7 +1031,11 @@
     </w:p>
     <w:p>
       <w:pPr>
-        <w:pStyle w:val="ListNumber"/>
+        <w:spacing w:after="20"/>
+        <w:numPr>
+          <w:ilvl w:val="0"/>
+          <w:numId w:val="17"/>
+        </w:numPr>
       </w:pPr>
       <w:r>
         <w:t>Give teams mixed-up strips of the Scout Oath or Scout Law.</w:t>
@@ -943,7 +1043,11 @@
     </w:p>
     <w:p>
       <w:pPr>
-        <w:pStyle w:val="ListNumber"/>
+        <w:spacing w:after="20"/>
+        <w:numPr>
+          <w:ilvl w:val="0"/>
+          <w:numId w:val="17"/>
+        </w:numPr>
       </w:pPr>
       <w:r>
         <w:t>They race to put the words in order, then recite together.</w:t>
@@ -951,7 +1055,11 @@
     </w:p>
     <w:p>
       <w:pPr>
-        <w:pStyle w:val="ListNumber"/>
+        <w:spacing w:after="20"/>
+        <w:numPr>
+          <w:ilvl w:val="0"/>
+          <w:numId w:val="17"/>
+        </w:numPr>
       </w:pPr>
       <w:r>
         <w:t>Older Scouts explain one Law point they used during the game.</w:t>
@@ -970,7 +1078,11 @@
     </w:p>
     <w:p>
       <w:pPr>
-        <w:pStyle w:val="ListNumber"/>
+        <w:spacing w:after="20"/>
+        <w:numPr>
+          <w:ilvl w:val="0"/>
+          <w:numId w:val="18"/>
+        </w:numPr>
       </w:pPr>
       <w:r>
         <w:t>Form up in a horseshoe or circle. Ask a Scout to lead the Pledge of Allegiance to the flag.</w:t>
@@ -978,7 +1090,11 @@
     </w:p>
     <w:p>
       <w:pPr>
-        <w:pStyle w:val="ListNumber"/>
+        <w:spacing w:after="20"/>
+        <w:numPr>
+          <w:ilvl w:val="0"/>
+          <w:numId w:val="18"/>
+        </w:numPr>
       </w:pPr>
       <w:r>
         <w:t>Everyone gives the Cub Scout sign and recites the Scout Oath together.</w:t>
@@ -986,7 +1102,11 @@
     </w:p>
     <w:p>
       <w:pPr>
-        <w:pStyle w:val="ListNumber"/>
+        <w:spacing w:after="20"/>
+        <w:numPr>
+          <w:ilvl w:val="0"/>
+          <w:numId w:val="18"/>
+        </w:numPr>
       </w:pPr>
       <w:r>
         <w:t>Recite the Scout Law together. Younger dens may say it line-by-line after the Den Chief.</w:t>
@@ -1005,7 +1125,11 @@
     </w:p>
     <w:p>
       <w:pPr>
-        <w:pStyle w:val="ListNumber"/>
+        <w:spacing w:after="20"/>
+        <w:numPr>
+          <w:ilvl w:val="0"/>
+          <w:numId w:val="19"/>
+        </w:numPr>
       </w:pPr>
       <w:r>
         <w:t>Den Chief demonstrates Scouts BSA sign, salute, and handshake, explaining when each is used.</w:t>
@@ -1013,7 +1137,11 @@
     </w:p>
     <w:p>
       <w:pPr>
-        <w:pStyle w:val="ListNumber"/>
+        <w:spacing w:after="20"/>
+        <w:numPr>
+          <w:ilvl w:val="0"/>
+          <w:numId w:val="19"/>
+        </w:numPr>
       </w:pPr>
       <w:r>
         <w:t>Scouts practice in pairs, then teach it back to another pair.</w:t>
@@ -1021,7 +1149,11 @@
     </w:p>
     <w:p>
       <w:pPr>
-        <w:pStyle w:val="ListNumber"/>
+        <w:spacing w:after="20"/>
+        <w:numPr>
+          <w:ilvl w:val="0"/>
+          <w:numId w:val="19"/>
+        </w:numPr>
       </w:pPr>
       <w:r>
         <w:t>Patrol recites the Scout motto 'Be Prepared' and slogan 'Do a Good Turn Daily.'</w:t>
@@ -1052,7 +1184,11 @@
     </w:p>
     <w:p>
       <w:pPr>
-        <w:pStyle w:val="ListNumber"/>
+        <w:spacing w:after="20"/>
+        <w:numPr>
+          <w:ilvl w:val="0"/>
+          <w:numId w:val="20"/>
+        </w:numPr>
       </w:pPr>
       <w:r>
         <w:t>If the troop is meeting tonight, attend as a patrol, observe youth leadership, and ask prepared questions.</w:t>
@@ -1060,7 +1196,11 @@
     </w:p>
     <w:p>
       <w:pPr>
-        <w:pStyle w:val="ListNumber"/>
+        <w:spacing w:after="20"/>
+        <w:numPr>
+          <w:ilvl w:val="0"/>
+          <w:numId w:val="20"/>
+        </w:numPr>
       </w:pPr>
       <w:r>
         <w:t>If the visit is on another night, plan who is going, what to wear, and three questions to ask the SPL or patrol leaders.</w:t>
@@ -1068,7 +1208,11 @@
     </w:p>
     <w:p>
       <w:pPr>
-        <w:pStyle w:val="ListNumber"/>
+        <w:spacing w:after="20"/>
+        <w:numPr>
+          <w:ilvl w:val="0"/>
+          <w:numId w:val="20"/>
+        </w:numPr>
       </w:pPr>
       <w:r>
         <w:t>Afterward, each Scout names one troop practice the AOL patrol could try.</w:t>
@@ -1099,7 +1243,11 @@
     </w:p>
     <w:p>
       <w:pPr>
-        <w:pStyle w:val="ListNumber"/>
+        <w:spacing w:after="20"/>
+        <w:numPr>
+          <w:ilvl w:val="0"/>
+          <w:numId w:val="21"/>
+        </w:numPr>
       </w:pPr>
       <w:r>
         <w:t>Form a circle. Everyone puts their left hand toward the center, little fingers linked to the next Scout.</w:t>
@@ -1107,7 +1255,11 @@
     </w:p>
     <w:p>
       <w:pPr>
-        <w:pStyle w:val="ListNumber"/>
+        <w:spacing w:after="20"/>
+        <w:numPr>
+          <w:ilvl w:val="0"/>
+          <w:numId w:val="21"/>
+        </w:numPr>
       </w:pPr>
       <w:r>
         <w:t>Den Chief shares a 1-sentence thought tied to tonight (e.g., 'Tonight we practiced being Helpful.').</w:t>
@@ -1115,7 +1267,11 @@
     </w:p>
     <w:p>
       <w:pPr>
-        <w:pStyle w:val="ListNumber"/>
+        <w:spacing w:after="20"/>
+        <w:numPr>
+          <w:ilvl w:val="0"/>
+          <w:numId w:val="21"/>
+        </w:numPr>
       </w:pPr>
       <w:r>
         <w:t>On the Den Chief's signal, everyone raises the circle and gives a quiet 'Do Your Best!' Dismiss.</w:t>
@@ -1380,7 +1536,11 @@
     </w:p>
     <w:p>
       <w:pPr>
-        <w:pStyle w:val="ListNumber"/>
+        <w:spacing w:after="20"/>
+        <w:numPr>
+          <w:ilvl w:val="0"/>
+          <w:numId w:val="22"/>
+        </w:numPr>
       </w:pPr>
       <w:r>
         <w:t>Den Chief reads scenario cards as Scouts arrive.</w:t>
@@ -1388,7 +1548,11 @@
     </w:p>
     <w:p>
       <w:pPr>
-        <w:pStyle w:val="ListNumber"/>
+        <w:spacing w:after="20"/>
+        <w:numPr>
+          <w:ilvl w:val="0"/>
+          <w:numId w:val="22"/>
+        </w:numPr>
       </w:pPr>
       <w:r>
         <w:t>Scouts sort them into 'call 911 now,' 'get an adult/first-aid kit,' or 'not first aid.'</w:t>
@@ -1396,7 +1560,11 @@
     </w:p>
     <w:p>
       <w:pPr>
-        <w:pStyle w:val="ListNumber"/>
+        <w:spacing w:after="20"/>
+        <w:numPr>
+          <w:ilvl w:val="0"/>
+          <w:numId w:val="22"/>
+        </w:numPr>
       </w:pPr>
       <w:r>
         <w:t>Patrol leader asks one Scout to defend each choice.</w:t>
@@ -1415,7 +1583,11 @@
     </w:p>
     <w:p>
       <w:pPr>
-        <w:pStyle w:val="ListNumber"/>
+        <w:spacing w:after="20"/>
+        <w:numPr>
+          <w:ilvl w:val="0"/>
+          <w:numId w:val="23"/>
+        </w:numPr>
       </w:pPr>
       <w:r>
         <w:t>Form up in a horseshoe or circle. Ask a Scout to lead the Pledge of Allegiance to the flag.</w:t>
@@ -1423,7 +1595,11 @@
     </w:p>
     <w:p>
       <w:pPr>
-        <w:pStyle w:val="ListNumber"/>
+        <w:spacing w:after="20"/>
+        <w:numPr>
+          <w:ilvl w:val="0"/>
+          <w:numId w:val="23"/>
+        </w:numPr>
       </w:pPr>
       <w:r>
         <w:t>Everyone gives the Cub Scout sign and recites the Scout Oath together.</w:t>
@@ -1431,7 +1607,11 @@
     </w:p>
     <w:p>
       <w:pPr>
-        <w:pStyle w:val="ListNumber"/>
+        <w:spacing w:after="20"/>
+        <w:numPr>
+          <w:ilvl w:val="0"/>
+          <w:numId w:val="23"/>
+        </w:numPr>
       </w:pPr>
       <w:r>
         <w:t>Recite the Scout Law together. Younger dens may say it line-by-line after the Den Chief.</w:t>
@@ -1450,7 +1630,11 @@
     </w:p>
     <w:p>
       <w:pPr>
-        <w:pStyle w:val="ListNumber"/>
+        <w:spacing w:after="20"/>
+        <w:numPr>
+          <w:ilvl w:val="0"/>
+          <w:numId w:val="24"/>
+        </w:numPr>
       </w:pPr>
       <w:r>
         <w:t>Teach: check the scene, call for help, do not move the person unless unsafe, use gloves/barriers if available.</w:t>
@@ -1458,7 +1642,11 @@
     </w:p>
     <w:p>
       <w:pPr>
-        <w:pStyle w:val="ListNumber"/>
+        <w:spacing w:after="20"/>
+        <w:numPr>
+          <w:ilvl w:val="0"/>
+          <w:numId w:val="24"/>
+        </w:numPr>
       </w:pPr>
       <w:r>
         <w:t>Scouts run short scenarios and say exactly who they would tell and what they would do first.</w:t>
@@ -1466,7 +1654,11 @@
     </w:p>
     <w:p>
       <w:pPr>
-        <w:pStyle w:val="ListNumber"/>
+        <w:spacing w:after="20"/>
+        <w:numPr>
+          <w:ilvl w:val="0"/>
+          <w:numId w:val="24"/>
+        </w:numPr>
       </w:pPr>
       <w:r>
         <w:t>Emphasize staying calm and getting trained adult help fast.</w:t>
@@ -1497,7 +1689,11 @@
     </w:p>
     <w:p>
       <w:pPr>
-        <w:pStyle w:val="ListNumber"/>
+        <w:spacing w:after="20"/>
+        <w:numPr>
+          <w:ilvl w:val="0"/>
+          <w:numId w:val="25"/>
+        </w:numPr>
       </w:pPr>
       <w:r>
         <w:t>Rotate through stations for serious bleeding, heart attack/sudden cardiac arrest, stopped breathing, stroke, and poisoning.</w:t>
@@ -1505,7 +1701,11 @@
     </w:p>
     <w:p>
       <w:pPr>
-        <w:pStyle w:val="ListNumber"/>
+        <w:spacing w:after="20"/>
+        <w:numPr>
+          <w:ilvl w:val="0"/>
+          <w:numId w:val="25"/>
+        </w:numPr>
       </w:pPr>
       <w:r>
         <w:t>At each station, Scouts identify warning signs and practice the safe first response or call script.</w:t>
@@ -1513,7 +1713,11 @@
     </w:p>
     <w:p>
       <w:pPr>
-        <w:pStyle w:val="ListNumber"/>
+        <w:spacing w:after="20"/>
+        <w:numPr>
+          <w:ilvl w:val="0"/>
+          <w:numId w:val="25"/>
+        </w:numPr>
       </w:pPr>
       <w:r>
         <w:t>Den Chief uses EDGE, then lets Scouts coach the next pair.</w:t>
@@ -1544,7 +1748,11 @@
     </w:p>
     <w:p>
       <w:pPr>
-        <w:pStyle w:val="ListNumber"/>
+        <w:spacing w:after="20"/>
+        <w:numPr>
+          <w:ilvl w:val="0"/>
+          <w:numId w:val="26"/>
+        </w:numPr>
       </w:pPr>
       <w:r>
         <w:t>Demonstrate asking 'Are you choking?' and calling for help.</w:t>
@@ -1552,7 +1760,11 @@
     </w:p>
     <w:p>
       <w:pPr>
-        <w:pStyle w:val="ListNumber"/>
+        <w:spacing w:after="20"/>
+        <w:numPr>
+          <w:ilvl w:val="0"/>
+          <w:numId w:val="26"/>
+        </w:numPr>
       </w:pPr>
       <w:r>
         <w:t>Use a training vest/manikin or careful air-only practice to show abdominal thrust positioning.</w:t>
@@ -1560,7 +1772,11 @@
     </w:p>
     <w:p>
       <w:pPr>
-        <w:pStyle w:val="ListNumber"/>
+        <w:spacing w:after="20"/>
+        <w:numPr>
+          <w:ilvl w:val="0"/>
+          <w:numId w:val="26"/>
+        </w:numPr>
       </w:pPr>
       <w:r>
         <w:t>Scouts explain when to stop and when to call 911.</w:t>
@@ -1591,7 +1807,11 @@
     </w:p>
     <w:p>
       <w:pPr>
-        <w:pStyle w:val="ListNumber"/>
+        <w:spacing w:after="20"/>
+        <w:numPr>
+          <w:ilvl w:val="0"/>
+          <w:numId w:val="27"/>
+        </w:numPr>
       </w:pPr>
       <w:r>
         <w:t>Form a circle. Everyone puts their left hand toward the center, little fingers linked to the next Scout.</w:t>
@@ -1599,7 +1819,11 @@
     </w:p>
     <w:p>
       <w:pPr>
-        <w:pStyle w:val="ListNumber"/>
+        <w:spacing w:after="20"/>
+        <w:numPr>
+          <w:ilvl w:val="0"/>
+          <w:numId w:val="27"/>
+        </w:numPr>
       </w:pPr>
       <w:r>
         <w:t>Den Chief shares a 1-sentence thought tied to tonight (e.g., 'Tonight we practiced being Helpful.').</w:t>
@@ -1607,7 +1831,11 @@
     </w:p>
     <w:p>
       <w:pPr>
-        <w:pStyle w:val="ListNumber"/>
+        <w:spacing w:after="20"/>
+        <w:numPr>
+          <w:ilvl w:val="0"/>
+          <w:numId w:val="27"/>
+        </w:numPr>
       </w:pPr>
       <w:r>
         <w:t>On the Den Chief's signal, everyone raises the circle and gives a quiet 'Do Your Best!' Dismiss.</w:t>
@@ -1737,7 +1965,11 @@
     </w:p>
     <w:p>
       <w:pPr>
-        <w:pStyle w:val="ListNumber"/>
+        <w:spacing w:after="20"/>
+        <w:numPr>
+          <w:ilvl w:val="0"/>
+          <w:numId w:val="28"/>
+        </w:numPr>
       </w:pPr>
       <w:r>
         <w:t>Pairs practice wrapping a pretend forearm injury with a roller bandage.</w:t>
@@ -1745,7 +1977,11 @@
     </w:p>
     <w:p>
       <w:pPr>
-        <w:pStyle w:val="ListNumber"/>
+        <w:spacing w:after="20"/>
+        <w:numPr>
+          <w:ilvl w:val="0"/>
+          <w:numId w:val="28"/>
+        </w:numPr>
       </w:pPr>
       <w:r>
         <w:t>Quality counts: snug, not too tight, and the patient can wiggle fingers.</w:t>
@@ -1753,7 +1989,11 @@
     </w:p>
     <w:p>
       <w:pPr>
-        <w:pStyle w:val="ListNumber"/>
+        <w:spacing w:after="20"/>
+        <w:numPr>
+          <w:ilvl w:val="0"/>
+          <w:numId w:val="28"/>
+        </w:numPr>
       </w:pPr>
       <w:r>
         <w:t>Den Chief checks technique before they switch roles.</w:t>
@@ -1772,7 +2012,11 @@
     </w:p>
     <w:p>
       <w:pPr>
-        <w:pStyle w:val="ListNumber"/>
+        <w:spacing w:after="20"/>
+        <w:numPr>
+          <w:ilvl w:val="0"/>
+          <w:numId w:val="29"/>
+        </w:numPr>
       </w:pPr>
       <w:r>
         <w:t>Form up in a horseshoe or circle. Ask a Scout to lead the Pledge of Allegiance to the flag.</w:t>
@@ -1780,7 +2024,11 @@
     </w:p>
     <w:p>
       <w:pPr>
-        <w:pStyle w:val="ListNumber"/>
+        <w:spacing w:after="20"/>
+        <w:numPr>
+          <w:ilvl w:val="0"/>
+          <w:numId w:val="29"/>
+        </w:numPr>
       </w:pPr>
       <w:r>
         <w:t>Everyone gives the Cub Scout sign and recites the Scout Oath together.</w:t>
@@ -1788,7 +2036,11 @@
     </w:p>
     <w:p>
       <w:pPr>
-        <w:pStyle w:val="ListNumber"/>
+        <w:spacing w:after="20"/>
+        <w:numPr>
+          <w:ilvl w:val="0"/>
+          <w:numId w:val="29"/>
+        </w:numPr>
       </w:pPr>
       <w:r>
         <w:t>Recite the Scout Law together. Younger dens may say it line-by-line after the Den Chief.</w:t>
@@ -1807,7 +2059,11 @@
     </w:p>
     <w:p>
       <w:pPr>
-        <w:pStyle w:val="ListNumber"/>
+        <w:spacing w:after="20"/>
+        <w:numPr>
+          <w:ilvl w:val="0"/>
+          <w:numId w:val="30"/>
+        </w:numPr>
       </w:pPr>
       <w:r>
         <w:t>Run quick stations for cuts/scratches, burns/scalds, bites/stings, and nosebleeds.</w:t>
@@ -1815,7 +2071,11 @@
     </w:p>
     <w:p>
       <w:pPr>
-        <w:pStyle w:val="ListNumber"/>
+        <w:spacing w:after="20"/>
+        <w:numPr>
+          <w:ilvl w:val="0"/>
+          <w:numId w:val="30"/>
+        </w:numPr>
       </w:pPr>
       <w:r>
         <w:t>Scouts demonstrate clean, cover, cool, remove from danger, or pinch/lean-forward actions as appropriate.</w:t>
@@ -1823,7 +2083,11 @@
     </w:p>
     <w:p>
       <w:pPr>
-        <w:pStyle w:val="ListNumber"/>
+        <w:spacing w:after="20"/>
+        <w:numPr>
+          <w:ilvl w:val="0"/>
+          <w:numId w:val="30"/>
+        </w:numPr>
       </w:pPr>
       <w:r>
         <w:t>End with shock: lay person down, keep warm, call for help, no food or drink.</w:t>
@@ -1854,7 +2118,11 @@
     </w:p>
     <w:p>
       <w:pPr>
-        <w:pStyle w:val="ListNumber"/>
+        <w:spacing w:after="20"/>
+        <w:numPr>
+          <w:ilvl w:val="0"/>
+          <w:numId w:val="31"/>
+        </w:numPr>
       </w:pPr>
       <w:r>
         <w:t>Each Scout builds a small kit with bandages, gauze, wipes, gloves, tape, and emergency info.</w:t>
@@ -1862,7 +2130,11 @@
     </w:p>
     <w:p>
       <w:pPr>
-        <w:pStyle w:val="ListNumber"/>
+        <w:spacing w:after="20"/>
+        <w:numPr>
+          <w:ilvl w:val="0"/>
+          <w:numId w:val="31"/>
+        </w:numPr>
       </w:pPr>
       <w:r>
         <w:t>Scouts label the kit and explain the proper use of each item to a partner.</w:t>
@@ -1870,7 +2142,11 @@
     </w:p>
     <w:p>
       <w:pPr>
-        <w:pStyle w:val="ListNumber"/>
+        <w:spacing w:after="20"/>
+        <w:numPr>
+          <w:ilvl w:val="0"/>
+          <w:numId w:val="31"/>
+        </w:numPr>
       </w:pPr>
       <w:r>
         <w:t>Patrol leader checks that every kit has the essentials.</w:t>
@@ -1901,7 +2177,11 @@
     </w:p>
     <w:p>
       <w:pPr>
-        <w:pStyle w:val="ListNumber"/>
+        <w:spacing w:after="20"/>
+        <w:numPr>
+          <w:ilvl w:val="0"/>
+          <w:numId w:val="32"/>
+        </w:numPr>
       </w:pPr>
       <w:r>
         <w:t>Form a circle. Everyone puts their left hand toward the center, little fingers linked to the next Scout.</w:t>
@@ -1909,7 +2189,11 @@
     </w:p>
     <w:p>
       <w:pPr>
-        <w:pStyle w:val="ListNumber"/>
+        <w:spacing w:after="20"/>
+        <w:numPr>
+          <w:ilvl w:val="0"/>
+          <w:numId w:val="32"/>
+        </w:numPr>
       </w:pPr>
       <w:r>
         <w:t>Den Chief shares a 1-sentence thought tied to tonight (e.g., 'Tonight we practiced being Helpful.').</w:t>
@@ -1917,7 +2201,11 @@
     </w:p>
     <w:p>
       <w:pPr>
-        <w:pStyle w:val="ListNumber"/>
+        <w:spacing w:after="20"/>
+        <w:numPr>
+          <w:ilvl w:val="0"/>
+          <w:numId w:val="32"/>
+        </w:numPr>
       </w:pPr>
       <w:r>
         <w:t>On the Den Chief's signal, everyone raises the circle and gives a quiet 'Do Your Best!' Dismiss.</w:t>
@@ -2150,7 +2438,11 @@
     </w:p>
     <w:p>
       <w:pPr>
-        <w:pStyle w:val="ListNumber"/>
+        <w:spacing w:after="20"/>
+        <w:numPr>
+          <w:ilvl w:val="0"/>
+          <w:numId w:val="33"/>
+        </w:numPr>
       </w:pPr>
       <w:r>
         <w:t>Scouts sort food cards into protein, grain, fruit/vegetable, dairy, and treats.</w:t>
@@ -2158,7 +2450,11 @@
     </w:p>
     <w:p>
       <w:pPr>
-        <w:pStyle w:val="ListNumber"/>
+        <w:spacing w:after="20"/>
+        <w:numPr>
+          <w:ilvl w:val="0"/>
+          <w:numId w:val="33"/>
+        </w:numPr>
       </w:pPr>
       <w:r>
         <w:t>Patrol leader challenges them to build one balanced camp dinner from the cards.</w:t>
@@ -2166,7 +2462,11 @@
     </w:p>
     <w:p>
       <w:pPr>
-        <w:pStyle w:val="ListNumber"/>
+        <w:spacing w:after="20"/>
+        <w:numPr>
+          <w:ilvl w:val="0"/>
+          <w:numId w:val="33"/>
+        </w:numPr>
       </w:pPr>
       <w:r>
         <w:t>Discuss what packs well and what needs a cooler.</w:t>
@@ -2185,7 +2485,11 @@
     </w:p>
     <w:p>
       <w:pPr>
-        <w:pStyle w:val="ListNumber"/>
+        <w:spacing w:after="20"/>
+        <w:numPr>
+          <w:ilvl w:val="0"/>
+          <w:numId w:val="34"/>
+        </w:numPr>
       </w:pPr>
       <w:r>
         <w:t>Form up in a horseshoe or circle. Ask a Scout to lead the Pledge of Allegiance to the flag.</w:t>
@@ -2193,7 +2497,11 @@
     </w:p>
     <w:p>
       <w:pPr>
-        <w:pStyle w:val="ListNumber"/>
+        <w:spacing w:after="20"/>
+        <w:numPr>
+          <w:ilvl w:val="0"/>
+          <w:numId w:val="34"/>
+        </w:numPr>
       </w:pPr>
       <w:r>
         <w:t>Everyone gives the Cub Scout sign and recites the Scout Oath together.</w:t>
@@ -2201,7 +2509,11 @@
     </w:p>
     <w:p>
       <w:pPr>
-        <w:pStyle w:val="ListNumber"/>
+        <w:spacing w:after="20"/>
+        <w:numPr>
+          <w:ilvl w:val="0"/>
+          <w:numId w:val="34"/>
+        </w:numPr>
       </w:pPr>
       <w:r>
         <w:t>Recite the Scout Law together. Younger dens may say it line-by-line after the Den Chief.</w:t>
@@ -2220,7 +2532,11 @@
     </w:p>
     <w:p>
       <w:pPr>
-        <w:pStyle w:val="ListNumber"/>
+        <w:spacing w:after="20"/>
+        <w:numPr>
+          <w:ilvl w:val="0"/>
+          <w:numId w:val="35"/>
+        </w:numPr>
       </w:pPr>
       <w:r>
         <w:t>In patrol teams, choose a realistic camp meal with protein, grain, fruit/vegetable, and drink.</w:t>
@@ -2228,7 +2544,11 @@
     </w:p>
     <w:p>
       <w:pPr>
-        <w:pStyle w:val="ListNumber"/>
+        <w:spacing w:after="20"/>
+        <w:numPr>
+          <w:ilvl w:val="0"/>
+          <w:numId w:val="35"/>
+        </w:numPr>
       </w:pPr>
       <w:r>
         <w:t>Make a gear list, food list, and sanitation plan.</w:t>
@@ -2236,7 +2556,11 @@
     </w:p>
     <w:p>
       <w:pPr>
-        <w:pStyle w:val="ListNumber"/>
+        <w:spacing w:after="20"/>
+        <w:numPr>
+          <w:ilvl w:val="0"/>
+          <w:numId w:val="35"/>
+        </w:numPr>
       </w:pPr>
       <w:r>
         <w:t>Patrol leader assigns cook, cleanup, safety, and timekeeper jobs.</w:t>
@@ -2267,7 +2591,11 @@
     </w:p>
     <w:p>
       <w:pPr>
-        <w:pStyle w:val="ListNumber"/>
+        <w:spacing w:after="20"/>
+        <w:numPr>
+          <w:ilvl w:val="0"/>
+          <w:numId w:val="36"/>
+        </w:numPr>
       </w:pPr>
       <w:r>
         <w:t>Prepare a simple balanced meal or trail-cooking sample using camp gear under adult stove supervision.</w:t>
@@ -2275,7 +2603,11 @@
     </w:p>
     <w:p>
       <w:pPr>
-        <w:pStyle w:val="ListNumber"/>
+        <w:spacing w:after="20"/>
+        <w:numPr>
+          <w:ilvl w:val="0"/>
+          <w:numId w:val="36"/>
+        </w:numPr>
       </w:pPr>
       <w:r>
         <w:t>Scouts practice handwashing, safe knife-free prep as needed, and cleanup.</w:t>
@@ -2283,7 +2615,11 @@
     </w:p>
     <w:p>
       <w:pPr>
-        <w:pStyle w:val="ListNumber"/>
+        <w:spacing w:after="20"/>
+        <w:numPr>
+          <w:ilvl w:val="0"/>
+          <w:numId w:val="36"/>
+        </w:numPr>
       </w:pPr>
       <w:r>
         <w:t>Eat a small sample and judge: balanced, packable, and worth cooking again?</w:t>
@@ -2314,7 +2650,11 @@
     </w:p>
     <w:p>
       <w:pPr>
-        <w:pStyle w:val="ListNumber"/>
+        <w:spacing w:after="20"/>
+        <w:numPr>
+          <w:ilvl w:val="0"/>
+          <w:numId w:val="37"/>
+        </w:numPr>
       </w:pPr>
       <w:r>
         <w:t>Form a circle. Everyone puts their left hand toward the center, little fingers linked to the next Scout.</w:t>
@@ -2322,7 +2662,11 @@
     </w:p>
     <w:p>
       <w:pPr>
-        <w:pStyle w:val="ListNumber"/>
+        <w:spacing w:after="20"/>
+        <w:numPr>
+          <w:ilvl w:val="0"/>
+          <w:numId w:val="37"/>
+        </w:numPr>
       </w:pPr>
       <w:r>
         <w:t>Den Chief shares a 1-sentence thought tied to tonight (e.g., 'Tonight we practiced being Helpful.').</w:t>
@@ -2330,7 +2674,11 @@
     </w:p>
     <w:p>
       <w:pPr>
-        <w:pStyle w:val="ListNumber"/>
+        <w:spacing w:after="20"/>
+        <w:numPr>
+          <w:ilvl w:val="0"/>
+          <w:numId w:val="37"/>
+        </w:numPr>
       </w:pPr>
       <w:r>
         <w:t>On the Den Chief's signal, everyone raises the circle and gives a quiet 'Do Your Best!' Dismiss.</w:t>
@@ -2460,7 +2808,11 @@
     </w:p>
     <w:p>
       <w:pPr>
-        <w:pStyle w:val="ListNumber"/>
+        <w:spacing w:after="20"/>
+        <w:numPr>
+          <w:ilvl w:val="0"/>
+          <w:numId w:val="38"/>
+        </w:numPr>
       </w:pPr>
       <w:r>
         <w:t>Patrol leader picks two Scouts to lead easy dynamic stretches.</w:t>
@@ -2468,7 +2820,11 @@
     </w:p>
     <w:p>
       <w:pPr>
-        <w:pStyle w:val="ListNumber"/>
+        <w:spacing w:after="20"/>
+        <w:numPr>
+          <w:ilvl w:val="0"/>
+          <w:numId w:val="38"/>
+        </w:numPr>
       </w:pPr>
       <w:r>
         <w:t>Den Chief checks form: slow, no bouncing, no pain.</w:t>
@@ -2476,7 +2832,11 @@
     </w:p>
     <w:p>
       <w:pPr>
-        <w:pStyle w:val="ListNumber"/>
+        <w:spacing w:after="20"/>
+        <w:numPr>
+          <w:ilvl w:val="0"/>
+          <w:numId w:val="38"/>
+        </w:numPr>
       </w:pPr>
       <w:r>
         <w:t>Everyone names one activity they did this week.</w:t>
@@ -2495,7 +2855,11 @@
     </w:p>
     <w:p>
       <w:pPr>
-        <w:pStyle w:val="ListNumber"/>
+        <w:spacing w:after="20"/>
+        <w:numPr>
+          <w:ilvl w:val="0"/>
+          <w:numId w:val="39"/>
+        </w:numPr>
       </w:pPr>
       <w:r>
         <w:t>Form up in a horseshoe or circle. Ask a Scout to lead the Pledge of Allegiance to the flag.</w:t>
@@ -2503,7 +2867,11 @@
     </w:p>
     <w:p>
       <w:pPr>
-        <w:pStyle w:val="ListNumber"/>
+        <w:spacing w:after="20"/>
+        <w:numPr>
+          <w:ilvl w:val="0"/>
+          <w:numId w:val="39"/>
+        </w:numPr>
       </w:pPr>
       <w:r>
         <w:t>Everyone gives the Cub Scout sign and recites the Scout Oath together.</w:t>
@@ -2511,7 +2879,11 @@
     </w:p>
     <w:p>
       <w:pPr>
-        <w:pStyle w:val="ListNumber"/>
+        <w:spacing w:after="20"/>
+        <w:numPr>
+          <w:ilvl w:val="0"/>
+          <w:numId w:val="39"/>
+        </w:numPr>
       </w:pPr>
       <w:r>
         <w:t>Recite the Scout Law together. Younger dens may say it line-by-line after the Den Chief.</w:t>
@@ -2530,7 +2902,11 @@
     </w:p>
     <w:p>
       <w:pPr>
-        <w:pStyle w:val="ListNumber"/>
+        <w:spacing w:after="20"/>
+        <w:numPr>
+          <w:ilvl w:val="0"/>
+          <w:numId w:val="40"/>
+        </w:numPr>
       </w:pPr>
       <w:r>
         <w:t>Run a 30-minute rotation: brisk walk/jog, relay, bodyweight circuit, and cooperative game.</w:t>
@@ -2538,7 +2914,11 @@
     </w:p>
     <w:p>
       <w:pPr>
-        <w:pStyle w:val="ListNumber"/>
+        <w:spacing w:after="20"/>
+        <w:numPr>
+          <w:ilvl w:val="0"/>
+          <w:numId w:val="40"/>
+        </w:numPr>
       </w:pPr>
       <w:r>
         <w:t>Scouts take turns leading stations and encouraging the group.</w:t>
@@ -2546,7 +2926,11 @@
     </w:p>
     <w:p>
       <w:pPr>
-        <w:pStyle w:val="ListNumber"/>
+        <w:spacing w:after="20"/>
+        <w:numPr>
+          <w:ilvl w:val="0"/>
+          <w:numId w:val="40"/>
+        </w:numPr>
       </w:pPr>
       <w:r>
         <w:t>Cool down with slow stretches and water.</w:t>
@@ -2577,7 +2961,11 @@
     </w:p>
     <w:p>
       <w:pPr>
-        <w:pStyle w:val="ListNumber"/>
+        <w:spacing w:after="20"/>
+        <w:numPr>
+          <w:ilvl w:val="0"/>
+          <w:numId w:val="41"/>
+        </w:numPr>
       </w:pPr>
       <w:r>
         <w:t>Scouts who finished trackers share patterns they noticed; others commit to finishing at home.</w:t>
@@ -2585,7 +2973,11 @@
     </w:p>
     <w:p>
       <w:pPr>
-        <w:pStyle w:val="ListNumber"/>
+        <w:spacing w:after="20"/>
+        <w:numPr>
+          <w:ilvl w:val="0"/>
+          <w:numId w:val="41"/>
+        </w:numPr>
       </w:pPr>
       <w:r>
         <w:t>Discuss how being physically fit helps on hikes, campouts, and in Scouts BSA.</w:t>
@@ -2593,7 +2985,11 @@
     </w:p>
     <w:p>
       <w:pPr>
-        <w:pStyle w:val="ListNumber"/>
+        <w:spacing w:after="20"/>
+        <w:numPr>
+          <w:ilvl w:val="0"/>
+          <w:numId w:val="41"/>
+        </w:numPr>
       </w:pPr>
       <w:r>
         <w:t>Patrol leader records who still needs the 14-day tracker.</w:t>
@@ -2624,7 +3020,11 @@
     </w:p>
     <w:p>
       <w:pPr>
-        <w:pStyle w:val="ListNumber"/>
+        <w:spacing w:after="20"/>
+        <w:numPr>
+          <w:ilvl w:val="0"/>
+          <w:numId w:val="42"/>
+        </w:numPr>
       </w:pPr>
       <w:r>
         <w:t>Form a circle. Everyone puts their left hand toward the center, little fingers linked to the next Scout.</w:t>
@@ -2632,7 +3032,11 @@
     </w:p>
     <w:p>
       <w:pPr>
-        <w:pStyle w:val="ListNumber"/>
+        <w:spacing w:after="20"/>
+        <w:numPr>
+          <w:ilvl w:val="0"/>
+          <w:numId w:val="42"/>
+        </w:numPr>
       </w:pPr>
       <w:r>
         <w:t>Den Chief shares a 1-sentence thought tied to tonight (e.g., 'Tonight we practiced being Helpful.').</w:t>
@@ -2640,7 +3044,11 @@
     </w:p>
     <w:p>
       <w:pPr>
-        <w:pStyle w:val="ListNumber"/>
+        <w:spacing w:after="20"/>
+        <w:numPr>
+          <w:ilvl w:val="0"/>
+          <w:numId w:val="42"/>
+        </w:numPr>
       </w:pPr>
       <w:r>
         <w:t>On the Den Chief's signal, everyone raises the circle and gives a quiet 'Do Your Best!' Dismiss.</w:t>
@@ -2889,7 +3297,11 @@
     </w:p>
     <w:p>
       <w:pPr>
-        <w:pStyle w:val="ListNumber"/>
+        <w:spacing w:after="20"/>
+        <w:numPr>
+          <w:ilvl w:val="0"/>
+          <w:numId w:val="43"/>
+        </w:numPr>
       </w:pPr>
       <w:r>
         <w:t>Scouts put sticky notes on a local map or chart: parks, schools, food pantry, veterans, animal shelter, meeting place.</w:t>
@@ -2897,7 +3309,11 @@
     </w:p>
     <w:p>
       <w:pPr>
-        <w:pStyle w:val="ListNumber"/>
+        <w:spacing w:after="20"/>
+        <w:numPr>
+          <w:ilvl w:val="0"/>
+          <w:numId w:val="43"/>
+        </w:numPr>
       </w:pPr>
       <w:r>
         <w:t>For each note, add one way a patrol could help.</w:t>
@@ -2905,7 +3321,11 @@
     </w:p>
     <w:p>
       <w:pPr>
-        <w:pStyle w:val="ListNumber"/>
+        <w:spacing w:after="20"/>
+        <w:numPr>
+          <w:ilvl w:val="0"/>
+          <w:numId w:val="43"/>
+        </w:numPr>
       </w:pPr>
       <w:r>
         <w:t>Patrol leader groups ideas into indoor, outdoor, collection, and hands-on service.</w:t>
@@ -2924,7 +3344,11 @@
     </w:p>
     <w:p>
       <w:pPr>
-        <w:pStyle w:val="ListNumber"/>
+        <w:spacing w:after="20"/>
+        <w:numPr>
+          <w:ilvl w:val="0"/>
+          <w:numId w:val="44"/>
+        </w:numPr>
       </w:pPr>
       <w:r>
         <w:t>Form up in a horseshoe or circle. Ask a Scout to lead the Pledge of Allegiance to the flag.</w:t>
@@ -2932,7 +3356,11 @@
     </w:p>
     <w:p>
       <w:pPr>
-        <w:pStyle w:val="ListNumber"/>
+        <w:spacing w:after="20"/>
+        <w:numPr>
+          <w:ilvl w:val="0"/>
+          <w:numId w:val="44"/>
+        </w:numPr>
       </w:pPr>
       <w:r>
         <w:t>Everyone gives the Cub Scout sign and recites the Scout Oath together.</w:t>
@@ -2940,7 +3368,11 @@
     </w:p>
     <w:p>
       <w:pPr>
-        <w:pStyle w:val="ListNumber"/>
+        <w:spacing w:after="20"/>
+        <w:numPr>
+          <w:ilvl w:val="0"/>
+          <w:numId w:val="44"/>
+        </w:numPr>
       </w:pPr>
       <w:r>
         <w:t>Recite the Scout Law together. Younger dens may say it line-by-line after the Den Chief.</w:t>
@@ -2959,7 +3391,11 @@
     </w:p>
     <w:p>
       <w:pPr>
-        <w:pStyle w:val="ListNumber"/>
+        <w:spacing w:after="20"/>
+        <w:numPr>
+          <w:ilvl w:val="0"/>
+          <w:numId w:val="45"/>
+        </w:numPr>
       </w:pPr>
       <w:r>
         <w:t>Review possible projects and choose one that can provide two hours of service or be combined with a second project.</w:t>
@@ -2967,7 +3403,11 @@
     </w:p>
     <w:p>
       <w:pPr>
-        <w:pStyle w:val="ListNumber"/>
+        <w:spacing w:after="20"/>
+        <w:numPr>
+          <w:ilvl w:val="0"/>
+          <w:numId w:val="45"/>
+        </w:numPr>
       </w:pPr>
       <w:r>
         <w:t>Define who is helped, what success looks like, and what jobs Scouts will own.</w:t>
@@ -2975,7 +3415,11 @@
     </w:p>
     <w:p>
       <w:pPr>
-        <w:pStyle w:val="ListNumber"/>
+        <w:spacing w:after="20"/>
+        <w:numPr>
+          <w:ilvl w:val="0"/>
+          <w:numId w:val="45"/>
+        </w:numPr>
       </w:pPr>
       <w:r>
         <w:t>Assign a Scout contact team to draft questions for the benefiting organization.</w:t>
@@ -3006,7 +3450,11 @@
     </w:p>
     <w:p>
       <w:pPr>
-        <w:pStyle w:val="ListNumber"/>
+        <w:spacing w:after="20"/>
+        <w:numPr>
+          <w:ilvl w:val="0"/>
+          <w:numId w:val="46"/>
+        </w:numPr>
       </w:pPr>
       <w:r>
         <w:t>Walk through SAFE: Supervision, Assessment, Fitness and skill, Equipment and environment.</w:t>
@@ -3014,7 +3462,11 @@
     </w:p>
     <w:p>
       <w:pPr>
-        <w:pStyle w:val="ListNumber"/>
+        <w:spacing w:after="20"/>
+        <w:numPr>
+          <w:ilvl w:val="0"/>
+          <w:numId w:val="46"/>
+        </w:numPr>
       </w:pPr>
       <w:r>
         <w:t>Scouts identify hazards, needed adults, gear, weather plan, and transportation rules.</w:t>
@@ -3022,7 +3474,11 @@
     </w:p>
     <w:p>
       <w:pPr>
-        <w:pStyle w:val="ListNumber"/>
+        <w:spacing w:after="20"/>
+        <w:numPr>
+          <w:ilvl w:val="0"/>
+          <w:numId w:val="46"/>
+        </w:numPr>
       </w:pPr>
       <w:r>
         <w:t>End with a patrol go/no-go checklist for the service day.</w:t>
@@ -3053,7 +3509,11 @@
     </w:p>
     <w:p>
       <w:pPr>
-        <w:pStyle w:val="ListNumber"/>
+        <w:spacing w:after="20"/>
+        <w:numPr>
+          <w:ilvl w:val="0"/>
+          <w:numId w:val="47"/>
+        </w:numPr>
       </w:pPr>
       <w:r>
         <w:t>Form a circle. Everyone puts their left hand toward the center, little fingers linked to the next Scout.</w:t>
@@ -3061,7 +3521,11 @@
     </w:p>
     <w:p>
       <w:pPr>
-        <w:pStyle w:val="ListNumber"/>
+        <w:spacing w:after="20"/>
+        <w:numPr>
+          <w:ilvl w:val="0"/>
+          <w:numId w:val="47"/>
+        </w:numPr>
       </w:pPr>
       <w:r>
         <w:t>Den Chief shares a 1-sentence thought tied to tonight (e.g., 'Tonight we practiced being Helpful.').</w:t>
@@ -3069,7 +3533,11 @@
     </w:p>
     <w:p>
       <w:pPr>
-        <w:pStyle w:val="ListNumber"/>
+        <w:spacing w:after="20"/>
+        <w:numPr>
+          <w:ilvl w:val="0"/>
+          <w:numId w:val="47"/>
+        </w:numPr>
       </w:pPr>
       <w:r>
         <w:t>On the Den Chief's signal, everyone raises the circle and gives a quiet 'Do Your Best!' Dismiss.</w:t>
@@ -3191,7 +3659,11 @@
     </w:p>
     <w:p>
       <w:pPr>
-        <w:pStyle w:val="ListNumber"/>
+        <w:spacing w:after="20"/>
+        <w:numPr>
+          <w:ilvl w:val="0"/>
+          <w:numId w:val="48"/>
+        </w:numPr>
       </w:pPr>
       <w:r>
         <w:t>Patrol leader posts the job list as Scouts arrive.</w:t>
@@ -3199,7 +3671,11 @@
     </w:p>
     <w:p>
       <w:pPr>
-        <w:pStyle w:val="ListNumber"/>
+        <w:spacing w:after="20"/>
+        <w:numPr>
+          <w:ilvl w:val="0"/>
+          <w:numId w:val="48"/>
+        </w:numPr>
       </w:pPr>
       <w:r>
         <w:t>Scouts choose or confirm roles: setup, supply, work crew, safety spotter, cleanup, thank-you note.</w:t>
@@ -3207,7 +3683,11 @@
     </w:p>
     <w:p>
       <w:pPr>
-        <w:pStyle w:val="ListNumber"/>
+        <w:spacing w:after="20"/>
+        <w:numPr>
+          <w:ilvl w:val="0"/>
+          <w:numId w:val="48"/>
+        </w:numPr>
       </w:pPr>
       <w:r>
         <w:t>Review the SAFE checklist before work starts.</w:t>
@@ -3226,7 +3706,11 @@
     </w:p>
     <w:p>
       <w:pPr>
-        <w:pStyle w:val="ListNumber"/>
+        <w:spacing w:after="20"/>
+        <w:numPr>
+          <w:ilvl w:val="0"/>
+          <w:numId w:val="49"/>
+        </w:numPr>
       </w:pPr>
       <w:r>
         <w:t>Form up in a horseshoe or circle. Ask a Scout to lead the Pledge of Allegiance to the flag.</w:t>
@@ -3234,7 +3718,11 @@
     </w:p>
     <w:p>
       <w:pPr>
-        <w:pStyle w:val="ListNumber"/>
+        <w:spacing w:after="20"/>
+        <w:numPr>
+          <w:ilvl w:val="0"/>
+          <w:numId w:val="49"/>
+        </w:numPr>
       </w:pPr>
       <w:r>
         <w:t>Everyone gives the Cub Scout sign and recites the Scout Oath together.</w:t>
@@ -3242,7 +3730,11 @@
     </w:p>
     <w:p>
       <w:pPr>
-        <w:pStyle w:val="ListNumber"/>
+        <w:spacing w:after="20"/>
+        <w:numPr>
+          <w:ilvl w:val="0"/>
+          <w:numId w:val="49"/>
+        </w:numPr>
       </w:pPr>
       <w:r>
         <w:t>Recite the Scout Law together. Younger dens may say it line-by-line after the Den Chief.</w:t>
@@ -3261,7 +3753,11 @@
     </w:p>
     <w:p>
       <w:pPr>
-        <w:pStyle w:val="ListNumber"/>
+        <w:spacing w:after="20"/>
+        <w:numPr>
+          <w:ilvl w:val="0"/>
+          <w:numId w:val="50"/>
+        </w:numPr>
       </w:pPr>
       <w:r>
         <w:t>Carry out the planned project: food pantry sorting, grounds cleanup, care kits, church/community partner project, or similar approved service.</w:t>
@@ -3269,7 +3765,11 @@
     </w:p>
     <w:p>
       <w:pPr>
-        <w:pStyle w:val="ListNumber"/>
+        <w:spacing w:after="20"/>
+        <w:numPr>
+          <w:ilvl w:val="0"/>
+          <w:numId w:val="50"/>
+        </w:numPr>
       </w:pPr>
       <w:r>
         <w:t>Track start/stop time and rotate jobs so every Scout contributes for the full required total.</w:t>
@@ -3277,7 +3777,11 @@
     </w:p>
     <w:p>
       <w:pPr>
-        <w:pStyle w:val="ListNumber"/>
+        <w:spacing w:after="20"/>
+        <w:numPr>
+          <w:ilvl w:val="0"/>
+          <w:numId w:val="50"/>
+        </w:numPr>
       </w:pPr>
       <w:r>
         <w:t>Clean up better than you found it and thank the partner organization.</w:t>
@@ -3308,7 +3812,11 @@
     </w:p>
     <w:p>
       <w:pPr>
-        <w:pStyle w:val="ListNumber"/>
+        <w:spacing w:after="20"/>
+        <w:numPr>
+          <w:ilvl w:val="0"/>
+          <w:numId w:val="51"/>
+        </w:numPr>
       </w:pPr>
       <w:r>
         <w:t>Each Scout names who was helped and what job they did.</w:t>
@@ -3316,7 +3824,11 @@
     </w:p>
     <w:p>
       <w:pPr>
-        <w:pStyle w:val="ListNumber"/>
+        <w:spacing w:after="20"/>
+        <w:numPr>
+          <w:ilvl w:val="0"/>
+          <w:numId w:val="51"/>
+        </w:numPr>
       </w:pPr>
       <w:r>
         <w:t>Discuss what went well, what was hard, and how citizens keep serving after the project.</w:t>
@@ -3324,7 +3836,11 @@
     </w:p>
     <w:p>
       <w:pPr>
-        <w:pStyle w:val="ListNumber"/>
+        <w:spacing w:after="20"/>
+        <w:numPr>
+          <w:ilvl w:val="0"/>
+          <w:numId w:val="51"/>
+        </w:numPr>
       </w:pPr>
       <w:r>
         <w:t>Record any Scout who still needs more time to reach two hours.</w:t>
@@ -3355,7 +3871,11 @@
     </w:p>
     <w:p>
       <w:pPr>
-        <w:pStyle w:val="ListNumber"/>
+        <w:spacing w:after="20"/>
+        <w:numPr>
+          <w:ilvl w:val="0"/>
+          <w:numId w:val="52"/>
+        </w:numPr>
       </w:pPr>
       <w:r>
         <w:t>Form a circle. Everyone puts their left hand toward the center, little fingers linked to the next Scout.</w:t>
@@ -3363,7 +3883,11 @@
     </w:p>
     <w:p>
       <w:pPr>
-        <w:pStyle w:val="ListNumber"/>
+        <w:spacing w:after="20"/>
+        <w:numPr>
+          <w:ilvl w:val="0"/>
+          <w:numId w:val="52"/>
+        </w:numPr>
       </w:pPr>
       <w:r>
         <w:t>Den Chief shares a 1-sentence thought tied to tonight (e.g., 'Tonight we practiced being Helpful.').</w:t>
@@ -3371,7 +3895,11 @@
     </w:p>
     <w:p>
       <w:pPr>
-        <w:pStyle w:val="ListNumber"/>
+        <w:spacing w:after="20"/>
+        <w:numPr>
+          <w:ilvl w:val="0"/>
+          <w:numId w:val="52"/>
+        </w:numPr>
       </w:pPr>
       <w:r>
         <w:t>On the Den Chief's signal, everyone raises the circle and gives a quiet 'Do Your Best!' Dismiss.</w:t>
@@ -3604,7 +4132,11 @@
     </w:p>
     <w:p>
       <w:pPr>
-        <w:pStyle w:val="ListNumber"/>
+        <w:spacing w:after="20"/>
+        <w:numPr>
+          <w:ilvl w:val="0"/>
+          <w:numId w:val="53"/>
+        </w:numPr>
       </w:pPr>
       <w:r>
         <w:t>Lay out Scout Law cards and crisis-helper scenarios.</w:t>
@@ -3612,7 +4144,11 @@
     </w:p>
     <w:p>
       <w:pPr>
-        <w:pStyle w:val="ListNumber"/>
+        <w:spacing w:after="20"/>
+        <w:numPr>
+          <w:ilvl w:val="0"/>
+          <w:numId w:val="53"/>
+        </w:numPr>
       </w:pPr>
       <w:r>
         <w:t>Scouts match Law points to actions like feeding, sheltering, counseling, or welcoming people.</w:t>
@@ -3620,7 +4156,11 @@
     </w:p>
     <w:p>
       <w:pPr>
-        <w:pStyle w:val="ListNumber"/>
+        <w:spacing w:after="20"/>
+        <w:numPr>
+          <w:ilvl w:val="0"/>
+          <w:numId w:val="53"/>
+        </w:numPr>
       </w:pPr>
       <w:r>
         <w:t>Patrol leader asks: which Law point do you want people to see in our patrol?</w:t>
@@ -3639,7 +4179,11 @@
     </w:p>
     <w:p>
       <w:pPr>
-        <w:pStyle w:val="ListNumber"/>
+        <w:spacing w:after="20"/>
+        <w:numPr>
+          <w:ilvl w:val="0"/>
+          <w:numId w:val="54"/>
+        </w:numPr>
       </w:pPr>
       <w:r>
         <w:t>Form up in a horseshoe or circle. Ask a Scout to lead the Pledge of Allegiance to the flag.</w:t>
@@ -3647,7 +4191,11 @@
     </w:p>
     <w:p>
       <w:pPr>
-        <w:pStyle w:val="ListNumber"/>
+        <w:spacing w:after="20"/>
+        <w:numPr>
+          <w:ilvl w:val="0"/>
+          <w:numId w:val="54"/>
+        </w:numPr>
       </w:pPr>
       <w:r>
         <w:t>Everyone gives the Cub Scout sign and recites the Scout Oath together.</w:t>
@@ -3655,7 +4203,11 @@
     </w:p>
     <w:p>
       <w:pPr>
-        <w:pStyle w:val="ListNumber"/>
+        <w:spacing w:after="20"/>
+        <w:numPr>
+          <w:ilvl w:val="0"/>
+          <w:numId w:val="54"/>
+        </w:numPr>
       </w:pPr>
       <w:r>
         <w:t>Recite the Scout Law together. Younger dens may say it line-by-line after the Den Chief.</w:t>
@@ -3674,7 +4226,11 @@
     </w:p>
     <w:p>
       <w:pPr>
-        <w:pStyle w:val="ListNumber"/>
+        <w:spacing w:after="20"/>
+        <w:numPr>
+          <w:ilvl w:val="0"/>
+          <w:numId w:val="55"/>
+        </w:numPr>
       </w:pPr>
       <w:r>
         <w:t>Review that families believe and practice differently; the goal is respect and learning.</w:t>
@@ -3682,7 +4238,11 @@
     </w:p>
     <w:p>
       <w:pPr>
-        <w:pStyle w:val="ListNumber"/>
+        <w:spacing w:after="20"/>
+        <w:numPr>
+          <w:ilvl w:val="0"/>
+          <w:numId w:val="55"/>
+        </w:numPr>
       </w:pPr>
       <w:r>
         <w:t>Scouts write questions for a faith-based organization: who do you help, how, and why serve everyone?</w:t>
@@ -3690,7 +4250,11 @@
     </w:p>
     <w:p>
       <w:pPr>
-        <w:pStyle w:val="ListNumber"/>
+        <w:spacing w:after="20"/>
+        <w:numPr>
+          <w:ilvl w:val="0"/>
+          <w:numId w:val="55"/>
+        </w:numPr>
       </w:pPr>
       <w:r>
         <w:t>Choose 4-5 best questions and assign Scouts to ask them.</w:t>
@@ -3721,7 +4285,11 @@
     </w:p>
     <w:p>
       <w:pPr>
-        <w:pStyle w:val="ListNumber"/>
+        <w:spacing w:after="20"/>
+        <w:numPr>
+          <w:ilvl w:val="0"/>
+          <w:numId w:val="56"/>
+        </w:numPr>
       </w:pPr>
       <w:r>
         <w:t>Meet a representative from a faith-based organization that assists people in crisis regardless of faith.</w:t>
@@ -3729,7 +4297,11 @@
     </w:p>
     <w:p>
       <w:pPr>
-        <w:pStyle w:val="ListNumber"/>
+        <w:spacing w:after="20"/>
+        <w:numPr>
+          <w:ilvl w:val="0"/>
+          <w:numId w:val="56"/>
+        </w:numPr>
       </w:pPr>
       <w:r>
         <w:t>Scouts ask prepared questions and identify who the organization helps and how.</w:t>
@@ -3737,7 +4309,11 @@
     </w:p>
     <w:p>
       <w:pPr>
-        <w:pStyle w:val="ListNumber"/>
+        <w:spacing w:after="20"/>
+        <w:numPr>
+          <w:ilvl w:val="0"/>
+          <w:numId w:val="56"/>
+        </w:numPr>
       </w:pPr>
       <w:r>
         <w:t>Thank the guest and record one service idea the patrol could support.</w:t>
@@ -3768,7 +4344,11 @@
     </w:p>
     <w:p>
       <w:pPr>
-        <w:pStyle w:val="ListNumber"/>
+        <w:spacing w:after="20"/>
+        <w:numPr>
+          <w:ilvl w:val="0"/>
+          <w:numId w:val="57"/>
+        </w:numPr>
       </w:pPr>
       <w:r>
         <w:t>Form a circle. Everyone puts their left hand toward the center, little fingers linked to the next Scout.</w:t>
@@ -3776,7 +4356,11 @@
     </w:p>
     <w:p>
       <w:pPr>
-        <w:pStyle w:val="ListNumber"/>
+        <w:spacing w:after="20"/>
+        <w:numPr>
+          <w:ilvl w:val="0"/>
+          <w:numId w:val="57"/>
+        </w:numPr>
       </w:pPr>
       <w:r>
         <w:t>Den Chief shares a 1-sentence thought tied to tonight (e.g., 'Tonight we practiced being Helpful.').</w:t>
@@ -3784,7 +4368,11 @@
     </w:p>
     <w:p>
       <w:pPr>
-        <w:pStyle w:val="ListNumber"/>
+        <w:spacing w:after="20"/>
+        <w:numPr>
+          <w:ilvl w:val="0"/>
+          <w:numId w:val="57"/>
+        </w:numPr>
       </w:pPr>
       <w:r>
         <w:t>On the Den Chief's signal, everyone raises the circle and gives a quiet 'Do Your Best!' Dismiss.</w:t>
@@ -3914,7 +4502,11 @@
     </w:p>
     <w:p>
       <w:pPr>
-        <w:pStyle w:val="ListNumber"/>
+        <w:spacing w:after="20"/>
+        <w:numPr>
+          <w:ilvl w:val="0"/>
+          <w:numId w:val="58"/>
+        </w:numPr>
       </w:pPr>
       <w:r>
         <w:t>As Scouts arrive, they write one word from the Scout Law that connects to reverence or service.</w:t>
@@ -3922,7 +4514,11 @@
     </w:p>
     <w:p>
       <w:pPr>
-        <w:pStyle w:val="ListNumber"/>
+        <w:spacing w:after="20"/>
+        <w:numPr>
+          <w:ilvl w:val="0"/>
+          <w:numId w:val="58"/>
+        </w:numPr>
       </w:pPr>
       <w:r>
         <w:t>Cards stay private unless Scouts choose to share.</w:t>
@@ -3930,7 +4526,11 @@
     </w:p>
     <w:p>
       <w:pPr>
-        <w:pStyle w:val="ListNumber"/>
+        <w:spacing w:after="20"/>
+        <w:numPr>
+          <w:ilvl w:val="0"/>
+          <w:numId w:val="58"/>
+        </w:numPr>
       </w:pPr>
       <w:r>
         <w:t>Den Chief uses the words to open the discussion.</w:t>
@@ -3949,7 +4549,11 @@
     </w:p>
     <w:p>
       <w:pPr>
-        <w:pStyle w:val="ListNumber"/>
+        <w:spacing w:after="20"/>
+        <w:numPr>
+          <w:ilvl w:val="0"/>
+          <w:numId w:val="59"/>
+        </w:numPr>
       </w:pPr>
       <w:r>
         <w:t>Form up in a horseshoe or circle. Ask a Scout to lead the Pledge of Allegiance to the flag.</w:t>
@@ -3957,7 +4561,11 @@
     </w:p>
     <w:p>
       <w:pPr>
-        <w:pStyle w:val="ListNumber"/>
+        <w:spacing w:after="20"/>
+        <w:numPr>
+          <w:ilvl w:val="0"/>
+          <w:numId w:val="59"/>
+        </w:numPr>
       </w:pPr>
       <w:r>
         <w:t>Everyone gives the Cub Scout sign and recites the Scout Oath together.</w:t>
@@ -3965,7 +4573,11 @@
     </w:p>
     <w:p>
       <w:pPr>
-        <w:pStyle w:val="ListNumber"/>
+        <w:spacing w:after="20"/>
+        <w:numPr>
+          <w:ilvl w:val="0"/>
+          <w:numId w:val="59"/>
+        </w:numPr>
       </w:pPr>
       <w:r>
         <w:t>Recite the Scout Law together. Younger dens may say it line-by-line after the Den Chief.</w:t>
@@ -3984,7 +4596,11 @@
     </w:p>
     <w:p>
       <w:pPr>
-        <w:pStyle w:val="ListNumber"/>
+        <w:spacing w:after="20"/>
+        <w:numPr>
+          <w:ilvl w:val="0"/>
+          <w:numId w:val="60"/>
+        </w:numPr>
       </w:pPr>
       <w:r>
         <w:t>Review who the organization helps, what crisis needs they meet, and how they serve people regardless of faith.</w:t>
@@ -3992,7 +4608,11 @@
     </w:p>
     <w:p>
       <w:pPr>
-        <w:pStyle w:val="ListNumber"/>
+        <w:spacing w:after="20"/>
+        <w:numPr>
+          <w:ilvl w:val="0"/>
+          <w:numId w:val="60"/>
+        </w:numPr>
       </w:pPr>
       <w:r>
         <w:t>Scouts connect the work to Scout Law points such as Helpful, Kind, Brave, Clean, and Reverent.</w:t>
@@ -4000,7 +4620,11 @@
     </w:p>
     <w:p>
       <w:pPr>
-        <w:pStyle w:val="ListNumber"/>
+        <w:spacing w:after="20"/>
+        <w:numPr>
+          <w:ilvl w:val="0"/>
+          <w:numId w:val="60"/>
+        </w:numPr>
       </w:pPr>
       <w:r>
         <w:t>Patrol leader leads a thank-you note or small support idea.</w:t>
@@ -4031,7 +4655,11 @@
     </w:p>
     <w:p>
       <w:pPr>
-        <w:pStyle w:val="ListNumber"/>
+        <w:spacing w:after="20"/>
+        <w:numPr>
+          <w:ilvl w:val="0"/>
+          <w:numId w:val="61"/>
+        </w:numPr>
       </w:pPr>
       <w:r>
         <w:t>Scouts may share one value or practice from home if their family is comfortable.</w:t>
@@ -4039,7 +4667,11 @@
     </w:p>
     <w:p>
       <w:pPr>
-        <w:pStyle w:val="ListNumber"/>
+        <w:spacing w:after="20"/>
+        <w:numPr>
+          <w:ilvl w:val="0"/>
+          <w:numId w:val="61"/>
+        </w:numPr>
       </w:pPr>
       <w:r>
         <w:t>Each Scout states one respectful daily action: prayer, reflection, gratitude, service, kindness, or learning.</w:t>
@@ -4047,7 +4679,11 @@
     </w:p>
     <w:p>
       <w:pPr>
-        <w:pStyle w:val="ListNumber"/>
+        <w:spacing w:after="20"/>
+        <w:numPr>
+          <w:ilvl w:val="0"/>
+          <w:numId w:val="61"/>
+        </w:numPr>
       </w:pPr>
       <w:r>
         <w:t>Leader notes who still needs the parent/guardian discussion at home.</w:t>
@@ -4066,7 +4702,11 @@
     </w:p>
     <w:p>
       <w:pPr>
-        <w:pStyle w:val="ListNumber"/>
+        <w:spacing w:after="20"/>
+        <w:numPr>
+          <w:ilvl w:val="0"/>
+          <w:numId w:val="62"/>
+        </w:numPr>
       </w:pPr>
       <w:r>
         <w:t>Form a circle. Everyone puts their left hand toward the center, little fingers linked to the next Scout.</w:t>
@@ -4074,7 +4714,11 @@
     </w:p>
     <w:p>
       <w:pPr>
-        <w:pStyle w:val="ListNumber"/>
+        <w:spacing w:after="20"/>
+        <w:numPr>
+          <w:ilvl w:val="0"/>
+          <w:numId w:val="62"/>
+        </w:numPr>
       </w:pPr>
       <w:r>
         <w:t>Den Chief shares a 1-sentence thought tied to tonight (e.g., 'Tonight we practiced being Helpful.').</w:t>
@@ -4082,7 +4726,11 @@
     </w:p>
     <w:p>
       <w:pPr>
-        <w:pStyle w:val="ListNumber"/>
+        <w:spacing w:after="20"/>
+        <w:numPr>
+          <w:ilvl w:val="0"/>
+          <w:numId w:val="62"/>
+        </w:numPr>
       </w:pPr>
       <w:r>
         <w:t>On the Den Chief's signal, everyone raises the circle and gives a quiet 'Do Your Best!' Dismiss.</w:t>
@@ -4347,7 +4995,11 @@
     </w:p>
     <w:p>
       <w:pPr>
-        <w:pStyle w:val="ListNumber"/>
+        <w:spacing w:after="20"/>
+        <w:numPr>
+          <w:ilvl w:val="0"/>
+          <w:numId w:val="63"/>
+        </w:numPr>
       </w:pPr>
       <w:r>
         <w:t>Lay out real gear plus a few silly extras.</w:t>
@@ -4355,7 +5007,11 @@
     </w:p>
     <w:p>
       <w:pPr>
-        <w:pStyle w:val="ListNumber"/>
+        <w:spacing w:after="20"/>
+        <w:numPr>
+          <w:ilvl w:val="0"/>
+          <w:numId w:val="63"/>
+        </w:numPr>
       </w:pPr>
       <w:r>
         <w:t>Scouts sort what belongs in a day pack, overnight bag, patrol gear, or leave at home.</w:t>
@@ -4363,7 +5019,11 @@
     </w:p>
     <w:p>
       <w:pPr>
-        <w:pStyle w:val="ListNumber"/>
+        <w:spacing w:after="20"/>
+        <w:numPr>
+          <w:ilvl w:val="0"/>
+          <w:numId w:val="63"/>
+        </w:numPr>
       </w:pPr>
       <w:r>
         <w:t>Patrol leader asks each Scout to explain one choice.</w:t>
@@ -4382,7 +5042,11 @@
     </w:p>
     <w:p>
       <w:pPr>
-        <w:pStyle w:val="ListNumber"/>
+        <w:spacing w:after="20"/>
+        <w:numPr>
+          <w:ilvl w:val="0"/>
+          <w:numId w:val="64"/>
+        </w:numPr>
       </w:pPr>
       <w:r>
         <w:t>Form up in a horseshoe or circle. Ask a Scout to lead the Pledge of Allegiance to the flag.</w:t>
@@ -4390,7 +5054,11 @@
     </w:p>
     <w:p>
       <w:pPr>
-        <w:pStyle w:val="ListNumber"/>
+        <w:spacing w:after="20"/>
+        <w:numPr>
+          <w:ilvl w:val="0"/>
+          <w:numId w:val="64"/>
+        </w:numPr>
       </w:pPr>
       <w:r>
         <w:t>Everyone gives the Cub Scout sign and recites the Scout Oath together.</w:t>
@@ -4398,7 +5066,11 @@
     </w:p>
     <w:p>
       <w:pPr>
-        <w:pStyle w:val="ListNumber"/>
+        <w:spacing w:after="20"/>
+        <w:numPr>
+          <w:ilvl w:val="0"/>
+          <w:numId w:val="64"/>
+        </w:numPr>
       </w:pPr>
       <w:r>
         <w:t>Recite the Scout Law together. Younger dens may say it line-by-line after the Den Chief.</w:t>
@@ -4417,7 +5089,11 @@
     </w:p>
     <w:p>
       <w:pPr>
-        <w:pStyle w:val="ListNumber"/>
+        <w:spacing w:after="20"/>
+        <w:numPr>
+          <w:ilvl w:val="0"/>
+          <w:numId w:val="65"/>
+        </w:numPr>
       </w:pPr>
       <w:r>
         <w:t>Review the Scout Basic Essentials and why each matters on a campout.</w:t>
@@ -4425,7 +5101,11 @@
     </w:p>
     <w:p>
       <w:pPr>
-        <w:pStyle w:val="ListNumber"/>
+        <w:spacing w:after="20"/>
+        <w:numPr>
+          <w:ilvl w:val="0"/>
+          <w:numId w:val="65"/>
+        </w:numPr>
       </w:pPr>
       <w:r>
         <w:t>Scouts build a personal packing list including tent/sleeping gear and how they will carry it.</w:t>
@@ -4433,7 +5113,11 @@
     </w:p>
     <w:p>
       <w:pPr>
-        <w:pStyle w:val="ListNumber"/>
+        <w:spacing w:after="20"/>
+        <w:numPr>
+          <w:ilvl w:val="0"/>
+          <w:numId w:val="65"/>
+        </w:numPr>
       </w:pPr>
       <w:r>
         <w:t>Discuss what is personal gear versus patrol gear.</w:t>
@@ -4464,7 +5148,11 @@
     </w:p>
     <w:p>
       <w:pPr>
-        <w:pStyle w:val="ListNumber"/>
+        <w:spacing w:after="20"/>
+        <w:numPr>
+          <w:ilvl w:val="0"/>
+          <w:numId w:val="66"/>
+        </w:numPr>
       </w:pPr>
       <w:r>
         <w:t>Review the four points of the BSA SAFE Checklist and apply each to the March campout.</w:t>
@@ -4472,7 +5160,11 @@
     </w:p>
     <w:p>
       <w:pPr>
-        <w:pStyle w:val="ListNumber"/>
+        <w:spacing w:after="20"/>
+        <w:numPr>
+          <w:ilvl w:val="0"/>
+          <w:numId w:val="66"/>
+        </w:numPr>
       </w:pPr>
       <w:r>
         <w:t>Identify weather, buddy system, adult supervision, medical forms, cooking, and fire boundaries.</w:t>
@@ -4480,7 +5172,11 @@
     </w:p>
     <w:p>
       <w:pPr>
-        <w:pStyle w:val="ListNumber"/>
+        <w:spacing w:after="20"/>
+        <w:numPr>
+          <w:ilvl w:val="0"/>
+          <w:numId w:val="66"/>
+        </w:numPr>
       </w:pPr>
       <w:r>
         <w:t>Patrol leader records questions to ask the campout coordinator.</w:t>
@@ -4511,7 +5207,11 @@
     </w:p>
     <w:p>
       <w:pPr>
-        <w:pStyle w:val="ListNumber"/>
+        <w:spacing w:after="20"/>
+        <w:numPr>
+          <w:ilvl w:val="0"/>
+          <w:numId w:val="67"/>
+        </w:numPr>
       </w:pPr>
       <w:r>
         <w:t>Locate the camp and campsite on a map or printed camp map.</w:t>
@@ -4519,7 +5219,11 @@
     </w:p>
     <w:p>
       <w:pPr>
-        <w:pStyle w:val="ListNumber"/>
+        <w:spacing w:after="20"/>
+        <w:numPr>
+          <w:ilvl w:val="0"/>
+          <w:numId w:val="67"/>
+        </w:numPr>
       </w:pPr>
       <w:r>
         <w:t>Sketch where kitchen, eating area, tents, firepit, handwash, and trash should go.</w:t>
@@ -4527,7 +5231,11 @@
     </w:p>
     <w:p>
       <w:pPr>
-        <w:pStyle w:val="ListNumber"/>
+        <w:spacing w:after="20"/>
+        <w:numPr>
+          <w:ilvl w:val="0"/>
+          <w:numId w:val="67"/>
+        </w:numPr>
       </w:pPr>
       <w:r>
         <w:t>Agree that patrol gear setup comes before personal tents on arrival.</w:t>
@@ -4558,7 +5266,11 @@
     </w:p>
     <w:p>
       <w:pPr>
-        <w:pStyle w:val="ListNumber"/>
+        <w:spacing w:after="20"/>
+        <w:numPr>
+          <w:ilvl w:val="0"/>
+          <w:numId w:val="68"/>
+        </w:numPr>
       </w:pPr>
       <w:r>
         <w:t>Form a circle. Everyone puts their left hand toward the center, little fingers linked to the next Scout.</w:t>
@@ -4566,7 +5278,11 @@
     </w:p>
     <w:p>
       <w:pPr>
-        <w:pStyle w:val="ListNumber"/>
+        <w:spacing w:after="20"/>
+        <w:numPr>
+          <w:ilvl w:val="0"/>
+          <w:numId w:val="68"/>
+        </w:numPr>
       </w:pPr>
       <w:r>
         <w:t>Den Chief shares a 1-sentence thought tied to tonight (e.g., 'Tonight we practiced being Helpful.').</w:t>
@@ -4574,7 +5290,11 @@
     </w:p>
     <w:p>
       <w:pPr>
-        <w:pStyle w:val="ListNumber"/>
+        <w:spacing w:after="20"/>
+        <w:numPr>
+          <w:ilvl w:val="0"/>
+          <w:numId w:val="68"/>
+        </w:numPr>
       </w:pPr>
       <w:r>
         <w:t>On the Den Chief's signal, everyone raises the circle and gives a quiet 'Do Your Best!' Dismiss.</w:t>
@@ -4720,7 +5440,11 @@
     </w:p>
     <w:p>
       <w:pPr>
-        <w:pStyle w:val="ListNumber"/>
+        <w:spacing w:after="20"/>
+        <w:numPr>
+          <w:ilvl w:val="0"/>
+          <w:numId w:val="69"/>
+        </w:numPr>
       </w:pPr>
       <w:r>
         <w:t>Post campout photos or written moments: setup, cooking, campfire, cleanup, weather, sleep.</w:t>
@@ -4728,7 +5452,11 @@
     </w:p>
     <w:p>
       <w:pPr>
-        <w:pStyle w:val="ListNumber"/>
+        <w:spacing w:after="20"/>
+        <w:numPr>
+          <w:ilvl w:val="0"/>
+          <w:numId w:val="69"/>
+        </w:numPr>
       </w:pPr>
       <w:r>
         <w:t>Scouts add sticky notes: went well, change next time, or question.</w:t>
@@ -4736,7 +5464,11 @@
     </w:p>
     <w:p>
       <w:pPr>
-        <w:pStyle w:val="ListNumber"/>
+        <w:spacing w:after="20"/>
+        <w:numPr>
+          <w:ilvl w:val="0"/>
+          <w:numId w:val="69"/>
+        </w:numPr>
       </w:pPr>
       <w:r>
         <w:t>Patrol leader chooses three notes to start the debrief.</w:t>
@@ -4755,7 +5487,11 @@
     </w:p>
     <w:p>
       <w:pPr>
-        <w:pStyle w:val="ListNumber"/>
+        <w:spacing w:after="20"/>
+        <w:numPr>
+          <w:ilvl w:val="0"/>
+          <w:numId w:val="70"/>
+        </w:numPr>
       </w:pPr>
       <w:r>
         <w:t>Form up in a horseshoe or circle. Ask a Scout to lead the Pledge of Allegiance to the flag.</w:t>
@@ -4763,7 +5499,11 @@
     </w:p>
     <w:p>
       <w:pPr>
-        <w:pStyle w:val="ListNumber"/>
+        <w:spacing w:after="20"/>
+        <w:numPr>
+          <w:ilvl w:val="0"/>
+          <w:numId w:val="70"/>
+        </w:numPr>
       </w:pPr>
       <w:r>
         <w:t>Everyone gives the Cub Scout sign and recites the Scout Oath together.</w:t>
@@ -4771,7 +5511,11 @@
     </w:p>
     <w:p>
       <w:pPr>
-        <w:pStyle w:val="ListNumber"/>
+        <w:spacing w:after="20"/>
+        <w:numPr>
+          <w:ilvl w:val="0"/>
+          <w:numId w:val="70"/>
+        </w:numPr>
       </w:pPr>
       <w:r>
         <w:t>Recite the Scout Law together. Younger dens may say it line-by-line after the Den Chief.</w:t>
@@ -4790,7 +5534,11 @@
     </w:p>
     <w:p>
       <w:pPr>
-        <w:pStyle w:val="ListNumber"/>
+        <w:spacing w:after="20"/>
+        <w:numPr>
+          <w:ilvl w:val="0"/>
+          <w:numId w:val="71"/>
+        </w:numPr>
       </w:pPr>
       <w:r>
         <w:t>Discuss what went well, what the patrol would do differently, and what to keep doing next campout.</w:t>
@@ -4798,7 +5546,11 @@
     </w:p>
     <w:p>
       <w:pPr>
-        <w:pStyle w:val="ListNumber"/>
+        <w:spacing w:after="20"/>
+        <w:numPr>
+          <w:ilvl w:val="0"/>
+          <w:numId w:val="71"/>
+        </w:numPr>
       </w:pPr>
       <w:r>
         <w:t>Review whether patrol gear was set before personal tents and how the kitchen stayed sanitary.</w:t>
@@ -4806,7 +5558,11 @@
     </w:p>
     <w:p>
       <w:pPr>
-        <w:pStyle w:val="ListNumber"/>
+        <w:spacing w:after="20"/>
+        <w:numPr>
+          <w:ilvl w:val="0"/>
+          <w:numId w:val="71"/>
+        </w:numPr>
       </w:pPr>
       <w:r>
         <w:t>Record one patrol improvement goal for Scouts BSA crossover.</w:t>
@@ -4837,7 +5593,11 @@
     </w:p>
     <w:p>
       <w:pPr>
-        <w:pStyle w:val="ListNumber"/>
+        <w:spacing w:after="20"/>
+        <w:numPr>
+          <w:ilvl w:val="0"/>
+          <w:numId w:val="72"/>
+        </w:numPr>
       </w:pPr>
       <w:r>
         <w:t>Read the Outdoor Code and Leave No Trace Principles for Kids in Scout-led sections.</w:t>
@@ -4845,7 +5605,11 @@
     </w:p>
     <w:p>
       <w:pPr>
-        <w:pStyle w:val="ListNumber"/>
+        <w:spacing w:after="20"/>
+        <w:numPr>
+          <w:ilvl w:val="0"/>
+          <w:numId w:val="72"/>
+        </w:numPr>
       </w:pPr>
       <w:r>
         <w:t>Scouts match each principle to something that happened at the campout.</w:t>
@@ -4853,7 +5617,11 @@
     </w:p>
     <w:p>
       <w:pPr>
-        <w:pStyle w:val="ListNumber"/>
+        <w:spacing w:after="20"/>
+        <w:numPr>
+          <w:ilvl w:val="0"/>
+          <w:numId w:val="72"/>
+        </w:numPr>
       </w:pPr>
       <w:r>
         <w:t>Patrol leader leads a final pledge for the next outdoor activity.</w:t>
@@ -4884,7 +5652,11 @@
     </w:p>
     <w:p>
       <w:pPr>
-        <w:pStyle w:val="ListNumber"/>
+        <w:spacing w:after="20"/>
+        <w:numPr>
+          <w:ilvl w:val="0"/>
+          <w:numId w:val="73"/>
+        </w:numPr>
       </w:pPr>
       <w:r>
         <w:t>Form a circle. Everyone puts their left hand toward the center, little fingers linked to the next Scout.</w:t>
@@ -4892,7 +5664,11 @@
     </w:p>
     <w:p>
       <w:pPr>
-        <w:pStyle w:val="ListNumber"/>
+        <w:spacing w:after="20"/>
+        <w:numPr>
+          <w:ilvl w:val="0"/>
+          <w:numId w:val="73"/>
+        </w:numPr>
       </w:pPr>
       <w:r>
         <w:t>Den Chief shares a 1-sentence thought tied to tonight (e.g., 'Tonight we practiced being Helpful.').</w:t>
@@ -4900,7 +5676,11 @@
     </w:p>
     <w:p>
       <w:pPr>
-        <w:pStyle w:val="ListNumber"/>
+        <w:spacing w:after="20"/>
+        <w:numPr>
+          <w:ilvl w:val="0"/>
+          <w:numId w:val="73"/>
+        </w:numPr>
       </w:pPr>
       <w:r>
         <w:t>On the Den Chief's signal, everyone raises the circle and gives a quiet 'Do Your Best!' Dismiss.</w:t>
@@ -5157,7 +5937,11 @@
     </w:p>
     <w:p>
       <w:pPr>
-        <w:pStyle w:val="ListNumber"/>
+        <w:spacing w:after="20"/>
+        <w:numPr>
+          <w:ilvl w:val="0"/>
+          <w:numId w:val="74"/>
+        </w:numPr>
       </w:pPr>
       <w:r>
         <w:t>Scouts use arm's-length spacing to find safe work spots as they arrive.</w:t>
@@ -5165,7 +5949,11 @@
     </w:p>
     <w:p>
       <w:pPr>
-        <w:pStyle w:val="ListNumber"/>
+        <w:spacing w:after="20"/>
+        <w:numPr>
+          <w:ilvl w:val="0"/>
+          <w:numId w:val="74"/>
+        </w:numPr>
       </w:pPr>
       <w:r>
         <w:t>Den Chief checks each circle before any knife or trainer comes out.</w:t>
@@ -5173,7 +5961,11 @@
     </w:p>
     <w:p>
       <w:pPr>
-        <w:pStyle w:val="ListNumber"/>
+        <w:spacing w:after="20"/>
+        <w:numPr>
+          <w:ilvl w:val="0"/>
+          <w:numId w:val="74"/>
+        </w:numPr>
       </w:pPr>
       <w:r>
         <w:t>Patrol leader posts the stop signal and cleanup command.</w:t>
@@ -5192,7 +5984,11 @@
     </w:p>
     <w:p>
       <w:pPr>
-        <w:pStyle w:val="ListNumber"/>
+        <w:spacing w:after="20"/>
+        <w:numPr>
+          <w:ilvl w:val="0"/>
+          <w:numId w:val="75"/>
+        </w:numPr>
       </w:pPr>
       <w:r>
         <w:t>Form up in a horseshoe or circle. Ask a Scout to lead the Pledge of Allegiance to the flag.</w:t>
@@ -5200,7 +5996,11 @@
     </w:p>
     <w:p>
       <w:pPr>
-        <w:pStyle w:val="ListNumber"/>
+        <w:spacing w:after="20"/>
+        <w:numPr>
+          <w:ilvl w:val="0"/>
+          <w:numId w:val="75"/>
+        </w:numPr>
       </w:pPr>
       <w:r>
         <w:t>Everyone gives the Cub Scout sign and recites the Scout Oath together.</w:t>
@@ -5208,7 +6008,11 @@
     </w:p>
     <w:p>
       <w:pPr>
-        <w:pStyle w:val="ListNumber"/>
+        <w:spacing w:after="20"/>
+        <w:numPr>
+          <w:ilvl w:val="0"/>
+          <w:numId w:val="75"/>
+        </w:numPr>
       </w:pPr>
       <w:r>
         <w:t>Recite the Scout Law together. Younger dens may say it line-by-line after the Den Chief.</w:t>
@@ -5227,7 +6031,11 @@
     </w:p>
     <w:p>
       <w:pPr>
-        <w:pStyle w:val="ListNumber"/>
+        <w:spacing w:after="20"/>
+        <w:numPr>
+          <w:ilvl w:val="0"/>
+          <w:numId w:val="76"/>
+        </w:numPr>
       </w:pPr>
       <w:r>
         <w:t>Read the rules together and have Scouts explain each one in their own words.</w:t>
@@ -5235,7 +6043,11 @@
     </w:p>
     <w:p>
       <w:pPr>
-        <w:pStyle w:val="ListNumber"/>
+        <w:spacing w:after="20"/>
+        <w:numPr>
+          <w:ilvl w:val="0"/>
+          <w:numId w:val="76"/>
+        </w:numPr>
       </w:pPr>
       <w:r>
         <w:t>Each Scout makes the promise to follow the rules before handling a knife.</w:t>
@@ -5243,7 +6055,11 @@
     </w:p>
     <w:p>
       <w:pPr>
-        <w:pStyle w:val="ListNumber"/>
+        <w:spacing w:after="20"/>
+        <w:numPr>
+          <w:ilvl w:val="0"/>
+          <w:numId w:val="76"/>
+        </w:numPr>
       </w:pPr>
       <w:r>
         <w:t>Review when a knife is a tool, not a toy, and when it must be closed and put away.</w:t>
@@ -5274,7 +6090,11 @@
     </w:p>
     <w:p>
       <w:pPr>
-        <w:pStyle w:val="ListNumber"/>
+        <w:spacing w:after="20"/>
+        <w:numPr>
+          <w:ilvl w:val="0"/>
+          <w:numId w:val="77"/>
+        </w:numPr>
       </w:pPr>
       <w:r>
         <w:t>Demonstrate opening, closing, passing, carrying, and storing a pocketknife safely using EDGE.</w:t>
@@ -5282,7 +6102,11 @@
     </w:p>
     <w:p>
       <w:pPr>
-        <w:pStyle w:val="ListNumber"/>
+        <w:spacing w:after="20"/>
+        <w:numPr>
+          <w:ilvl w:val="0"/>
+          <w:numId w:val="77"/>
+        </w:numPr>
       </w:pPr>
       <w:r>
         <w:t>Scouts practice first with trainer knives or closed knives, then with approved knives under close supervision.</w:t>
@@ -5290,7 +6114,11 @@
     </w:p>
     <w:p>
       <w:pPr>
-        <w:pStyle w:val="ListNumber"/>
+        <w:spacing w:after="20"/>
+        <w:numPr>
+          <w:ilvl w:val="0"/>
+          <w:numId w:val="77"/>
+        </w:numPr>
       </w:pPr>
       <w:r>
         <w:t>Show basic care: clean, dry, sharp enough to be safe, and stored closed.</w:t>
@@ -5321,7 +6149,11 @@
     </w:p>
     <w:p>
       <w:pPr>
-        <w:pStyle w:val="ListNumber"/>
+        <w:spacing w:after="20"/>
+        <w:numPr>
+          <w:ilvl w:val="0"/>
+          <w:numId w:val="78"/>
+        </w:numPr>
       </w:pPr>
       <w:r>
         <w:t>Form a circle. Everyone puts their left hand toward the center, little fingers linked to the next Scout.</w:t>
@@ -5329,7 +6161,11 @@
     </w:p>
     <w:p>
       <w:pPr>
-        <w:pStyle w:val="ListNumber"/>
+        <w:spacing w:after="20"/>
+        <w:numPr>
+          <w:ilvl w:val="0"/>
+          <w:numId w:val="78"/>
+        </w:numPr>
       </w:pPr>
       <w:r>
         <w:t>Den Chief shares a 1-sentence thought tied to tonight (e.g., 'Tonight we practiced being Helpful.').</w:t>
@@ -5337,7 +6173,11 @@
     </w:p>
     <w:p>
       <w:pPr>
-        <w:pStyle w:val="ListNumber"/>
+        <w:spacing w:after="20"/>
+        <w:numPr>
+          <w:ilvl w:val="0"/>
+          <w:numId w:val="78"/>
+        </w:numPr>
       </w:pPr>
       <w:r>
         <w:t>On the Den Chief's signal, everyone raises the circle and gives a quiet 'Do Your Best!' Dismiss.</w:t>
@@ -5467,7 +6307,11 @@
     </w:p>
     <w:p>
       <w:pPr>
-        <w:pStyle w:val="ListNumber"/>
+        <w:spacing w:after="20"/>
+        <w:numPr>
+          <w:ilvl w:val="0"/>
+          <w:numId w:val="79"/>
+        </w:numPr>
       </w:pPr>
       <w:r>
         <w:t>Scouts demonstrate their safety circle with closed knives or trainers.</w:t>
@@ -5475,7 +6319,11 @@
     </w:p>
     <w:p>
       <w:pPr>
-        <w:pStyle w:val="ListNumber"/>
+        <w:spacing w:after="20"/>
+        <w:numPr>
+          <w:ilvl w:val="0"/>
+          <w:numId w:val="79"/>
+        </w:numPr>
       </w:pPr>
       <w:r>
         <w:t>Patrol leader asks the group to name the top three rules before work begins.</w:t>
@@ -5483,7 +6331,11 @@
     </w:p>
     <w:p>
       <w:pPr>
-        <w:pStyle w:val="ListNumber"/>
+        <w:spacing w:after="20"/>
+        <w:numPr>
+          <w:ilvl w:val="0"/>
+          <w:numId w:val="79"/>
+        </w:numPr>
       </w:pPr>
       <w:r>
         <w:t>Anyone who cannot state the rules observes until coached.</w:t>
@@ -5502,7 +6354,11 @@
     </w:p>
     <w:p>
       <w:pPr>
-        <w:pStyle w:val="ListNumber"/>
+        <w:spacing w:after="20"/>
+        <w:numPr>
+          <w:ilvl w:val="0"/>
+          <w:numId w:val="80"/>
+        </w:numPr>
       </w:pPr>
       <w:r>
         <w:t>Form up in a horseshoe or circle. Ask a Scout to lead the Pledge of Allegiance to the flag.</w:t>
@@ -5510,7 +6366,11 @@
     </w:p>
     <w:p>
       <w:pPr>
-        <w:pStyle w:val="ListNumber"/>
+        <w:spacing w:after="20"/>
+        <w:numPr>
+          <w:ilvl w:val="0"/>
+          <w:numId w:val="80"/>
+        </w:numPr>
       </w:pPr>
       <w:r>
         <w:t>Everyone gives the Cub Scout sign and recites the Scout Oath together.</w:t>
@@ -5518,7 +6378,11 @@
     </w:p>
     <w:p>
       <w:pPr>
-        <w:pStyle w:val="ListNumber"/>
+        <w:spacing w:after="20"/>
+        <w:numPr>
+          <w:ilvl w:val="0"/>
+          <w:numId w:val="80"/>
+        </w:numPr>
       </w:pPr>
       <w:r>
         <w:t>Recite the Scout Law together. Younger dens may say it line-by-line after the Den Chief.</w:t>
@@ -5537,7 +6401,11 @@
     </w:p>
     <w:p>
       <w:pPr>
-        <w:pStyle w:val="ListNumber"/>
+        <w:spacing w:after="20"/>
+        <w:numPr>
+          <w:ilvl w:val="0"/>
+          <w:numId w:val="81"/>
+        </w:numPr>
       </w:pPr>
       <w:r>
         <w:t>Choose a simple useful object: tent stake, fuzz stick, pot scraper, or labeled garden marker.</w:t>
@@ -5545,7 +6413,11 @@
     </w:p>
     <w:p>
       <w:pPr>
-        <w:pStyle w:val="ListNumber"/>
+        <w:spacing w:after="20"/>
+        <w:numPr>
+          <w:ilvl w:val="0"/>
+          <w:numId w:val="81"/>
+        </w:numPr>
       </w:pPr>
       <w:r>
         <w:t>Scouts whittle away from themselves inside safety circles with adult/Den Chief coaching.</w:t>
@@ -5553,7 +6425,11 @@
     </w:p>
     <w:p>
       <w:pPr>
-        <w:pStyle w:val="ListNumber"/>
+        <w:spacing w:after="20"/>
+        <w:numPr>
+          <w:ilvl w:val="0"/>
+          <w:numId w:val="81"/>
+        </w:numPr>
       </w:pPr>
       <w:r>
         <w:t>Stop, close knives, clean the area, and have each Scout explain what they made.</w:t>
@@ -5584,7 +6460,11 @@
     </w:p>
     <w:p>
       <w:pPr>
-        <w:pStyle w:val="ListNumber"/>
+        <w:spacing w:after="20"/>
+        <w:numPr>
+          <w:ilvl w:val="0"/>
+          <w:numId w:val="82"/>
+        </w:numPr>
       </w:pPr>
       <w:r>
         <w:t>Show which cooking knife fits each job: paring, chef's knife, or serrated knife.</w:t>
@@ -5592,7 +6472,11 @@
     </w:p>
     <w:p>
       <w:pPr>
-        <w:pStyle w:val="ListNumber"/>
+        <w:spacing w:after="20"/>
+        <w:numPr>
+          <w:ilvl w:val="0"/>
+          <w:numId w:val="82"/>
+        </w:numPr>
       </w:pPr>
       <w:r>
         <w:t>Scouts demonstrate slice, chop, and mince on soft foods using claw-hand technique.</w:t>
@@ -5600,7 +6484,11 @@
     </w:p>
     <w:p>
       <w:pPr>
-        <w:pStyle w:val="ListNumber"/>
+        <w:spacing w:after="20"/>
+        <w:numPr>
+          <w:ilvl w:val="0"/>
+          <w:numId w:val="82"/>
+        </w:numPr>
       </w:pPr>
       <w:r>
         <w:t>Use the cut food in a simple camp snack if time allows.</w:t>
@@ -5631,7 +6519,11 @@
     </w:p>
     <w:p>
       <w:pPr>
-        <w:pStyle w:val="ListNumber"/>
+        <w:spacing w:after="20"/>
+        <w:numPr>
+          <w:ilvl w:val="0"/>
+          <w:numId w:val="83"/>
+        </w:numPr>
       </w:pPr>
       <w:r>
         <w:t>Form a circle. Everyone puts their left hand toward the center, little fingers linked to the next Scout.</w:t>
@@ -5639,7 +6531,11 @@
     </w:p>
     <w:p>
       <w:pPr>
-        <w:pStyle w:val="ListNumber"/>
+        <w:spacing w:after="20"/>
+        <w:numPr>
+          <w:ilvl w:val="0"/>
+          <w:numId w:val="83"/>
+        </w:numPr>
       </w:pPr>
       <w:r>
         <w:t>Den Chief shares a 1-sentence thought tied to tonight (e.g., 'Tonight we practiced being Helpful.').</w:t>
@@ -5647,7 +6543,11 @@
     </w:p>
     <w:p>
       <w:pPr>
-        <w:pStyle w:val="ListNumber"/>
+        <w:spacing w:after="20"/>
+        <w:numPr>
+          <w:ilvl w:val="0"/>
+          <w:numId w:val="83"/>
+        </w:numPr>
       </w:pPr>
       <w:r>
         <w:t>On the Den Chief's signal, everyone raises the circle and gives a quiet 'Do Your Best!' Dismiss.</w:t>
@@ -5889,6 +6789,18 @@
       <w:rPr>
         <w:rFonts w:ascii="Symbol" w:hAnsi="Symbol" w:hint="default"/>
       </w:rPr>
+    </w:lvl>
+  </w:abstractNum>
+  <w:abstractNum w:abstractNumId="9">
+    <w:multiLevelType w:val="singleLevel"/>
+    <w:lvl w:ilvl="0">
+      <w:start w:val="1"/>
+      <w:numFmt w:val="decimal"/>
+      <w:lvlText w:val="%1."/>
+      <w:lvlJc w:val="left"/>
+      <w:pPr>
+        <w:ind w:left="720" w:hanging="360"/>
+      </w:pPr>
     </w:lvl>
   </w:abstractNum>
   <w:num w:numId="1">
@@ -5917,6 +6829,450 @@
   </w:num>
   <w:num w:numId="9">
     <w:abstractNumId w:val="0"/>
+  </w:num>
+  <w:num w:numId="10">
+    <w:abstractNumId w:val="9"/>
+    <w:lvlOverride w:ilvl="0">
+      <w:startOverride w:val="1"/>
+    </w:lvlOverride>
+  </w:num>
+  <w:num w:numId="11">
+    <w:abstractNumId w:val="9"/>
+    <w:lvlOverride w:ilvl="0">
+      <w:startOverride w:val="1"/>
+    </w:lvlOverride>
+  </w:num>
+  <w:num w:numId="12">
+    <w:abstractNumId w:val="9"/>
+    <w:lvlOverride w:ilvl="0">
+      <w:startOverride w:val="1"/>
+    </w:lvlOverride>
+  </w:num>
+  <w:num w:numId="13">
+    <w:abstractNumId w:val="9"/>
+    <w:lvlOverride w:ilvl="0">
+      <w:startOverride w:val="1"/>
+    </w:lvlOverride>
+  </w:num>
+  <w:num w:numId="14">
+    <w:abstractNumId w:val="9"/>
+    <w:lvlOverride w:ilvl="0">
+      <w:startOverride w:val="1"/>
+    </w:lvlOverride>
+  </w:num>
+  <w:num w:numId="15">
+    <w:abstractNumId w:val="9"/>
+    <w:lvlOverride w:ilvl="0">
+      <w:startOverride w:val="1"/>
+    </w:lvlOverride>
+  </w:num>
+  <w:num w:numId="16">
+    <w:abstractNumId w:val="9"/>
+    <w:lvlOverride w:ilvl="0">
+      <w:startOverride w:val="1"/>
+    </w:lvlOverride>
+  </w:num>
+  <w:num w:numId="17">
+    <w:abstractNumId w:val="9"/>
+    <w:lvlOverride w:ilvl="0">
+      <w:startOverride w:val="1"/>
+    </w:lvlOverride>
+  </w:num>
+  <w:num w:numId="18">
+    <w:abstractNumId w:val="9"/>
+    <w:lvlOverride w:ilvl="0">
+      <w:startOverride w:val="1"/>
+    </w:lvlOverride>
+  </w:num>
+  <w:num w:numId="19">
+    <w:abstractNumId w:val="9"/>
+    <w:lvlOverride w:ilvl="0">
+      <w:startOverride w:val="1"/>
+    </w:lvlOverride>
+  </w:num>
+  <w:num w:numId="20">
+    <w:abstractNumId w:val="9"/>
+    <w:lvlOverride w:ilvl="0">
+      <w:startOverride w:val="1"/>
+    </w:lvlOverride>
+  </w:num>
+  <w:num w:numId="21">
+    <w:abstractNumId w:val="9"/>
+    <w:lvlOverride w:ilvl="0">
+      <w:startOverride w:val="1"/>
+    </w:lvlOverride>
+  </w:num>
+  <w:num w:numId="22">
+    <w:abstractNumId w:val="9"/>
+    <w:lvlOverride w:ilvl="0">
+      <w:startOverride w:val="1"/>
+    </w:lvlOverride>
+  </w:num>
+  <w:num w:numId="23">
+    <w:abstractNumId w:val="9"/>
+    <w:lvlOverride w:ilvl="0">
+      <w:startOverride w:val="1"/>
+    </w:lvlOverride>
+  </w:num>
+  <w:num w:numId="24">
+    <w:abstractNumId w:val="9"/>
+    <w:lvlOverride w:ilvl="0">
+      <w:startOverride w:val="1"/>
+    </w:lvlOverride>
+  </w:num>
+  <w:num w:numId="25">
+    <w:abstractNumId w:val="9"/>
+    <w:lvlOverride w:ilvl="0">
+      <w:startOverride w:val="1"/>
+    </w:lvlOverride>
+  </w:num>
+  <w:num w:numId="26">
+    <w:abstractNumId w:val="9"/>
+    <w:lvlOverride w:ilvl="0">
+      <w:startOverride w:val="1"/>
+    </w:lvlOverride>
+  </w:num>
+  <w:num w:numId="27">
+    <w:abstractNumId w:val="9"/>
+    <w:lvlOverride w:ilvl="0">
+      <w:startOverride w:val="1"/>
+    </w:lvlOverride>
+  </w:num>
+  <w:num w:numId="28">
+    <w:abstractNumId w:val="9"/>
+    <w:lvlOverride w:ilvl="0">
+      <w:startOverride w:val="1"/>
+    </w:lvlOverride>
+  </w:num>
+  <w:num w:numId="29">
+    <w:abstractNumId w:val="9"/>
+    <w:lvlOverride w:ilvl="0">
+      <w:startOverride w:val="1"/>
+    </w:lvlOverride>
+  </w:num>
+  <w:num w:numId="30">
+    <w:abstractNumId w:val="9"/>
+    <w:lvlOverride w:ilvl="0">
+      <w:startOverride w:val="1"/>
+    </w:lvlOverride>
+  </w:num>
+  <w:num w:numId="31">
+    <w:abstractNumId w:val="9"/>
+    <w:lvlOverride w:ilvl="0">
+      <w:startOverride w:val="1"/>
+    </w:lvlOverride>
+  </w:num>
+  <w:num w:numId="32">
+    <w:abstractNumId w:val="9"/>
+    <w:lvlOverride w:ilvl="0">
+      <w:startOverride w:val="1"/>
+    </w:lvlOverride>
+  </w:num>
+  <w:num w:numId="33">
+    <w:abstractNumId w:val="9"/>
+    <w:lvlOverride w:ilvl="0">
+      <w:startOverride w:val="1"/>
+    </w:lvlOverride>
+  </w:num>
+  <w:num w:numId="34">
+    <w:abstractNumId w:val="9"/>
+    <w:lvlOverride w:ilvl="0">
+      <w:startOverride w:val="1"/>
+    </w:lvlOverride>
+  </w:num>
+  <w:num w:numId="35">
+    <w:abstractNumId w:val="9"/>
+    <w:lvlOverride w:ilvl="0">
+      <w:startOverride w:val="1"/>
+    </w:lvlOverride>
+  </w:num>
+  <w:num w:numId="36">
+    <w:abstractNumId w:val="9"/>
+    <w:lvlOverride w:ilvl="0">
+      <w:startOverride w:val="1"/>
+    </w:lvlOverride>
+  </w:num>
+  <w:num w:numId="37">
+    <w:abstractNumId w:val="9"/>
+    <w:lvlOverride w:ilvl="0">
+      <w:startOverride w:val="1"/>
+    </w:lvlOverride>
+  </w:num>
+  <w:num w:numId="38">
+    <w:abstractNumId w:val="9"/>
+    <w:lvlOverride w:ilvl="0">
+      <w:startOverride w:val="1"/>
+    </w:lvlOverride>
+  </w:num>
+  <w:num w:numId="39">
+    <w:abstractNumId w:val="9"/>
+    <w:lvlOverride w:ilvl="0">
+      <w:startOverride w:val="1"/>
+    </w:lvlOverride>
+  </w:num>
+  <w:num w:numId="40">
+    <w:abstractNumId w:val="9"/>
+    <w:lvlOverride w:ilvl="0">
+      <w:startOverride w:val="1"/>
+    </w:lvlOverride>
+  </w:num>
+  <w:num w:numId="41">
+    <w:abstractNumId w:val="9"/>
+    <w:lvlOverride w:ilvl="0">
+      <w:startOverride w:val="1"/>
+    </w:lvlOverride>
+  </w:num>
+  <w:num w:numId="42">
+    <w:abstractNumId w:val="9"/>
+    <w:lvlOverride w:ilvl="0">
+      <w:startOverride w:val="1"/>
+    </w:lvlOverride>
+  </w:num>
+  <w:num w:numId="43">
+    <w:abstractNumId w:val="9"/>
+    <w:lvlOverride w:ilvl="0">
+      <w:startOverride w:val="1"/>
+    </w:lvlOverride>
+  </w:num>
+  <w:num w:numId="44">
+    <w:abstractNumId w:val="9"/>
+    <w:lvlOverride w:ilvl="0">
+      <w:startOverride w:val="1"/>
+    </w:lvlOverride>
+  </w:num>
+  <w:num w:numId="45">
+    <w:abstractNumId w:val="9"/>
+    <w:lvlOverride w:ilvl="0">
+      <w:startOverride w:val="1"/>
+    </w:lvlOverride>
+  </w:num>
+  <w:num w:numId="46">
+    <w:abstractNumId w:val="9"/>
+    <w:lvlOverride w:ilvl="0">
+      <w:startOverride w:val="1"/>
+    </w:lvlOverride>
+  </w:num>
+  <w:num w:numId="47">
+    <w:abstractNumId w:val="9"/>
+    <w:lvlOverride w:ilvl="0">
+      <w:startOverride w:val="1"/>
+    </w:lvlOverride>
+  </w:num>
+  <w:num w:numId="48">
+    <w:abstractNumId w:val="9"/>
+    <w:lvlOverride w:ilvl="0">
+      <w:startOverride w:val="1"/>
+    </w:lvlOverride>
+  </w:num>
+  <w:num w:numId="49">
+    <w:abstractNumId w:val="9"/>
+    <w:lvlOverride w:ilvl="0">
+      <w:startOverride w:val="1"/>
+    </w:lvlOverride>
+  </w:num>
+  <w:num w:numId="50">
+    <w:abstractNumId w:val="9"/>
+    <w:lvlOverride w:ilvl="0">
+      <w:startOverride w:val="1"/>
+    </w:lvlOverride>
+  </w:num>
+  <w:num w:numId="51">
+    <w:abstractNumId w:val="9"/>
+    <w:lvlOverride w:ilvl="0">
+      <w:startOverride w:val="1"/>
+    </w:lvlOverride>
+  </w:num>
+  <w:num w:numId="52">
+    <w:abstractNumId w:val="9"/>
+    <w:lvlOverride w:ilvl="0">
+      <w:startOverride w:val="1"/>
+    </w:lvlOverride>
+  </w:num>
+  <w:num w:numId="53">
+    <w:abstractNumId w:val="9"/>
+    <w:lvlOverride w:ilvl="0">
+      <w:startOverride w:val="1"/>
+    </w:lvlOverride>
+  </w:num>
+  <w:num w:numId="54">
+    <w:abstractNumId w:val="9"/>
+    <w:lvlOverride w:ilvl="0">
+      <w:startOverride w:val="1"/>
+    </w:lvlOverride>
+  </w:num>
+  <w:num w:numId="55">
+    <w:abstractNumId w:val="9"/>
+    <w:lvlOverride w:ilvl="0">
+      <w:startOverride w:val="1"/>
+    </w:lvlOverride>
+  </w:num>
+  <w:num w:numId="56">
+    <w:abstractNumId w:val="9"/>
+    <w:lvlOverride w:ilvl="0">
+      <w:startOverride w:val="1"/>
+    </w:lvlOverride>
+  </w:num>
+  <w:num w:numId="57">
+    <w:abstractNumId w:val="9"/>
+    <w:lvlOverride w:ilvl="0">
+      <w:startOverride w:val="1"/>
+    </w:lvlOverride>
+  </w:num>
+  <w:num w:numId="58">
+    <w:abstractNumId w:val="9"/>
+    <w:lvlOverride w:ilvl="0">
+      <w:startOverride w:val="1"/>
+    </w:lvlOverride>
+  </w:num>
+  <w:num w:numId="59">
+    <w:abstractNumId w:val="9"/>
+    <w:lvlOverride w:ilvl="0">
+      <w:startOverride w:val="1"/>
+    </w:lvlOverride>
+  </w:num>
+  <w:num w:numId="60">
+    <w:abstractNumId w:val="9"/>
+    <w:lvlOverride w:ilvl="0">
+      <w:startOverride w:val="1"/>
+    </w:lvlOverride>
+  </w:num>
+  <w:num w:numId="61">
+    <w:abstractNumId w:val="9"/>
+    <w:lvlOverride w:ilvl="0">
+      <w:startOverride w:val="1"/>
+    </w:lvlOverride>
+  </w:num>
+  <w:num w:numId="62">
+    <w:abstractNumId w:val="9"/>
+    <w:lvlOverride w:ilvl="0">
+      <w:startOverride w:val="1"/>
+    </w:lvlOverride>
+  </w:num>
+  <w:num w:numId="63">
+    <w:abstractNumId w:val="9"/>
+    <w:lvlOverride w:ilvl="0">
+      <w:startOverride w:val="1"/>
+    </w:lvlOverride>
+  </w:num>
+  <w:num w:numId="64">
+    <w:abstractNumId w:val="9"/>
+    <w:lvlOverride w:ilvl="0">
+      <w:startOverride w:val="1"/>
+    </w:lvlOverride>
+  </w:num>
+  <w:num w:numId="65">
+    <w:abstractNumId w:val="9"/>
+    <w:lvlOverride w:ilvl="0">
+      <w:startOverride w:val="1"/>
+    </w:lvlOverride>
+  </w:num>
+  <w:num w:numId="66">
+    <w:abstractNumId w:val="9"/>
+    <w:lvlOverride w:ilvl="0">
+      <w:startOverride w:val="1"/>
+    </w:lvlOverride>
+  </w:num>
+  <w:num w:numId="67">
+    <w:abstractNumId w:val="9"/>
+    <w:lvlOverride w:ilvl="0">
+      <w:startOverride w:val="1"/>
+    </w:lvlOverride>
+  </w:num>
+  <w:num w:numId="68">
+    <w:abstractNumId w:val="9"/>
+    <w:lvlOverride w:ilvl="0">
+      <w:startOverride w:val="1"/>
+    </w:lvlOverride>
+  </w:num>
+  <w:num w:numId="69">
+    <w:abstractNumId w:val="9"/>
+    <w:lvlOverride w:ilvl="0">
+      <w:startOverride w:val="1"/>
+    </w:lvlOverride>
+  </w:num>
+  <w:num w:numId="70">
+    <w:abstractNumId w:val="9"/>
+    <w:lvlOverride w:ilvl="0">
+      <w:startOverride w:val="1"/>
+    </w:lvlOverride>
+  </w:num>
+  <w:num w:numId="71">
+    <w:abstractNumId w:val="9"/>
+    <w:lvlOverride w:ilvl="0">
+      <w:startOverride w:val="1"/>
+    </w:lvlOverride>
+  </w:num>
+  <w:num w:numId="72">
+    <w:abstractNumId w:val="9"/>
+    <w:lvlOverride w:ilvl="0">
+      <w:startOverride w:val="1"/>
+    </w:lvlOverride>
+  </w:num>
+  <w:num w:numId="73">
+    <w:abstractNumId w:val="9"/>
+    <w:lvlOverride w:ilvl="0">
+      <w:startOverride w:val="1"/>
+    </w:lvlOverride>
+  </w:num>
+  <w:num w:numId="74">
+    <w:abstractNumId w:val="9"/>
+    <w:lvlOverride w:ilvl="0">
+      <w:startOverride w:val="1"/>
+    </w:lvlOverride>
+  </w:num>
+  <w:num w:numId="75">
+    <w:abstractNumId w:val="9"/>
+    <w:lvlOverride w:ilvl="0">
+      <w:startOverride w:val="1"/>
+    </w:lvlOverride>
+  </w:num>
+  <w:num w:numId="76">
+    <w:abstractNumId w:val="9"/>
+    <w:lvlOverride w:ilvl="0">
+      <w:startOverride w:val="1"/>
+    </w:lvlOverride>
+  </w:num>
+  <w:num w:numId="77">
+    <w:abstractNumId w:val="9"/>
+    <w:lvlOverride w:ilvl="0">
+      <w:startOverride w:val="1"/>
+    </w:lvlOverride>
+  </w:num>
+  <w:num w:numId="78">
+    <w:abstractNumId w:val="9"/>
+    <w:lvlOverride w:ilvl="0">
+      <w:startOverride w:val="1"/>
+    </w:lvlOverride>
+  </w:num>
+  <w:num w:numId="79">
+    <w:abstractNumId w:val="9"/>
+    <w:lvlOverride w:ilvl="0">
+      <w:startOverride w:val="1"/>
+    </w:lvlOverride>
+  </w:num>
+  <w:num w:numId="80">
+    <w:abstractNumId w:val="9"/>
+    <w:lvlOverride w:ilvl="0">
+      <w:startOverride w:val="1"/>
+    </w:lvlOverride>
+  </w:num>
+  <w:num w:numId="81">
+    <w:abstractNumId w:val="9"/>
+    <w:lvlOverride w:ilvl="0">
+      <w:startOverride w:val="1"/>
+    </w:lvlOverride>
+  </w:num>
+  <w:num w:numId="82">
+    <w:abstractNumId w:val="9"/>
+    <w:lvlOverride w:ilvl="0">
+      <w:startOverride w:val="1"/>
+    </w:lvlOverride>
+  </w:num>
+  <w:num w:numId="83">
+    <w:abstractNumId w:val="9"/>
+    <w:lvlOverride w:ilvl="0">
+      <w:startOverride w:val="1"/>
+    </w:lvlOverride>
   </w:num>
 </w:numbering>
 </file>

</xml_diff>

<commit_message>
Compress Arrow of Light: all six required adventures done by Feb 11 before crossover (Outdoor Adventurer to Nov campout; Feb doubles up)
</commit_message>
<xml_diff>
--- a/downloads/Den Guide - Arrow of Light.docx
+++ b/downloads/Den Guide - Arrow of Light.docx
@@ -44,7 +44,7 @@
     </w:p>
     <w:p>
       <w:r>
-        <w:t>Arrow of Light Scouts are 5th graders earning the final Cub Scout rank and preparing to cross over into a Scouts BSA troop. AOL uses the PATROL METHOD - Scouts pick a patrol name, elect a patrol leader, and practice real youth leadership. A Den Chief should model troop-style leadership, then hand pieces of the meeting to the patrol leader.</w:t>
+        <w:t>Arrow of Light Scouts are 5th graders earning the final Cub Scout rank and crossing over into a Scouts BSA troop at the pack Crossover (about Feb 28). Because of that early exit, their adventures are COMPRESSED to finish by mid-February - all six required adventures are done before crossover. AOL uses the PATROL METHOD: Scouts pick a patrol name, elect a patrol leader, and practice real youth leadership, so a Den Chief should coach from the side and hand pieces of the meeting to the patrol leader.</w:t>
       </w:r>
     </w:p>
     <w:p>
@@ -2268,7 +2268,7 @@
           <w:color w:val="5B2A86"/>
           <w:sz w:val="28"/>
         </w:rPr>
-        <w:t>November 2026: Personal Fitness</w:t>
+        <w:t>November 2026: Outdoor Adventurer</w:t>
       </w:r>
     </w:p>
     <w:p>
@@ -2276,7 +2276,7 @@
         <w:rPr>
           <w:i/>
         </w:rPr>
-        <w:t>Connect fitness to camping: plan and cook a balanced camp meal, track activity, and move as a patrol.</w:t>
+        <w:t>Moved EARLY to the AOL Adventure Weekend campout (Nov 20-22, 2026) so the required overnight is done well before crossover. The two den nights are prep; the campout itself completes the outing requirements.</w:t>
       </w:r>
     </w:p>
     <w:tbl>
@@ -2352,7 +2352,7 @@
         <w:pStyle w:val="ListBullet"/>
       </w:pPr>
       <w:r>
-        <w:t>Personal Fitness req 2: Track the times you are active for 30+ minutes over a 14-day period; be ready to share whether you are living up to being physically fit.</w:t>
+        <w:t>Outdoor Adventurer req 5-8: Participate in the AOL Adventure Weekend campout (Nov 20-22). Help set up patrol gear before your own tent, keep the kitchen sanitary, and join the Sunday-morning patrol debrief (what went well / what to change, Outdoor Code, Leave No Trace).</w:t>
       </w:r>
     </w:p>
     <w:p>
@@ -2360,7 +2360,7 @@
         <w:pStyle w:val="ListBullet"/>
       </w:pPr>
       <w:r>
-        <w:t>Personal Fitness req 4: Review your BSA Annual Health and Medical Record with a parent/guardian at home.</w:t>
+        <w:t>If you cannot attend Nov 20-22, arrange a make-up overnight with your patrol, pack, family, or new troop before crossover.</w:t>
       </w:r>
     </w:p>
     <w:p>
@@ -2373,7 +2373,7 @@
           <w:color w:val="5B2A86"/>
           <w:sz w:val="25"/>
         </w:rPr>
-        <w:t>Thu Nov 5  —  Camp Meal Plan and Cook</w:t>
+        <w:t>Thu Nov 5  —  Campout Prep and Patrol Plan</w:t>
       </w:r>
     </w:p>
     <w:p>
@@ -2387,7 +2387,7 @@
         <w:t xml:space="preserve">Focus: </w:t>
       </w:r>
       <w:r>
-        <w:t>Plan a balanced camping meal and prepare it using camp gear.</w:t>
+        <w:t>Get ready for the Nov 20-22 campout: essentials, overnight gear, SAFE checklist, and map.</w:t>
       </w:r>
     </w:p>
     <w:p>
@@ -2406,7 +2406,31 @@
         <w:pStyle w:val="ListBullet"/>
       </w:pPr>
       <w:r>
-        <w:t>Personal Fitness 1 (Plan a balanced meal for camping; prepare it using camp gear)</w:t>
+        <w:t>Outdoor Adventurer 1 (Scout Basic Essentials)</w:t>
+      </w:r>
+    </w:p>
+    <w:p>
+      <w:pPr>
+        <w:pStyle w:val="ListBullet"/>
+      </w:pPr>
+      <w:r>
+        <w:t>Outdoor Adventurer 2 (What to bring and how to carry it)</w:t>
+      </w:r>
+    </w:p>
+    <w:p>
+      <w:pPr>
+        <w:pStyle w:val="ListBullet"/>
+      </w:pPr>
+      <w:r>
+        <w:t>Outdoor Adventurer 3 (BSA SAFE Checklist)</w:t>
+      </w:r>
+    </w:p>
+    <w:p>
+      <w:pPr>
+        <w:pStyle w:val="ListBullet"/>
+      </w:pPr>
+      <w:r>
+        <w:t>Outdoor Adventurer 4 (Locate camp and campsite on a map)</w:t>
       </w:r>
     </w:p>
     <w:p>
@@ -2422,7 +2446,7 @@
     </w:p>
     <w:p>
       <w:r>
-        <w:t>menu planning sheets, pencils, sample camp gear list, camp stove or backpacking stove, fuel handled by adults, cook pot or skillet, utensils, wash station, meal ingredients</w:t>
+        <w:t>packing checklist, pencils, sample gear, BSA SAFE Checklist, chart paper, markers, camp map, printed site map or blank paper</w:t>
       </w:r>
     </w:p>
     <w:p>
@@ -2433,7 +2457,7 @@
         <w:rPr>
           <w:b/>
         </w:rPr>
-        <w:t>Gathering — Camp Menu Sort</w:t>
+        <w:t>Gathering — Pack Shakedown</w:t>
       </w:r>
     </w:p>
     <w:p>
@@ -2445,7 +2469,7 @@
         </w:numPr>
       </w:pPr>
       <w:r>
-        <w:t>Scouts sort food cards into protein, grain, fruit/vegetable, dairy, and treats.</w:t>
+        <w:t>Lay out real gear plus a few silly extras.</w:t>
       </w:r>
     </w:p>
     <w:p>
@@ -2457,7 +2481,7 @@
         </w:numPr>
       </w:pPr>
       <w:r>
-        <w:t>Patrol leader challenges them to build one balanced camp dinner from the cards.</w:t>
+        <w:t>Scouts sort what belongs in a day pack, overnight bag, patrol gear, or leave at home.</w:t>
       </w:r>
     </w:p>
     <w:p>
@@ -2469,7 +2493,7 @@
         </w:numPr>
       </w:pPr>
       <w:r>
-        <w:t>Discuss what packs well and what needs a cooler.</w:t>
+        <w:t>Patrol leader asks each Scout to explain one choice.</w:t>
       </w:r>
     </w:p>
     <w:p>
@@ -2527,7 +2551,7 @@
         <w:rPr>
           <w:b/>
         </w:rPr>
-        <w:t>Activity — Patrol Meal Planning</w:t>
+        <w:t>Activity — Essentials and Overnight Gear</w:t>
       </w:r>
     </w:p>
     <w:p>
@@ -2539,7 +2563,7 @@
         </w:numPr>
       </w:pPr>
       <w:r>
-        <w:t>In patrol teams, choose a realistic camp meal with protein, grain, fruit/vegetable, and drink.</w:t>
+        <w:t>Review the Scout Basic Essentials and why each matters on a campout.</w:t>
       </w:r>
     </w:p>
     <w:p>
@@ -2551,7 +2575,7 @@
         </w:numPr>
       </w:pPr>
       <w:r>
-        <w:t>Make a gear list, food list, and sanitation plan.</w:t>
+        <w:t>Scouts build a personal packing list including tent/sleeping gear and how they will carry it.</w:t>
       </w:r>
     </w:p>
     <w:p>
@@ -2563,7 +2587,7 @@
         </w:numPr>
       </w:pPr>
       <w:r>
-        <w:t>Patrol leader assigns cook, cleanup, safety, and timekeeper jobs.</w:t>
+        <w:t>Discuss what is personal gear versus patrol gear.</w:t>
       </w:r>
     </w:p>
     <w:p>
@@ -2575,7 +2599,7 @@
           <w:i/>
           <w:sz w:val="18"/>
         </w:rPr>
-        <w:t>Needs: menu planning sheets, pencils, sample camp gear list</w:t>
+        <w:t>Needs: packing checklist, pencils, sample gear</w:t>
       </w:r>
     </w:p>
     <w:p>
@@ -2586,7 +2610,7 @@
         <w:rPr>
           <w:b/>
         </w:rPr>
-        <w:t>Activity — Cook with Camp Gear</w:t>
+        <w:t>Activity — SAFE Campout Plan</w:t>
       </w:r>
     </w:p>
     <w:p>
@@ -2598,7 +2622,7 @@
         </w:numPr>
       </w:pPr>
       <w:r>
-        <w:t>Prepare a simple balanced meal or trail-cooking sample using camp gear under adult stove supervision.</w:t>
+        <w:t>Review the four points of the BSA SAFE Checklist and apply each to the Nov 20-22 AOL Adventure Weekend.</w:t>
       </w:r>
     </w:p>
     <w:p>
@@ -2610,7 +2634,7 @@
         </w:numPr>
       </w:pPr>
       <w:r>
-        <w:t>Scouts practice handwashing, safe knife-free prep as needed, and cleanup.</w:t>
+        <w:t>Identify weather (cold-weather layers!), buddy system, adult supervision, medical forms, cooking, and fire boundaries.</w:t>
       </w:r>
     </w:p>
     <w:p>
@@ -2622,7 +2646,7 @@
         </w:numPr>
       </w:pPr>
       <w:r>
-        <w:t>Eat a small sample and judge: balanced, packable, and worth cooking again?</w:t>
+        <w:t>Patrol leader records questions to ask the campout coordinator.</w:t>
       </w:r>
     </w:p>
     <w:p>
@@ -2634,7 +2658,7 @@
           <w:i/>
           <w:sz w:val="18"/>
         </w:rPr>
-        <w:t>Needs: camp stove or backpacking stove, fuel handled by adults, cook pot or skillet, utensils, wash station, meal ingredients</w:t>
+        <w:t>Needs: BSA SAFE Checklist, chart paper, markers</w:t>
       </w:r>
     </w:p>
     <w:p>
@@ -2645,7 +2669,7 @@
         <w:rPr>
           <w:b/>
         </w:rPr>
-        <w:t>Closing — Closing Ceremony - the Living Circle</w:t>
+        <w:t>Activity — Map and Campsite Layout</w:t>
       </w:r>
     </w:p>
     <w:p>
@@ -2657,7 +2681,7 @@
         </w:numPr>
       </w:pPr>
       <w:r>
-        <w:t>Form a circle. Everyone puts their left hand toward the center, little fingers linked to the next Scout.</w:t>
+        <w:t>Locate the camp and campsite on a map or printed camp map.</w:t>
       </w:r>
     </w:p>
     <w:p>
@@ -2669,7 +2693,7 @@
         </w:numPr>
       </w:pPr>
       <w:r>
-        <w:t>Den Chief shares a 1-sentence thought tied to tonight (e.g., 'Tonight we practiced being Helpful.').</w:t>
+        <w:t>Sketch where kitchen, eating area, tents, firepit, handwash, and trash should go.</w:t>
       </w:r>
     </w:p>
     <w:p>
@@ -2681,6 +2705,65 @@
         </w:numPr>
       </w:pPr>
       <w:r>
+        <w:t>Agree that patrol gear setup comes before personal tents on arrival.</w:t>
+      </w:r>
+    </w:p>
+    <w:p>
+      <w:pPr>
+        <w:spacing w:after="40"/>
+      </w:pPr>
+      <w:r>
+        <w:rPr>
+          <w:i/>
+          <w:sz w:val="18"/>
+        </w:rPr>
+        <w:t>Needs: camp map, printed site map or blank paper, markers</w:t>
+      </w:r>
+    </w:p>
+    <w:p>
+      <w:pPr>
+        <w:spacing w:after="20"/>
+      </w:pPr>
+      <w:r>
+        <w:rPr>
+          <w:b/>
+        </w:rPr>
+        <w:t>Closing — Closing Ceremony - the Living Circle</w:t>
+      </w:r>
+    </w:p>
+    <w:p>
+      <w:pPr>
+        <w:spacing w:after="20"/>
+        <w:numPr>
+          <w:ilvl w:val="0"/>
+          <w:numId w:val="38"/>
+        </w:numPr>
+      </w:pPr>
+      <w:r>
+        <w:t>Form a circle. Everyone puts their left hand toward the center, little fingers linked to the next Scout.</w:t>
+      </w:r>
+    </w:p>
+    <w:p>
+      <w:pPr>
+        <w:spacing w:after="20"/>
+        <w:numPr>
+          <w:ilvl w:val="0"/>
+          <w:numId w:val="38"/>
+        </w:numPr>
+      </w:pPr>
+      <w:r>
+        <w:t>Den Chief shares a 1-sentence thought tied to tonight (e.g., 'Tonight we practiced being Helpful.').</w:t>
+      </w:r>
+    </w:p>
+    <w:p>
+      <w:pPr>
+        <w:spacing w:after="20"/>
+        <w:numPr>
+          <w:ilvl w:val="0"/>
+          <w:numId w:val="38"/>
+        </w:numPr>
+      </w:pPr>
+      <w:r>
         <w:t>On the Den Chief's signal, everyone raises the circle and gives a quiet 'Do Your Best!' Dismiss.</w:t>
       </w:r>
     </w:p>
@@ -2700,7 +2783,7 @@
         <w:pStyle w:val="ListBullet"/>
       </w:pPr>
       <w:r>
-        <w:t>Start or continue the 14-day activity tracker.</w:t>
+        <w:t>Start gathering cold-weather layers and sleeping gear for Nov 20-22.</w:t>
       </w:r>
     </w:p>
     <w:p>
@@ -2708,7 +2791,7 @@
         <w:pStyle w:val="ListBullet"/>
       </w:pPr>
       <w:r>
-        <w:t>Ask parents to review the BSA Annual Health and Medical Record with you.</w:t>
+        <w:t>Turn in any required medical forms/permission for the campout.</w:t>
       </w:r>
     </w:p>
     <w:p>
@@ -2722,7 +2805,7 @@
         <w:t xml:space="preserve">Den Chief tip: </w:t>
       </w:r>
       <w:r>
-        <w:t>Follow site rules for cooking indoors/outdoors. If stoves are not allowed, use a no-cook camp meal and demonstrate gear setup.</w:t>
+        <w:t>November nights are cold - hammer on warm layers, dry socks, and a sleeping bag rated for the weather. Confirm every Scout has a ride to the campout.</w:t>
       </w:r>
     </w:p>
     <w:p>
@@ -2735,7 +2818,7 @@
           <w:color w:val="5B2A86"/>
           <w:sz w:val="25"/>
         </w:rPr>
-        <w:t>Thu Nov 19  —  Patrol Fitness Challenge</w:t>
+        <w:t>Thu Nov 19  —  Final Prep: Camp Kitchen &amp; Setup Skills</w:t>
       </w:r>
     </w:p>
     <w:p>
@@ -2749,7 +2832,7 @@
         <w:t xml:space="preserve">Focus: </w:t>
       </w:r>
       <w:r>
-        <w:t>Be active for 30 minutes, stretch safely, and reflect on the activity tracker.</w:t>
+        <w:t>Last den night before the campout: practice campsite setup, patrol gear, and kitchen sanitation so you can demonstrate them on Nov 20-22.</w:t>
       </w:r>
     </w:p>
     <w:p>
@@ -2768,7 +2851,7 @@
         <w:pStyle w:val="ListBullet"/>
       </w:pPr>
       <w:r>
-        <w:t>Personal Fitness 2 (Share 14-day activity tracking - if completed)</w:t>
+        <w:t>Outdoor Adventurer 6 prep (Campsite setup and patrol-gear-first plan - demonstrated at the campout)</w:t>
       </w:r>
     </w:p>
     <w:p>
@@ -2776,7 +2859,7 @@
         <w:pStyle w:val="ListBullet"/>
       </w:pPr>
       <w:r>
-        <w:t>Personal Fitness 3 (Active 30 minutes with patrol/another person including stretching and moving)</w:t>
+        <w:t>Outdoor Adventurer 7 prep (Food safety and kitchen sanitation - demonstrated at the campout)</w:t>
       </w:r>
     </w:p>
     <w:p>
@@ -2792,7 +2875,7 @@
     </w:p>
     <w:p>
       <w:r>
-        <w:t>open space, cones, stopwatch, water access, activity trackers, pencils</w:t>
+        <w:t>a tent or two, ground cloth, cones or rope to mark areas, 3 wash bins, biodegradable soap, sanitizer, dish towels, food storage bins</w:t>
       </w:r>
     </w:p>
     <w:p>
@@ -2803,54 +2886,7 @@
         <w:rPr>
           <w:b/>
         </w:rPr>
-        <w:t>Gathering — Stretch Leader Warm-Up</w:t>
-      </w:r>
-    </w:p>
-    <w:p>
-      <w:pPr>
-        <w:spacing w:after="20"/>
-        <w:numPr>
-          <w:ilvl w:val="0"/>
-          <w:numId w:val="38"/>
-        </w:numPr>
-      </w:pPr>
-      <w:r>
-        <w:t>Patrol leader picks two Scouts to lead easy dynamic stretches.</w:t>
-      </w:r>
-    </w:p>
-    <w:p>
-      <w:pPr>
-        <w:spacing w:after="20"/>
-        <w:numPr>
-          <w:ilvl w:val="0"/>
-          <w:numId w:val="38"/>
-        </w:numPr>
-      </w:pPr>
-      <w:r>
-        <w:t>Den Chief checks form: slow, no bouncing, no pain.</w:t>
-      </w:r>
-    </w:p>
-    <w:p>
-      <w:pPr>
-        <w:spacing w:after="20"/>
-        <w:numPr>
-          <w:ilvl w:val="0"/>
-          <w:numId w:val="38"/>
-        </w:numPr>
-      </w:pPr>
-      <w:r>
-        <w:t>Everyone names one activity they did this week.</w:t>
-      </w:r>
-    </w:p>
-    <w:p>
-      <w:pPr>
-        <w:spacing w:after="20"/>
-      </w:pPr>
-      <w:r>
-        <w:rPr>
-          <w:b/>
-        </w:rPr>
-        <w:t>Opening — Opening Ceremony</w:t>
+        <w:t>Gathering — Job Draft</w:t>
       </w:r>
     </w:p>
     <w:p>
@@ -2862,7 +2898,7 @@
         </w:numPr>
       </w:pPr>
       <w:r>
-        <w:t>Form up in a horseshoe or circle. Ask a Scout to lead the Pledge of Allegiance to the flag.</w:t>
+        <w:t>Patrol leader posts campout jobs: gearmaster, grubmaster, cook, water/sanitation, cleanup, fire helper.</w:t>
       </w:r>
     </w:p>
     <w:p>
@@ -2874,7 +2910,7 @@
         </w:numPr>
       </w:pPr>
       <w:r>
-        <w:t>Everyone gives the Cub Scout sign and recites the Scout Oath together.</w:t>
+        <w:t>Scouts sign up for a job and a backup.</w:t>
       </w:r>
     </w:p>
     <w:p>
@@ -2886,7 +2922,7 @@
         </w:numPr>
       </w:pPr>
       <w:r>
-        <w:t>Recite the Scout Law together. Younger dens may say it line-by-line after the Den Chief.</w:t>
+        <w:t>Den Chief reviews what each job does on arrival day.</w:t>
       </w:r>
     </w:p>
     <w:p>
@@ -2897,7 +2933,7 @@
         <w:rPr>
           <w:b/>
         </w:rPr>
-        <w:t>Activity — 30-Minute Patrol Movement Block</w:t>
+        <w:t>Opening — Opening Ceremony</w:t>
       </w:r>
     </w:p>
     <w:p>
@@ -2909,7 +2945,7 @@
         </w:numPr>
       </w:pPr>
       <w:r>
-        <w:t>Run a 30-minute rotation: brisk walk/jog, relay, bodyweight circuit, and cooperative game.</w:t>
+        <w:t>Form up in a horseshoe or circle. Ask a Scout to lead the Pledge of Allegiance to the flag.</w:t>
       </w:r>
     </w:p>
     <w:p>
@@ -2921,7 +2957,7 @@
         </w:numPr>
       </w:pPr>
       <w:r>
-        <w:t>Scouts take turns leading stations and encouraging the group.</w:t>
+        <w:t>Everyone gives the Cub Scout sign and recites the Scout Oath together.</w:t>
       </w:r>
     </w:p>
     <w:p>
@@ -2933,19 +2969,7 @@
         </w:numPr>
       </w:pPr>
       <w:r>
-        <w:t>Cool down with slow stretches and water.</w:t>
-      </w:r>
-    </w:p>
-    <w:p>
-      <w:pPr>
-        <w:spacing w:after="40"/>
-      </w:pPr>
-      <w:r>
-        <w:rPr>
-          <w:i/>
-          <w:sz w:val="18"/>
-        </w:rPr>
-        <w:t>Needs: open space, cones, stopwatch, water access</w:t>
+        <w:t>Recite the Scout Law together. Younger dens may say it line-by-line after the Den Chief.</w:t>
       </w:r>
     </w:p>
     <w:p>
@@ -2956,7 +2980,7 @@
         <w:rPr>
           <w:b/>
         </w:rPr>
-        <w:t>Activity — Fitness Reflection Circle</w:t>
+        <w:t>Activity — Set-Up Rehearsal</w:t>
       </w:r>
     </w:p>
     <w:p>
@@ -2968,7 +2992,7 @@
         </w:numPr>
       </w:pPr>
       <w:r>
-        <w:t>Scouts who finished trackers share patterns they noticed; others commit to finishing at home.</w:t>
+        <w:t>Practice pitching a tent and laying out a patrol campsite in the meeting space or outside.</w:t>
       </w:r>
     </w:p>
     <w:p>
@@ -2980,7 +3004,7 @@
         </w:numPr>
       </w:pPr>
       <w:r>
-        <w:t>Discuss how being physically fit helps on hikes, campouts, and in Scouts BSA.</w:t>
+        <w:t>Rehearse the rule: patrol gear (kitchen, dining fly, water) goes up before personal tents.</w:t>
       </w:r>
     </w:p>
     <w:p>
@@ -2992,7 +3016,7 @@
         </w:numPr>
       </w:pPr>
       <w:r>
-        <w:t>Patrol leader records who still needs the 14-day tracker.</w:t>
+        <w:t>Walk the arrival sequence the patrol will follow at camp.</w:t>
       </w:r>
     </w:p>
     <w:p>
@@ -3004,7 +3028,7 @@
           <w:i/>
           <w:sz w:val="18"/>
         </w:rPr>
-        <w:t>Needs: activity trackers, pencils</w:t>
+        <w:t>Needs: a tent or two, ground cloth, cones or rope to mark areas</w:t>
       </w:r>
     </w:p>
     <w:p>
@@ -3015,7 +3039,7 @@
         <w:rPr>
           <w:b/>
         </w:rPr>
-        <w:t>Closing — Closing Ceremony - the Living Circle</w:t>
+        <w:t>Activity — Camp Kitchen Sanitation</w:t>
       </w:r>
     </w:p>
     <w:p>
@@ -3027,7 +3051,7 @@
         </w:numPr>
       </w:pPr>
       <w:r>
-        <w:t>Form a circle. Everyone puts their left hand toward the center, little fingers linked to the next Scout.</w:t>
+        <w:t>Teach the 3-pot wash line (wash, rinse, sanitize) and safe food storage.</w:t>
       </w:r>
     </w:p>
     <w:p>
@@ -3039,7 +3063,7 @@
         </w:numPr>
       </w:pPr>
       <w:r>
-        <w:t>Den Chief shares a 1-sentence thought tied to tonight (e.g., 'Tonight we practiced being Helpful.').</w:t>
+        <w:t>Scouts practice handwashing timing, keeping raw/ready foods separate, and trash/critter control.</w:t>
       </w:r>
     </w:p>
     <w:p>
@@ -3051,6 +3075,65 @@
         </w:numPr>
       </w:pPr>
       <w:r>
+        <w:t>Each Scout states one thing they will do to keep the kitchen safe at camp.</w:t>
+      </w:r>
+    </w:p>
+    <w:p>
+      <w:pPr>
+        <w:spacing w:after="40"/>
+      </w:pPr>
+      <w:r>
+        <w:rPr>
+          <w:i/>
+          <w:sz w:val="18"/>
+        </w:rPr>
+        <w:t>Needs: 3 wash bins, biodegradable soap, sanitizer, dish towels, food storage bins</w:t>
+      </w:r>
+    </w:p>
+    <w:p>
+      <w:pPr>
+        <w:spacing w:after="20"/>
+      </w:pPr>
+      <w:r>
+        <w:rPr>
+          <w:b/>
+        </w:rPr>
+        <w:t>Closing — Closing Ceremony - the Living Circle</w:t>
+      </w:r>
+    </w:p>
+    <w:p>
+      <w:pPr>
+        <w:spacing w:after="20"/>
+        <w:numPr>
+          <w:ilvl w:val="0"/>
+          <w:numId w:val="43"/>
+        </w:numPr>
+      </w:pPr>
+      <w:r>
+        <w:t>Form a circle. Everyone puts their left hand toward the center, little fingers linked to the next Scout.</w:t>
+      </w:r>
+    </w:p>
+    <w:p>
+      <w:pPr>
+        <w:spacing w:after="20"/>
+        <w:numPr>
+          <w:ilvl w:val="0"/>
+          <w:numId w:val="43"/>
+        </w:numPr>
+      </w:pPr>
+      <w:r>
+        <w:t>Den Chief shares a 1-sentence thought tied to tonight (e.g., 'Tonight we practiced being Helpful.').</w:t>
+      </w:r>
+    </w:p>
+    <w:p>
+      <w:pPr>
+        <w:spacing w:after="20"/>
+        <w:numPr>
+          <w:ilvl w:val="0"/>
+          <w:numId w:val="43"/>
+        </w:numPr>
+      </w:pPr>
+      <w:r>
         <w:t>On the Den Chief's signal, everyone raises the circle and gives a quiet 'Do Your Best!' Dismiss.</w:t>
       </w:r>
     </w:p>
@@ -3070,7 +3153,7 @@
         <w:pStyle w:val="ListBullet"/>
       </w:pPr>
       <w:r>
-        <w:t>Finish the 14-day tracker if needed and share it with the den leader.</w:t>
+        <w:t>Finish packing for Nov 20-22 using your checklist.</w:t>
       </w:r>
     </w:p>
     <w:p>
@@ -3078,7 +3161,7 @@
         <w:pStyle w:val="ListBullet"/>
       </w:pPr>
       <w:r>
-        <w:t>Confirm the health record review is complete.</w:t>
+        <w:t>At the campout: set patrol gear first, keep the kitchen sanitary, and join the Sunday-morning debrief to finish the adventure.</w:t>
       </w:r>
     </w:p>
     <w:p>
@@ -3092,7 +3175,7 @@
         <w:t xml:space="preserve">Den Chief tip: </w:t>
       </w:r>
       <w:r>
-        <w:t>Oldest Cubs can handle real leadership: let them lead stations, but keep adult eyes on safety and hydration.</w:t>
+        <w:t>Reqs 5-8 are completed AT the campout. Ask an adult to run a 10-minute Sunday debrief (went well / change next time, Outdoor Code, Leave No Trace) so the adventure is signed off on-site.</w:t>
       </w:r>
     </w:p>
     <w:p>
@@ -3106,7 +3189,7 @@
         <w:t xml:space="preserve">Flex week idea: </w:t>
       </w:r>
       <w:r>
-        <w:t>Nov 12 (Roundtable): make-up camp meal, extra fitness game night, or Scouting for Food prep as active service.</w:t>
+        <w:t>Nov 12 (Roundtable): campout gear swap, tent-pitching race, or cold-weather layering demo before the Nov 20-22 weekend.</w:t>
       </w:r>
     </w:p>
     <w:p>
@@ -3119,7 +3202,7 @@
           <w:color w:val="5B2A86"/>
           <w:sz w:val="28"/>
         </w:rPr>
-        <w:t>January 2027: Citizenship</w:t>
+        <w:t>January 2027: Personal Fitness</w:t>
       </w:r>
     </w:p>
     <w:p>
@@ -3127,7 +3210,7 @@
         <w:rPr>
           <w:i/>
         </w:rPr>
-        <w:t>Plan and complete meaningful service as a patrol, using the BSA SAFE Checklist and at least two total service hours.</w:t>
+        <w:t>Connect fitness to camping and everyday health: plan and cook a balanced meal with camp gear, track activity, and move as a patrol.</w:t>
       </w:r>
     </w:p>
     <w:tbl>
@@ -3219,7 +3302,15 @@
         <w:pStyle w:val="ListBullet"/>
       </w:pPr>
       <w:r>
-        <w:t>Citizenship req 2: If the den project does not reach two hours, complete additional approved service so your total is at least two hours.</w:t>
+        <w:t>Personal Fitness req 2: Track the times you are active for 30+ minutes over a 14-day period; be ready to share whether you are living up to being physically fit.</w:t>
+      </w:r>
+    </w:p>
+    <w:p>
+      <w:pPr>
+        <w:pStyle w:val="ListBullet"/>
+      </w:pPr>
+      <w:r>
+        <w:t>Personal Fitness req 4: Review your BSA Annual Health and Medical Record with a parent/guardian at home.</w:t>
       </w:r>
     </w:p>
     <w:p>
@@ -3232,7 +3323,7 @@
           <w:color w:val="5B2A86"/>
           <w:sz w:val="25"/>
         </w:rPr>
-        <w:t>Thu Jan 7  —  Choose and Plan Service</w:t>
+        <w:t>Thu Jan 7  —  Camp Meal Plan and Cook</w:t>
       </w:r>
     </w:p>
     <w:p>
@@ -3246,7 +3337,7 @@
         <w:t xml:space="preserve">Focus: </w:t>
       </w:r>
       <w:r>
-        <w:t>Identify a community service project and plan it safely using the BSA SAFE Checklist.</w:t>
+        <w:t>Plan a balanced camping meal and prepare it using camp gear.</w:t>
       </w:r>
     </w:p>
     <w:p>
@@ -3265,7 +3356,7 @@
         <w:pStyle w:val="ListBullet"/>
       </w:pPr>
       <w:r>
-        <w:t>Citizenship 1 (Identify a service project and use the BSA SAFE Checklist to plan it safely)</w:t>
+        <w:t>Personal Fitness 1 (Plan a balanced meal for camping; prepare it using camp gear)</w:t>
       </w:r>
     </w:p>
     <w:p>
@@ -3281,7 +3372,7 @@
     </w:p>
     <w:p>
       <w:r>
-        <w:t>project idea list, pencils, planning worksheet, BSA SAFE Checklist copy, chart paper, markers</w:t>
+        <w:t>menu planning sheets, pencils, sample camp gear list, camp stove or backpacking stove, fuel handled by adults, cook pot or skillet, utensils, wash station, meal ingredients</w:t>
       </w:r>
     </w:p>
     <w:p>
@@ -3292,54 +3383,7 @@
         <w:rPr>
           <w:b/>
         </w:rPr>
-        <w:t>Gathering — Community Needs Map</w:t>
-      </w:r>
-    </w:p>
-    <w:p>
-      <w:pPr>
-        <w:spacing w:after="20"/>
-        <w:numPr>
-          <w:ilvl w:val="0"/>
-          <w:numId w:val="43"/>
-        </w:numPr>
-      </w:pPr>
-      <w:r>
-        <w:t>Scouts put sticky notes on a local map or chart: parks, schools, food pantry, veterans, animal shelter, meeting place.</w:t>
-      </w:r>
-    </w:p>
-    <w:p>
-      <w:pPr>
-        <w:spacing w:after="20"/>
-        <w:numPr>
-          <w:ilvl w:val="0"/>
-          <w:numId w:val="43"/>
-        </w:numPr>
-      </w:pPr>
-      <w:r>
-        <w:t>For each note, add one way a patrol could help.</w:t>
-      </w:r>
-    </w:p>
-    <w:p>
-      <w:pPr>
-        <w:spacing w:after="20"/>
-        <w:numPr>
-          <w:ilvl w:val="0"/>
-          <w:numId w:val="43"/>
-        </w:numPr>
-      </w:pPr>
-      <w:r>
-        <w:t>Patrol leader groups ideas into indoor, outdoor, collection, and hands-on service.</w:t>
-      </w:r>
-    </w:p>
-    <w:p>
-      <w:pPr>
-        <w:spacing w:after="20"/>
-      </w:pPr>
-      <w:r>
-        <w:rPr>
-          <w:b/>
-        </w:rPr>
-        <w:t>Opening — Opening Ceremony</w:t>
+        <w:t>Gathering — Camp Menu Sort</w:t>
       </w:r>
     </w:p>
     <w:p>
@@ -3351,7 +3395,7 @@
         </w:numPr>
       </w:pPr>
       <w:r>
-        <w:t>Form up in a horseshoe or circle. Ask a Scout to lead the Pledge of Allegiance to the flag.</w:t>
+        <w:t>Scouts sort food cards into protein, grain, fruit/vegetable, dairy, and treats.</w:t>
       </w:r>
     </w:p>
     <w:p>
@@ -3363,7 +3407,7 @@
         </w:numPr>
       </w:pPr>
       <w:r>
-        <w:t>Everyone gives the Cub Scout sign and recites the Scout Oath together.</w:t>
+        <w:t>Patrol leader challenges them to build one balanced camp dinner from the cards.</w:t>
       </w:r>
     </w:p>
     <w:p>
@@ -3375,7 +3419,7 @@
         </w:numPr>
       </w:pPr>
       <w:r>
-        <w:t>Recite the Scout Law together. Younger dens may say it line-by-line after the Den Chief.</w:t>
+        <w:t>Discuss what packs well and what needs a cooler.</w:t>
       </w:r>
     </w:p>
     <w:p>
@@ -3386,7 +3430,7 @@
         <w:rPr>
           <w:b/>
         </w:rPr>
-        <w:t>Activity — Service Project Decision</w:t>
+        <w:t>Opening — Opening Ceremony</w:t>
       </w:r>
     </w:p>
     <w:p>
@@ -3398,7 +3442,7 @@
         </w:numPr>
       </w:pPr>
       <w:r>
-        <w:t>Review possible projects and choose one that can provide two hours of service or be combined with a second project.</w:t>
+        <w:t>Form up in a horseshoe or circle. Ask a Scout to lead the Pledge of Allegiance to the flag.</w:t>
       </w:r>
     </w:p>
     <w:p>
@@ -3410,7 +3454,7 @@
         </w:numPr>
       </w:pPr>
       <w:r>
-        <w:t>Define who is helped, what success looks like, and what jobs Scouts will own.</w:t>
+        <w:t>Everyone gives the Cub Scout sign and recites the Scout Oath together.</w:t>
       </w:r>
     </w:p>
     <w:p>
@@ -3422,19 +3466,7 @@
         </w:numPr>
       </w:pPr>
       <w:r>
-        <w:t>Assign a Scout contact team to draft questions for the benefiting organization.</w:t>
-      </w:r>
-    </w:p>
-    <w:p>
-      <w:pPr>
-        <w:spacing w:after="40"/>
-      </w:pPr>
-      <w:r>
-        <w:rPr>
-          <w:i/>
-          <w:sz w:val="18"/>
-        </w:rPr>
-        <w:t>Needs: project idea list, pencils, planning worksheet</w:t>
+        <w:t>Recite the Scout Law together. Younger dens may say it line-by-line after the Den Chief.</w:t>
       </w:r>
     </w:p>
     <w:p>
@@ -3445,7 +3477,7 @@
         <w:rPr>
           <w:b/>
         </w:rPr>
-        <w:t>Activity — SAFE Checklist Planning</w:t>
+        <w:t>Activity — Patrol Meal Planning</w:t>
       </w:r>
     </w:p>
     <w:p>
@@ -3457,7 +3489,7 @@
         </w:numPr>
       </w:pPr>
       <w:r>
-        <w:t>Walk through SAFE: Supervision, Assessment, Fitness and skill, Equipment and environment.</w:t>
+        <w:t>In patrol teams, choose a realistic camp meal with protein, grain, fruit/vegetable, and drink.</w:t>
       </w:r>
     </w:p>
     <w:p>
@@ -3469,7 +3501,7 @@
         </w:numPr>
       </w:pPr>
       <w:r>
-        <w:t>Scouts identify hazards, needed adults, gear, weather plan, and transportation rules.</w:t>
+        <w:t>Make a gear list, food list, and sanitation plan.</w:t>
       </w:r>
     </w:p>
     <w:p>
@@ -3481,7 +3513,7 @@
         </w:numPr>
       </w:pPr>
       <w:r>
-        <w:t>End with a patrol go/no-go checklist for the service day.</w:t>
+        <w:t>Patrol leader assigns cook, cleanup, safety, and timekeeper jobs.</w:t>
       </w:r>
     </w:p>
     <w:p>
@@ -3493,7 +3525,7 @@
           <w:i/>
           <w:sz w:val="18"/>
         </w:rPr>
-        <w:t>Needs: BSA SAFE Checklist copy, chart paper, markers</w:t>
+        <w:t>Needs: menu planning sheets, pencils, sample camp gear list</w:t>
       </w:r>
     </w:p>
     <w:p>
@@ -3504,7 +3536,7 @@
         <w:rPr>
           <w:b/>
         </w:rPr>
-        <w:t>Closing — Closing Ceremony - the Living Circle</w:t>
+        <w:t>Activity — Cook with Camp Gear</w:t>
       </w:r>
     </w:p>
     <w:p>
@@ -3516,7 +3548,7 @@
         </w:numPr>
       </w:pPr>
       <w:r>
-        <w:t>Form a circle. Everyone puts their left hand toward the center, little fingers linked to the next Scout.</w:t>
+        <w:t>Prepare a simple balanced meal or trail-cooking sample using camp gear under adult stove supervision.</w:t>
       </w:r>
     </w:p>
     <w:p>
@@ -3528,7 +3560,7 @@
         </w:numPr>
       </w:pPr>
       <w:r>
-        <w:t>Den Chief shares a 1-sentence thought tied to tonight (e.g., 'Tonight we practiced being Helpful.').</w:t>
+        <w:t>Scouts practice handwashing, safe knife-free prep as needed, and cleanup.</w:t>
       </w:r>
     </w:p>
     <w:p>
@@ -3540,6 +3572,65 @@
         </w:numPr>
       </w:pPr>
       <w:r>
+        <w:t>Eat a small sample and judge: balanced, packable, and worth cooking again?</w:t>
+      </w:r>
+    </w:p>
+    <w:p>
+      <w:pPr>
+        <w:spacing w:after="40"/>
+      </w:pPr>
+      <w:r>
+        <w:rPr>
+          <w:i/>
+          <w:sz w:val="18"/>
+        </w:rPr>
+        <w:t>Needs: camp stove or backpacking stove, fuel handled by adults, cook pot or skillet, utensils, wash station, meal ingredients</w:t>
+      </w:r>
+    </w:p>
+    <w:p>
+      <w:pPr>
+        <w:spacing w:after="20"/>
+      </w:pPr>
+      <w:r>
+        <w:rPr>
+          <w:b/>
+        </w:rPr>
+        <w:t>Closing — Closing Ceremony - the Living Circle</w:t>
+      </w:r>
+    </w:p>
+    <w:p>
+      <w:pPr>
+        <w:spacing w:after="20"/>
+        <w:numPr>
+          <w:ilvl w:val="0"/>
+          <w:numId w:val="48"/>
+        </w:numPr>
+      </w:pPr>
+      <w:r>
+        <w:t>Form a circle. Everyone puts their left hand toward the center, little fingers linked to the next Scout.</w:t>
+      </w:r>
+    </w:p>
+    <w:p>
+      <w:pPr>
+        <w:spacing w:after="20"/>
+        <w:numPr>
+          <w:ilvl w:val="0"/>
+          <w:numId w:val="48"/>
+        </w:numPr>
+      </w:pPr>
+      <w:r>
+        <w:t>Den Chief shares a 1-sentence thought tied to tonight (e.g., 'Tonight we practiced being Helpful.').</w:t>
+      </w:r>
+    </w:p>
+    <w:p>
+      <w:pPr>
+        <w:spacing w:after="20"/>
+        <w:numPr>
+          <w:ilvl w:val="0"/>
+          <w:numId w:val="48"/>
+        </w:numPr>
+      </w:pPr>
+      <w:r>
         <w:t>On the Den Chief's signal, everyone raises the circle and gives a quiet 'Do Your Best!' Dismiss.</w:t>
       </w:r>
     </w:p>
@@ -3559,7 +3650,7 @@
         <w:pStyle w:val="ListBullet"/>
       </w:pPr>
       <w:r>
-        <w:t>Share the service date, location, clothing, and permission needs with families.</w:t>
+        <w:t>Start or continue the 14-day activity tracker.</w:t>
       </w:r>
     </w:p>
     <w:p>
@@ -3567,7 +3658,7 @@
         <w:pStyle w:val="ListBullet"/>
       </w:pPr>
       <w:r>
-        <w:t>Ask families to protect a full two-hour service block or plan make-up service.</w:t>
+        <w:t>Ask parents to review the BSA Annual Health and Medical Record with you.</w:t>
       </w:r>
     </w:p>
     <w:p>
@@ -3581,7 +3672,7 @@
         <w:t xml:space="preserve">Den Chief tip: </w:t>
       </w:r>
       <w:r>
-        <w:t>AOL service should feel substantial. Let Scouts plan jobs and safety steps, not just show up for adult-planned work.</w:t>
+        <w:t>Follow site rules for cooking indoors/outdoors. If stoves are not allowed, use a no-cook camp meal and demonstrate gear setup.</w:t>
       </w:r>
     </w:p>
     <w:p>
@@ -3594,7 +3685,7 @@
           <w:color w:val="5B2A86"/>
           <w:sz w:val="25"/>
         </w:rPr>
-        <w:t>Thu Jan 21  —  Service Project Work Session</w:t>
+        <w:t>Thu Jan 21  —  Patrol Fitness Challenge</w:t>
       </w:r>
     </w:p>
     <w:p>
@@ -3608,7 +3699,7 @@
         <w:t xml:space="preserve">Focus: </w:t>
       </w:r>
       <w:r>
-        <w:t>Complete or launch the two-hour service project and reflect on citizenship.</w:t>
+        <w:t>Be active for 30 minutes, stretch safely, and reflect on the activity tracker.</w:t>
       </w:r>
     </w:p>
     <w:p>
@@ -3627,7 +3718,15 @@
         <w:pStyle w:val="ListBullet"/>
       </w:pPr>
       <w:r>
-        <w:t>Citizenship 2 (Participate in a service project for at least two hours total - complete during project/outing if time requirement is met)</w:t>
+        <w:t>Personal Fitness 2 (Share 14-day activity tracking - if completed)</w:t>
+      </w:r>
+    </w:p>
+    <w:p>
+      <w:pPr>
+        <w:pStyle w:val="ListBullet"/>
+      </w:pPr>
+      <w:r>
+        <w:t>Personal Fitness 3 (Active 30 minutes with patrol/another person including stretching and moving)</w:t>
       </w:r>
     </w:p>
     <w:p>
@@ -3643,7 +3742,7 @@
     </w:p>
     <w:p>
       <w:r>
-        <w:t>project-specific supplies, work gloves, trash bags or boxes, first-aid kit, water, service hour log, pencils</w:t>
+        <w:t>open space, cones, stopwatch, water access, activity trackers, pencils</w:t>
       </w:r>
     </w:p>
     <w:p>
@@ -3654,54 +3753,7 @@
         <w:rPr>
           <w:b/>
         </w:rPr>
-        <w:t>Gathering — Job Briefing</w:t>
-      </w:r>
-    </w:p>
-    <w:p>
-      <w:pPr>
-        <w:spacing w:after="20"/>
-        <w:numPr>
-          <w:ilvl w:val="0"/>
-          <w:numId w:val="48"/>
-        </w:numPr>
-      </w:pPr>
-      <w:r>
-        <w:t>Patrol leader posts the job list as Scouts arrive.</w:t>
-      </w:r>
-    </w:p>
-    <w:p>
-      <w:pPr>
-        <w:spacing w:after="20"/>
-        <w:numPr>
-          <w:ilvl w:val="0"/>
-          <w:numId w:val="48"/>
-        </w:numPr>
-      </w:pPr>
-      <w:r>
-        <w:t>Scouts choose or confirm roles: setup, supply, work crew, safety spotter, cleanup, thank-you note.</w:t>
-      </w:r>
-    </w:p>
-    <w:p>
-      <w:pPr>
-        <w:spacing w:after="20"/>
-        <w:numPr>
-          <w:ilvl w:val="0"/>
-          <w:numId w:val="48"/>
-        </w:numPr>
-      </w:pPr>
-      <w:r>
-        <w:t>Review the SAFE checklist before work starts.</w:t>
-      </w:r>
-    </w:p>
-    <w:p>
-      <w:pPr>
-        <w:spacing w:after="20"/>
-      </w:pPr>
-      <w:r>
-        <w:rPr>
-          <w:b/>
-        </w:rPr>
-        <w:t>Opening — Opening Ceremony</w:t>
+        <w:t>Gathering — Stretch Leader Warm-Up</w:t>
       </w:r>
     </w:p>
     <w:p>
@@ -3713,7 +3765,7 @@
         </w:numPr>
       </w:pPr>
       <w:r>
-        <w:t>Form up in a horseshoe or circle. Ask a Scout to lead the Pledge of Allegiance to the flag.</w:t>
+        <w:t>Patrol leader picks two Scouts to lead easy dynamic stretches.</w:t>
       </w:r>
     </w:p>
     <w:p>
@@ -3725,7 +3777,7 @@
         </w:numPr>
       </w:pPr>
       <w:r>
-        <w:t>Everyone gives the Cub Scout sign and recites the Scout Oath together.</w:t>
+        <w:t>Den Chief checks form: slow, no bouncing, no pain.</w:t>
       </w:r>
     </w:p>
     <w:p>
@@ -3737,7 +3789,7 @@
         </w:numPr>
       </w:pPr>
       <w:r>
-        <w:t>Recite the Scout Law together. Younger dens may say it line-by-line after the Den Chief.</w:t>
+        <w:t>Everyone names one activity they did this week.</w:t>
       </w:r>
     </w:p>
     <w:p>
@@ -3748,7 +3800,7 @@
         <w:rPr>
           <w:b/>
         </w:rPr>
-        <w:t>Activity — Two-Hour Service Project</w:t>
+        <w:t>Opening — Opening Ceremony</w:t>
       </w:r>
     </w:p>
     <w:p>
@@ -3760,7 +3812,7 @@
         </w:numPr>
       </w:pPr>
       <w:r>
-        <w:t>Carry out the planned project: food pantry sorting, grounds cleanup, care kits, church/community partner project, or similar approved service.</w:t>
+        <w:t>Form up in a horseshoe or circle. Ask a Scout to lead the Pledge of Allegiance to the flag.</w:t>
       </w:r>
     </w:p>
     <w:p>
@@ -3772,7 +3824,7 @@
         </w:numPr>
       </w:pPr>
       <w:r>
-        <w:t>Track start/stop time and rotate jobs so every Scout contributes for the full required total.</w:t>
+        <w:t>Everyone gives the Cub Scout sign and recites the Scout Oath together.</w:t>
       </w:r>
     </w:p>
     <w:p>
@@ -3784,19 +3836,7 @@
         </w:numPr>
       </w:pPr>
       <w:r>
-        <w:t>Clean up better than you found it and thank the partner organization.</w:t>
-      </w:r>
-    </w:p>
-    <w:p>
-      <w:pPr>
-        <w:spacing w:after="40"/>
-      </w:pPr>
-      <w:r>
-        <w:rPr>
-          <w:i/>
-          <w:sz w:val="18"/>
-        </w:rPr>
-        <w:t>Needs: project-specific supplies, work gloves, trash bags or boxes, first-aid kit, water</w:t>
+        <w:t>Recite the Scout Law together. Younger dens may say it line-by-line after the Den Chief.</w:t>
       </w:r>
     </w:p>
     <w:p>
@@ -3807,7 +3847,7 @@
         <w:rPr>
           <w:b/>
         </w:rPr>
-        <w:t>Activity — Citizenship Reflection</w:t>
+        <w:t>Activity — 30-Minute Patrol Movement Block</w:t>
       </w:r>
     </w:p>
     <w:p>
@@ -3819,7 +3859,7 @@
         </w:numPr>
       </w:pPr>
       <w:r>
-        <w:t>Each Scout names who was helped and what job they did.</w:t>
+        <w:t>Run a 30-minute rotation: brisk walk/jog, relay, bodyweight circuit, and cooperative game.</w:t>
       </w:r>
     </w:p>
     <w:p>
@@ -3831,7 +3871,7 @@
         </w:numPr>
       </w:pPr>
       <w:r>
-        <w:t>Discuss what went well, what was hard, and how citizens keep serving after the project.</w:t>
+        <w:t>Scouts take turns leading stations and encouraging the group.</w:t>
       </w:r>
     </w:p>
     <w:p>
@@ -3843,7 +3883,7 @@
         </w:numPr>
       </w:pPr>
       <w:r>
-        <w:t>Record any Scout who still needs more time to reach two hours.</w:t>
+        <w:t>Cool down with slow stretches and water.</w:t>
       </w:r>
     </w:p>
     <w:p>
@@ -3855,7 +3895,7 @@
           <w:i/>
           <w:sz w:val="18"/>
         </w:rPr>
-        <w:t>Needs: service hour log, pencils</w:t>
+        <w:t>Needs: open space, cones, stopwatch, water access</w:t>
       </w:r>
     </w:p>
     <w:p>
@@ -3866,7 +3906,7 @@
         <w:rPr>
           <w:b/>
         </w:rPr>
-        <w:t>Closing — Closing Ceremony - the Living Circle</w:t>
+        <w:t>Activity — Fitness Reflection Circle</w:t>
       </w:r>
     </w:p>
     <w:p>
@@ -3878,7 +3918,7 @@
         </w:numPr>
       </w:pPr>
       <w:r>
-        <w:t>Form a circle. Everyone puts their left hand toward the center, little fingers linked to the next Scout.</w:t>
+        <w:t>Scouts who finished trackers share patterns they noticed; others commit to finishing at home.</w:t>
       </w:r>
     </w:p>
     <w:p>
@@ -3890,7 +3930,7 @@
         </w:numPr>
       </w:pPr>
       <w:r>
-        <w:t>Den Chief shares a 1-sentence thought tied to tonight (e.g., 'Tonight we practiced being Helpful.').</w:t>
+        <w:t>Discuss how being physically fit helps on hikes, campouts, and in Scouts BSA.</w:t>
       </w:r>
     </w:p>
     <w:p>
@@ -3902,6 +3942,65 @@
         </w:numPr>
       </w:pPr>
       <w:r>
+        <w:t>Patrol leader records who still needs the 14-day tracker.</w:t>
+      </w:r>
+    </w:p>
+    <w:p>
+      <w:pPr>
+        <w:spacing w:after="40"/>
+      </w:pPr>
+      <w:r>
+        <w:rPr>
+          <w:i/>
+          <w:sz w:val="18"/>
+        </w:rPr>
+        <w:t>Needs: activity trackers, pencils</w:t>
+      </w:r>
+    </w:p>
+    <w:p>
+      <w:pPr>
+        <w:spacing w:after="20"/>
+      </w:pPr>
+      <w:r>
+        <w:rPr>
+          <w:b/>
+        </w:rPr>
+        <w:t>Closing — Closing Ceremony - the Living Circle</w:t>
+      </w:r>
+    </w:p>
+    <w:p>
+      <w:pPr>
+        <w:spacing w:after="20"/>
+        <w:numPr>
+          <w:ilvl w:val="0"/>
+          <w:numId w:val="53"/>
+        </w:numPr>
+      </w:pPr>
+      <w:r>
+        <w:t>Form a circle. Everyone puts their left hand toward the center, little fingers linked to the next Scout.</w:t>
+      </w:r>
+    </w:p>
+    <w:p>
+      <w:pPr>
+        <w:spacing w:after="20"/>
+        <w:numPr>
+          <w:ilvl w:val="0"/>
+          <w:numId w:val="53"/>
+        </w:numPr>
+      </w:pPr>
+      <w:r>
+        <w:t>Den Chief shares a 1-sentence thought tied to tonight (e.g., 'Tonight we practiced being Helpful.').</w:t>
+      </w:r>
+    </w:p>
+    <w:p>
+      <w:pPr>
+        <w:spacing w:after="20"/>
+        <w:numPr>
+          <w:ilvl w:val="0"/>
+          <w:numId w:val="53"/>
+        </w:numPr>
+      </w:pPr>
+      <w:r>
         <w:t>On the Den Chief's signal, everyone raises the circle and gives a quiet 'Do Your Best!' Dismiss.</w:t>
       </w:r>
     </w:p>
@@ -3921,7 +4020,15 @@
         <w:pStyle w:val="ListBullet"/>
       </w:pPr>
       <w:r>
-        <w:t>If you did not reach two service hours, finish approved make-up service before April advancement closeout.</w:t>
+        <w:t>Finish the 14-day tracker if needed and share it with the den leader.</w:t>
+      </w:r>
+    </w:p>
+    <w:p>
+      <w:pPr>
+        <w:pStyle w:val="ListBullet"/>
+      </w:pPr>
+      <w:r>
+        <w:t>Confirm the health record review is complete.</w:t>
       </w:r>
     </w:p>
     <w:p>
@@ -3935,7 +4042,7 @@
         <w:t xml:space="preserve">Den Chief tip: </w:t>
       </w:r>
       <w:r>
-        <w:t>This session may need to be held at the service site or extended beyond a normal den meeting. Log hours immediately.</w:t>
+        <w:t>Oldest Cubs can handle real leadership: let them lead stations, but keep adult eyes on safety and hydration.</w:t>
       </w:r>
     </w:p>
     <w:p>
@@ -3949,7 +4056,7 @@
         <w:t xml:space="preserve">Flex week idea: </w:t>
       </w:r>
       <w:r>
-        <w:t>Jan 14 (Roundtable): service make-up hour, thank-you cards for the partner, or Pinewood Derby car build after service planning is done.</w:t>
+        <w:t>Jan 14 (Roundtable): make-up camp meal, extra fitness game night, or finish the 14-day tracker as a patrol check-in.</w:t>
       </w:r>
     </w:p>
     <w:p>
@@ -3962,7 +4069,7 @@
           <w:color w:val="5B2A86"/>
           <w:sz w:val="28"/>
         </w:rPr>
-        <w:t>February 2027: Duty to God</w:t>
+        <w:t>February 2027: Citizenship &amp; Duty to God</w:t>
       </w:r>
     </w:p>
     <w:p>
@@ -3970,7 +4077,7 @@
         <w:rPr>
           <w:i/>
         </w:rPr>
-        <w:t>Explore reverence through family beliefs, a crisis-helping faith-based organization, and personal daily practice.</w:t>
+        <w:t>The compression month: AOL does TWO short adventures - Citizenship (Feb 4) and Duty to God (Feb 11) - so all six required adventures are complete by Feb 11, ahead of the Feb 28 crossover. Both are service- and discussion-based, a good fit for one focused session each.</w:t>
       </w:r>
     </w:p>
     <w:tbl>
@@ -4046,6 +4153,14 @@
         <w:pStyle w:val="ListBullet"/>
       </w:pPr>
       <w:r>
+        <w:t>Citizenship req 2: If the pack service day does not reach two hours, complete additional approved service so your total is at least two hours before crossover.</w:t>
+      </w:r>
+    </w:p>
+    <w:p>
+      <w:pPr>
+        <w:pStyle w:val="ListBullet"/>
+      </w:pPr>
+      <w:r>
         <w:t>Duty to God req 1: With parent/guardian, discuss your family's faith traditions (or one of your choosing), choose a view/value related to the Scout Law, and discuss how family members demonstrate it.</w:t>
       </w:r>
     </w:p>
@@ -4067,7 +4182,7 @@
           <w:color w:val="5B2A86"/>
           <w:sz w:val="25"/>
         </w:rPr>
-        <w:t>Thu Feb 4  —  Values and Crisis Helpers</w:t>
+        <w:t>Thu Feb 4  —  Citizenship: Plan &amp; Serve</w:t>
       </w:r>
     </w:p>
     <w:p>
@@ -4081,7 +4196,7 @@
         <w:t xml:space="preserve">Focus: </w:t>
       </w:r>
       <w:r>
-        <w:t>Prepare for a respectful visit or guest from a faith-based organization that helps people in crisis.</w:t>
+        <w:t>Plan a service project with the BSA SAFE Checklist and complete two hours of service - tie it to Scouting for Food (Feb 6 &amp; 13).</w:t>
       </w:r>
     </w:p>
     <w:p>
@@ -4100,7 +4215,15 @@
         <w:pStyle w:val="ListBullet"/>
       </w:pPr>
       <w:r>
-        <w:t>Duty to God 2 (Meet with a representative of a faith-based organization that assists people in crisis regardless of faith - if guest attends tonight)</w:t>
+        <w:t>Citizenship 1 (Identify a service project and use the BSA SAFE Checklist to plan it safely)</w:t>
+      </w:r>
+    </w:p>
+    <w:p>
+      <w:pPr>
+        <w:pStyle w:val="ListBullet"/>
+      </w:pPr>
+      <w:r>
+        <w:t>Citizenship 2 (Two hours of service total - completed at Scouting for Food Feb 6 &amp; 13 or another approved project)</w:t>
       </w:r>
     </w:p>
     <w:p>
@@ -4116,7 +4239,7 @@
     </w:p>
     <w:p>
       <w:r>
-        <w:t>index cards, pencils, guest/visit confirmation, thank-you card, question cards</w:t>
+        <w:t>BSA SAFE Checklist copy, project idea list, planning worksheet, pencils, service hour log, work gloves, collection bags or boxes</w:t>
       </w:r>
     </w:p>
     <w:p>
@@ -4127,54 +4250,7 @@
         <w:rPr>
           <w:b/>
         </w:rPr>
-        <w:t>Gathering — Scout Law Values Match</w:t>
-      </w:r>
-    </w:p>
-    <w:p>
-      <w:pPr>
-        <w:spacing w:after="20"/>
-        <w:numPr>
-          <w:ilvl w:val="0"/>
-          <w:numId w:val="53"/>
-        </w:numPr>
-      </w:pPr>
-      <w:r>
-        <w:t>Lay out Scout Law cards and crisis-helper scenarios.</w:t>
-      </w:r>
-    </w:p>
-    <w:p>
-      <w:pPr>
-        <w:spacing w:after="20"/>
-        <w:numPr>
-          <w:ilvl w:val="0"/>
-          <w:numId w:val="53"/>
-        </w:numPr>
-      </w:pPr>
-      <w:r>
-        <w:t>Scouts match Law points to actions like feeding, sheltering, counseling, or welcoming people.</w:t>
-      </w:r>
-    </w:p>
-    <w:p>
-      <w:pPr>
-        <w:spacing w:after="20"/>
-        <w:numPr>
-          <w:ilvl w:val="0"/>
-          <w:numId w:val="53"/>
-        </w:numPr>
-      </w:pPr>
-      <w:r>
-        <w:t>Patrol leader asks: which Law point do you want people to see in our patrol?</w:t>
-      </w:r>
-    </w:p>
-    <w:p>
-      <w:pPr>
-        <w:spacing w:after="20"/>
-      </w:pPr>
-      <w:r>
-        <w:rPr>
-          <w:b/>
-        </w:rPr>
-        <w:t>Opening — Opening Ceremony</w:t>
+        <w:t>Gathering — Community Needs Map</w:t>
       </w:r>
     </w:p>
     <w:p>
@@ -4186,7 +4262,7 @@
         </w:numPr>
       </w:pPr>
       <w:r>
-        <w:t>Form up in a horseshoe or circle. Ask a Scout to lead the Pledge of Allegiance to the flag.</w:t>
+        <w:t>Scouts put sticky notes on a local map or chart: parks, schools, food pantry, veterans, animal shelter, meeting place.</w:t>
       </w:r>
     </w:p>
     <w:p>
@@ -4198,7 +4274,7 @@
         </w:numPr>
       </w:pPr>
       <w:r>
-        <w:t>Everyone gives the Cub Scout sign and recites the Scout Oath together.</w:t>
+        <w:t>For each note, add one way a patrol could help.</w:t>
       </w:r>
     </w:p>
     <w:p>
@@ -4210,7 +4286,7 @@
         </w:numPr>
       </w:pPr>
       <w:r>
-        <w:t>Recite the Scout Law together. Younger dens may say it line-by-line after the Den Chief.</w:t>
+        <w:t>Patrol leader groups ideas into indoor, outdoor, collection, and hands-on service.</w:t>
       </w:r>
     </w:p>
     <w:p>
@@ -4221,7 +4297,7 @@
         <w:rPr>
           <w:b/>
         </w:rPr>
-        <w:t>Activity — Respectful Question Prep</w:t>
+        <w:t>Opening — Opening Ceremony</w:t>
       </w:r>
     </w:p>
     <w:p>
@@ -4233,7 +4309,7 @@
         </w:numPr>
       </w:pPr>
       <w:r>
-        <w:t>Review that families believe and practice differently; the goal is respect and learning.</w:t>
+        <w:t>Form up in a horseshoe or circle. Ask a Scout to lead the Pledge of Allegiance to the flag.</w:t>
       </w:r>
     </w:p>
     <w:p>
@@ -4245,7 +4321,7 @@
         </w:numPr>
       </w:pPr>
       <w:r>
-        <w:t>Scouts write questions for a faith-based organization: who do you help, how, and why serve everyone?</w:t>
+        <w:t>Everyone gives the Cub Scout sign and recites the Scout Oath together.</w:t>
       </w:r>
     </w:p>
     <w:p>
@@ -4257,7 +4333,424 @@
         </w:numPr>
       </w:pPr>
       <w:r>
-        <w:t>Choose 4-5 best questions and assign Scouts to ask them.</w:t>
+        <w:t>Recite the Scout Law together. Younger dens may say it line-by-line after the Den Chief.</w:t>
+      </w:r>
+    </w:p>
+    <w:p>
+      <w:pPr>
+        <w:spacing w:after="20"/>
+      </w:pPr>
+      <w:r>
+        <w:rPr>
+          <w:b/>
+        </w:rPr>
+        <w:t>Activity — Service Project Decision &amp; SAFE Plan</w:t>
+      </w:r>
+    </w:p>
+    <w:p>
+      <w:pPr>
+        <w:spacing w:after="20"/>
+        <w:numPr>
+          <w:ilvl w:val="0"/>
+          <w:numId w:val="56"/>
+        </w:numPr>
+      </w:pPr>
+      <w:r>
+        <w:t>Confirm the patrol's service: Scouting for Food (Feb 6 collection tags, Feb 13 pickup) is the easy two-hour project - or choose another approved project.</w:t>
+      </w:r>
+    </w:p>
+    <w:p>
+      <w:pPr>
+        <w:spacing w:after="20"/>
+        <w:numPr>
+          <w:ilvl w:val="0"/>
+          <w:numId w:val="56"/>
+        </w:numPr>
+      </w:pPr>
+      <w:r>
+        <w:t>Define who is helped, what jobs Scouts will own, and what success looks like.</w:t>
+      </w:r>
+    </w:p>
+    <w:p>
+      <w:pPr>
+        <w:spacing w:after="20"/>
+        <w:numPr>
+          <w:ilvl w:val="0"/>
+          <w:numId w:val="56"/>
+        </w:numPr>
+      </w:pPr>
+      <w:r>
+        <w:t>Walk through SAFE (Supervision, Assessment, Fitness/skill, Equipment/environment): hazards, adults, gear, weather, transportation.</w:t>
+      </w:r>
+    </w:p>
+    <w:p>
+      <w:pPr>
+        <w:spacing w:after="40"/>
+      </w:pPr>
+      <w:r>
+        <w:rPr>
+          <w:i/>
+          <w:sz w:val="18"/>
+        </w:rPr>
+        <w:t>Needs: BSA SAFE Checklist copy, project idea list, planning worksheet, pencils</w:t>
+      </w:r>
+    </w:p>
+    <w:p>
+      <w:pPr>
+        <w:spacing w:after="20"/>
+      </w:pPr>
+      <w:r>
+        <w:rPr>
+          <w:b/>
+        </w:rPr>
+        <w:t>Activity — Serve &amp; Reflect</w:t>
+      </w:r>
+    </w:p>
+    <w:p>
+      <w:pPr>
+        <w:spacing w:after="20"/>
+        <w:numPr>
+          <w:ilvl w:val="0"/>
+          <w:numId w:val="57"/>
+        </w:numPr>
+      </w:pPr>
+      <w:r>
+        <w:t>Carry out (or lock in the plan for) the two-hour service - track start/stop time so every Scout reaches the full total.</w:t>
+      </w:r>
+    </w:p>
+    <w:p>
+      <w:pPr>
+        <w:spacing w:after="20"/>
+        <w:numPr>
+          <w:ilvl w:val="0"/>
+          <w:numId w:val="57"/>
+        </w:numPr>
+      </w:pPr>
+      <w:r>
+        <w:t>Clean up better than you found it and thank the partner organization.</w:t>
+      </w:r>
+    </w:p>
+    <w:p>
+      <w:pPr>
+        <w:spacing w:after="20"/>
+        <w:numPr>
+          <w:ilvl w:val="0"/>
+          <w:numId w:val="57"/>
+        </w:numPr>
+      </w:pPr>
+      <w:r>
+        <w:t>Each Scout names who was helped and how citizens keep serving after the project.</w:t>
+      </w:r>
+    </w:p>
+    <w:p>
+      <w:pPr>
+        <w:spacing w:after="40"/>
+      </w:pPr>
+      <w:r>
+        <w:rPr>
+          <w:i/>
+          <w:sz w:val="18"/>
+        </w:rPr>
+        <w:t>Needs: service hour log, work gloves, collection bags or boxes, pencils</w:t>
+      </w:r>
+    </w:p>
+    <w:p>
+      <w:pPr>
+        <w:spacing w:after="20"/>
+      </w:pPr>
+      <w:r>
+        <w:rPr>
+          <w:b/>
+        </w:rPr>
+        <w:t>Closing — Closing Ceremony - the Living Circle</w:t>
+      </w:r>
+    </w:p>
+    <w:p>
+      <w:pPr>
+        <w:spacing w:after="20"/>
+        <w:numPr>
+          <w:ilvl w:val="0"/>
+          <w:numId w:val="58"/>
+        </w:numPr>
+      </w:pPr>
+      <w:r>
+        <w:t>Form a circle. Everyone puts their left hand toward the center, little fingers linked to the next Scout.</w:t>
+      </w:r>
+    </w:p>
+    <w:p>
+      <w:pPr>
+        <w:spacing w:after="20"/>
+        <w:numPr>
+          <w:ilvl w:val="0"/>
+          <w:numId w:val="58"/>
+        </w:numPr>
+      </w:pPr>
+      <w:r>
+        <w:t>Den Chief shares a 1-sentence thought tied to tonight (e.g., 'Tonight we practiced being Helpful.').</w:t>
+      </w:r>
+    </w:p>
+    <w:p>
+      <w:pPr>
+        <w:spacing w:after="20"/>
+        <w:numPr>
+          <w:ilvl w:val="0"/>
+          <w:numId w:val="58"/>
+        </w:numPr>
+      </w:pPr>
+      <w:r>
+        <w:t>On the Den Chief's signal, everyone raises the circle and gives a quiet 'Do Your Best!' Dismiss.</w:t>
+      </w:r>
+    </w:p>
+    <w:p>
+      <w:pPr>
+        <w:spacing w:after="40"/>
+      </w:pPr>
+      <w:r>
+        <w:rPr>
+          <w:b/>
+        </w:rPr>
+        <w:t>Send home / follow-up:</w:t>
+      </w:r>
+    </w:p>
+    <w:p>
+      <w:pPr>
+        <w:pStyle w:val="ListBullet"/>
+      </w:pPr>
+      <w:r>
+        <w:t>Protect the Scouting for Food dates (Feb 6 &amp; 13) so everyone reaches two service hours.</w:t>
+      </w:r>
+    </w:p>
+    <w:p>
+      <w:pPr>
+        <w:pStyle w:val="ListBullet"/>
+      </w:pPr>
+      <w:r>
+        <w:t>Log service hours in Scoutbook right away.</w:t>
+      </w:r>
+    </w:p>
+    <w:p>
+      <w:pPr>
+        <w:spacing w:after="120"/>
+      </w:pPr>
+      <w:r>
+        <w:rPr>
+          <w:b/>
+        </w:rPr>
+        <w:t xml:space="preserve">Den Chief tip: </w:t>
+      </w:r>
+      <w:r>
+        <w:t>Scouting for Food is a ready-made two-hour service project - lean on it. Let the patrol leader run the job list, not the adults.</w:t>
+      </w:r>
+    </w:p>
+    <w:p>
+      <w:pPr>
+        <w:spacing w:before="200" w:after="80"/>
+      </w:pPr>
+      <w:r>
+        <w:rPr>
+          <w:b/>
+          <w:color w:val="5B2A86"/>
+          <w:sz w:val="25"/>
+        </w:rPr>
+        <w:t>Thu Feb 11  —  Duty to God: Reverence &amp; Service</w:t>
+      </w:r>
+    </w:p>
+    <w:p>
+      <w:pPr>
+        <w:spacing w:after="40"/>
+      </w:pPr>
+      <w:r>
+        <w:rPr>
+          <w:b/>
+        </w:rPr>
+        <w:t xml:space="preserve">Focus: </w:t>
+      </w:r>
+      <w:r>
+        <w:t>Meet a faith-based crisis helper and connect reverence to daily action - the last required adventure before crossover.</w:t>
+      </w:r>
+    </w:p>
+    <w:p>
+      <w:pPr>
+        <w:spacing w:after="40"/>
+      </w:pPr>
+      <w:r>
+        <w:rPr>
+          <w:b/>
+        </w:rPr>
+        <w:t>Requirements completed tonight:</w:t>
+      </w:r>
+    </w:p>
+    <w:p>
+      <w:pPr>
+        <w:pStyle w:val="ListBullet"/>
+      </w:pPr>
+      <w:r>
+        <w:t>Duty to God 2 (Meet a representative of a faith-based organization that assists people in crisis regardless of faith - guest or visit)</w:t>
+      </w:r>
+    </w:p>
+    <w:p>
+      <w:pPr>
+        <w:pStyle w:val="ListBullet"/>
+      </w:pPr>
+      <w:r>
+        <w:t>Duty to God 1 &amp; 3 wrap-up (family faith/value discussion and daily-practice discussion - completed with parent/guardian or adult leader)</w:t>
+      </w:r>
+    </w:p>
+    <w:p>
+      <w:pPr>
+        <w:spacing w:after="40"/>
+      </w:pPr>
+      <w:r>
+        <w:rPr>
+          <w:b/>
+        </w:rPr>
+        <w:t>Materials to bring:</w:t>
+      </w:r>
+    </w:p>
+    <w:p>
+      <w:r>
+        <w:t>index cards, pencils, guest/visit confirmation, thank-you card, question cards</w:t>
+      </w:r>
+    </w:p>
+    <w:p>
+      <w:pPr>
+        <w:spacing w:after="20"/>
+      </w:pPr>
+      <w:r>
+        <w:rPr>
+          <w:b/>
+        </w:rPr>
+        <w:t>Gathering — Scout Law Values Match</w:t>
+      </w:r>
+    </w:p>
+    <w:p>
+      <w:pPr>
+        <w:spacing w:after="20"/>
+        <w:numPr>
+          <w:ilvl w:val="0"/>
+          <w:numId w:val="59"/>
+        </w:numPr>
+      </w:pPr>
+      <w:r>
+        <w:t>Lay out Scout Law cards and crisis-helper scenarios.</w:t>
+      </w:r>
+    </w:p>
+    <w:p>
+      <w:pPr>
+        <w:spacing w:after="20"/>
+        <w:numPr>
+          <w:ilvl w:val="0"/>
+          <w:numId w:val="59"/>
+        </w:numPr>
+      </w:pPr>
+      <w:r>
+        <w:t>Scouts match Law points to actions like feeding, sheltering, counseling, or welcoming people.</w:t>
+      </w:r>
+    </w:p>
+    <w:p>
+      <w:pPr>
+        <w:spacing w:after="20"/>
+        <w:numPr>
+          <w:ilvl w:val="0"/>
+          <w:numId w:val="59"/>
+        </w:numPr>
+      </w:pPr>
+      <w:r>
+        <w:t>Patrol leader asks: which Law point do you want people to see in our patrol?</w:t>
+      </w:r>
+    </w:p>
+    <w:p>
+      <w:pPr>
+        <w:spacing w:after="20"/>
+      </w:pPr>
+      <w:r>
+        <w:rPr>
+          <w:b/>
+        </w:rPr>
+        <w:t>Opening — Opening Ceremony</w:t>
+      </w:r>
+    </w:p>
+    <w:p>
+      <w:pPr>
+        <w:spacing w:after="20"/>
+        <w:numPr>
+          <w:ilvl w:val="0"/>
+          <w:numId w:val="60"/>
+        </w:numPr>
+      </w:pPr>
+      <w:r>
+        <w:t>Form up in a horseshoe or circle. Ask a Scout to lead the Pledge of Allegiance to the flag.</w:t>
+      </w:r>
+    </w:p>
+    <w:p>
+      <w:pPr>
+        <w:spacing w:after="20"/>
+        <w:numPr>
+          <w:ilvl w:val="0"/>
+          <w:numId w:val="60"/>
+        </w:numPr>
+      </w:pPr>
+      <w:r>
+        <w:t>Everyone gives the Cub Scout sign and recites the Scout Oath together.</w:t>
+      </w:r>
+    </w:p>
+    <w:p>
+      <w:pPr>
+        <w:spacing w:after="20"/>
+        <w:numPr>
+          <w:ilvl w:val="0"/>
+          <w:numId w:val="60"/>
+        </w:numPr>
+      </w:pPr>
+      <w:r>
+        <w:t>Recite the Scout Law together. Younger dens may say it line-by-line after the Den Chief.</w:t>
+      </w:r>
+    </w:p>
+    <w:p>
+      <w:pPr>
+        <w:spacing w:after="20"/>
+      </w:pPr>
+      <w:r>
+        <w:rPr>
+          <w:b/>
+        </w:rPr>
+        <w:t>Activity — Respectful Question Prep</w:t>
+      </w:r>
+    </w:p>
+    <w:p>
+      <w:pPr>
+        <w:spacing w:after="20"/>
+        <w:numPr>
+          <w:ilvl w:val="0"/>
+          <w:numId w:val="61"/>
+        </w:numPr>
+      </w:pPr>
+      <w:r>
+        <w:t>Review that families believe and practice differently; the goal is respect and learning.</w:t>
+      </w:r>
+    </w:p>
+    <w:p>
+      <w:pPr>
+        <w:spacing w:after="20"/>
+        <w:numPr>
+          <w:ilvl w:val="0"/>
+          <w:numId w:val="61"/>
+        </w:numPr>
+      </w:pPr>
+      <w:r>
+        <w:t>Scouts write 4-5 questions for a faith-based organization: who do you help, how, and why serve everyone?</w:t>
+      </w:r>
+    </w:p>
+    <w:p>
+      <w:pPr>
+        <w:spacing w:after="20"/>
+        <w:numPr>
+          <w:ilvl w:val="0"/>
+          <w:numId w:val="61"/>
+        </w:numPr>
+      </w:pPr>
+      <w:r>
+        <w:t>Assign Scouts to ask the questions.</w:t>
       </w:r>
     </w:p>
     <w:p>
@@ -4288,11 +4781,11 @@
         <w:spacing w:after="20"/>
         <w:numPr>
           <w:ilvl w:val="0"/>
-          <w:numId w:val="56"/>
+          <w:numId w:val="62"/>
         </w:numPr>
       </w:pPr>
       <w:r>
-        <w:t>Meet a representative from a faith-based organization that assists people in crisis regardless of faith.</w:t>
+        <w:t>Meet a representative from a faith-based organization that assists people in crisis regardless of faith (guest or short visit).</w:t>
       </w:r>
     </w:p>
     <w:p>
@@ -4300,7 +4793,7 @@
         <w:spacing w:after="20"/>
         <w:numPr>
           <w:ilvl w:val="0"/>
-          <w:numId w:val="56"/>
+          <w:numId w:val="62"/>
         </w:numPr>
       </w:pPr>
       <w:r>
@@ -4312,11 +4805,11 @@
         <w:spacing w:after="20"/>
         <w:numPr>
           <w:ilvl w:val="0"/>
-          <w:numId w:val="56"/>
+          <w:numId w:val="62"/>
         </w:numPr>
       </w:pPr>
       <w:r>
-        <w:t>Thank the guest and record one service idea the patrol could support.</w:t>
+        <w:t>Connect the work to Scout Law points (Helpful, Kind, Brave, Reverent) and thank the guest.</w:t>
       </w:r>
     </w:p>
     <w:p>
@@ -4339,7 +4832,7 @@
         <w:rPr>
           <w:b/>
         </w:rPr>
-        <w:t>Closing — Closing Ceremony - the Living Circle</w:t>
+        <w:t>Activity — Daily Practice Circle</w:t>
       </w:r>
     </w:p>
     <w:p>
@@ -4347,11 +4840,11 @@
         <w:spacing w:after="20"/>
         <w:numPr>
           <w:ilvl w:val="0"/>
-          <w:numId w:val="57"/>
+          <w:numId w:val="63"/>
         </w:numPr>
       </w:pPr>
       <w:r>
-        <w:t>Form a circle. Everyone puts their left hand toward the center, little fingers linked to the next Scout.</w:t>
+        <w:t>Scouts may share one value or practice from home if their family is comfortable.</w:t>
       </w:r>
     </w:p>
     <w:p>
@@ -4359,11 +4852,11 @@
         <w:spacing w:after="20"/>
         <w:numPr>
           <w:ilvl w:val="0"/>
-          <w:numId w:val="57"/>
+          <w:numId w:val="63"/>
         </w:numPr>
       </w:pPr>
       <w:r>
-        <w:t>Den Chief shares a 1-sentence thought tied to tonight (e.g., 'Tonight we practiced being Helpful.').</w:t>
+        <w:t>Each Scout states one respectful daily action: prayer, reflection, gratitude, service, kindness, or learning.</w:t>
       </w:r>
     </w:p>
     <w:p>
@@ -4371,7 +4864,54 @@
         <w:spacing w:after="20"/>
         <w:numPr>
           <w:ilvl w:val="0"/>
-          <w:numId w:val="57"/>
+          <w:numId w:val="63"/>
+        </w:numPr>
+      </w:pPr>
+      <w:r>
+        <w:t>Leader confirms who still needs the parent/guardian discussion (reqs 1 &amp; 3) at home.</w:t>
+      </w:r>
+    </w:p>
+    <w:p>
+      <w:pPr>
+        <w:spacing w:after="20"/>
+      </w:pPr>
+      <w:r>
+        <w:rPr>
+          <w:b/>
+        </w:rPr>
+        <w:t>Closing — Closing Ceremony - the Living Circle</w:t>
+      </w:r>
+    </w:p>
+    <w:p>
+      <w:pPr>
+        <w:spacing w:after="20"/>
+        <w:numPr>
+          <w:ilvl w:val="0"/>
+          <w:numId w:val="64"/>
+        </w:numPr>
+      </w:pPr>
+      <w:r>
+        <w:t>Form a circle. Everyone puts their left hand toward the center, little fingers linked to the next Scout.</w:t>
+      </w:r>
+    </w:p>
+    <w:p>
+      <w:pPr>
+        <w:spacing w:after="20"/>
+        <w:numPr>
+          <w:ilvl w:val="0"/>
+          <w:numId w:val="64"/>
+        </w:numPr>
+      </w:pPr>
+      <w:r>
+        <w:t>Den Chief shares a 1-sentence thought tied to tonight (e.g., 'Tonight we practiced being Helpful.').</w:t>
+      </w:r>
+    </w:p>
+    <w:p>
+      <w:pPr>
+        <w:spacing w:after="20"/>
+        <w:numPr>
+          <w:ilvl w:val="0"/>
+          <w:numId w:val="64"/>
         </w:numPr>
       </w:pPr>
       <w:r>
@@ -4394,7 +4934,7 @@
         <w:pStyle w:val="ListBullet"/>
       </w:pPr>
       <w:r>
-        <w:t>Complete the family faith/value discussion (req 1).</w:t>
+        <w:t>Finish the family faith/value discussion (req 1) and the daily-practice discussion (req 3) at home if not done.</w:t>
       </w:r>
     </w:p>
     <w:p>
@@ -4402,7 +4942,7 @@
         <w:pStyle w:val="ListBullet"/>
       </w:pPr>
       <w:r>
-        <w:t>Start thinking about how you practice Duty to God daily (req 3).</w:t>
+        <w:t>This is the LAST required adventure - confirm all six are recorded in Scoutbook so the Scout is ready to cross over.</w:t>
       </w:r>
     </w:p>
     <w:p>
@@ -4416,357 +4956,7 @@
         <w:t xml:space="preserve">Den Chief tip: </w:t>
       </w:r>
       <w:r>
-        <w:t>Keep this inclusive. Focus on reverence, service, and respect; do not ask Scouts to compare whose beliefs are right.</w:t>
-      </w:r>
-    </w:p>
-    <w:p>
-      <w:pPr>
-        <w:spacing w:before="200" w:after="80"/>
-      </w:pPr>
-      <w:r>
-        <w:rPr>
-          <w:b/>
-          <w:color w:val="5B2A86"/>
-          <w:sz w:val="25"/>
-        </w:rPr>
-        <w:t>Thu Feb 11  —  Duty in Daily Life</w:t>
-      </w:r>
-    </w:p>
-    <w:p>
-      <w:pPr>
-        <w:spacing w:after="40"/>
-      </w:pPr>
-      <w:r>
-        <w:rPr>
-          <w:b/>
-        </w:rPr>
-        <w:t xml:space="preserve">Focus: </w:t>
-      </w:r>
-      <w:r>
-        <w:t>Share values respectfully and finish the crisis-helper discussion if needed.</w:t>
-      </w:r>
-    </w:p>
-    <w:p>
-      <w:pPr>
-        <w:spacing w:after="40"/>
-      </w:pPr>
-      <w:r>
-        <w:rPr>
-          <w:b/>
-        </w:rPr>
-        <w:t>Requirements completed tonight:</w:t>
-      </w:r>
-    </w:p>
-    <w:p>
-      <w:pPr>
-        <w:pStyle w:val="ListBullet"/>
-      </w:pPr>
-      <w:r>
-        <w:t>Duty to God 2 (Crisis-helping organization discussion/visit wrap-up)</w:t>
-      </w:r>
-    </w:p>
-    <w:p>
-      <w:pPr>
-        <w:pStyle w:val="ListBullet"/>
-      </w:pPr>
-      <w:r>
-        <w:t>Duty to God 3 (Discuss what Duty to God means and daily practice - if done with adult leader tonight)</w:t>
-      </w:r>
-    </w:p>
-    <w:p>
-      <w:pPr>
-        <w:spacing w:after="40"/>
-      </w:pPr>
-      <w:r>
-        <w:rPr>
-          <w:b/>
-        </w:rPr>
-        <w:t>Materials to bring:</w:t>
-      </w:r>
-    </w:p>
-    <w:p>
-      <w:r>
-        <w:t>notes from visit/guest, thank-you card, markers</w:t>
-      </w:r>
-    </w:p>
-    <w:p>
-      <w:pPr>
-        <w:spacing w:after="20"/>
-      </w:pPr>
-      <w:r>
-        <w:rPr>
-          <w:b/>
-        </w:rPr>
-        <w:t>Gathering — Quiet Reflection Cards</w:t>
-      </w:r>
-    </w:p>
-    <w:p>
-      <w:pPr>
-        <w:spacing w:after="20"/>
-        <w:numPr>
-          <w:ilvl w:val="0"/>
-          <w:numId w:val="58"/>
-        </w:numPr>
-      </w:pPr>
-      <w:r>
-        <w:t>As Scouts arrive, they write one word from the Scout Law that connects to reverence or service.</w:t>
-      </w:r>
-    </w:p>
-    <w:p>
-      <w:pPr>
-        <w:spacing w:after="20"/>
-        <w:numPr>
-          <w:ilvl w:val="0"/>
-          <w:numId w:val="58"/>
-        </w:numPr>
-      </w:pPr>
-      <w:r>
-        <w:t>Cards stay private unless Scouts choose to share.</w:t>
-      </w:r>
-    </w:p>
-    <w:p>
-      <w:pPr>
-        <w:spacing w:after="20"/>
-        <w:numPr>
-          <w:ilvl w:val="0"/>
-          <w:numId w:val="58"/>
-        </w:numPr>
-      </w:pPr>
-      <w:r>
-        <w:t>Den Chief uses the words to open the discussion.</w:t>
-      </w:r>
-    </w:p>
-    <w:p>
-      <w:pPr>
-        <w:spacing w:after="20"/>
-      </w:pPr>
-      <w:r>
-        <w:rPr>
-          <w:b/>
-        </w:rPr>
-        <w:t>Opening — Opening Ceremony</w:t>
-      </w:r>
-    </w:p>
-    <w:p>
-      <w:pPr>
-        <w:spacing w:after="20"/>
-        <w:numPr>
-          <w:ilvl w:val="0"/>
-          <w:numId w:val="59"/>
-        </w:numPr>
-      </w:pPr>
-      <w:r>
-        <w:t>Form up in a horseshoe or circle. Ask a Scout to lead the Pledge of Allegiance to the flag.</w:t>
-      </w:r>
-    </w:p>
-    <w:p>
-      <w:pPr>
-        <w:spacing w:after="20"/>
-        <w:numPr>
-          <w:ilvl w:val="0"/>
-          <w:numId w:val="59"/>
-        </w:numPr>
-      </w:pPr>
-      <w:r>
-        <w:t>Everyone gives the Cub Scout sign and recites the Scout Oath together.</w:t>
-      </w:r>
-    </w:p>
-    <w:p>
-      <w:pPr>
-        <w:spacing w:after="20"/>
-        <w:numPr>
-          <w:ilvl w:val="0"/>
-          <w:numId w:val="59"/>
-        </w:numPr>
-      </w:pPr>
-      <w:r>
-        <w:t>Recite the Scout Law together. Younger dens may say it line-by-line after the Den Chief.</w:t>
-      </w:r>
-    </w:p>
-    <w:p>
-      <w:pPr>
-        <w:spacing w:after="20"/>
-      </w:pPr>
-      <w:r>
-        <w:rPr>
-          <w:b/>
-        </w:rPr>
-        <w:t>Activity — Faith-Based Helper Debrief</w:t>
-      </w:r>
-    </w:p>
-    <w:p>
-      <w:pPr>
-        <w:spacing w:after="20"/>
-        <w:numPr>
-          <w:ilvl w:val="0"/>
-          <w:numId w:val="60"/>
-        </w:numPr>
-      </w:pPr>
-      <w:r>
-        <w:t>Review who the organization helps, what crisis needs they meet, and how they serve people regardless of faith.</w:t>
-      </w:r>
-    </w:p>
-    <w:p>
-      <w:pPr>
-        <w:spacing w:after="20"/>
-        <w:numPr>
-          <w:ilvl w:val="0"/>
-          <w:numId w:val="60"/>
-        </w:numPr>
-      </w:pPr>
-      <w:r>
-        <w:t>Scouts connect the work to Scout Law points such as Helpful, Kind, Brave, Clean, and Reverent.</w:t>
-      </w:r>
-    </w:p>
-    <w:p>
-      <w:pPr>
-        <w:spacing w:after="20"/>
-        <w:numPr>
-          <w:ilvl w:val="0"/>
-          <w:numId w:val="60"/>
-        </w:numPr>
-      </w:pPr>
-      <w:r>
-        <w:t>Patrol leader leads a thank-you note or small support idea.</w:t>
-      </w:r>
-    </w:p>
-    <w:p>
-      <w:pPr>
-        <w:spacing w:after="40"/>
-      </w:pPr>
-      <w:r>
-        <w:rPr>
-          <w:i/>
-          <w:sz w:val="18"/>
-        </w:rPr>
-        <w:t>Needs: notes from visit/guest, thank-you card, markers</w:t>
-      </w:r>
-    </w:p>
-    <w:p>
-      <w:pPr>
-        <w:spacing w:after="20"/>
-      </w:pPr>
-      <w:r>
-        <w:rPr>
-          <w:b/>
-        </w:rPr>
-        <w:t>Activity — Daily Practice Circle</w:t>
-      </w:r>
-    </w:p>
-    <w:p>
-      <w:pPr>
-        <w:spacing w:after="20"/>
-        <w:numPr>
-          <w:ilvl w:val="0"/>
-          <w:numId w:val="61"/>
-        </w:numPr>
-      </w:pPr>
-      <w:r>
-        <w:t>Scouts may share one value or practice from home if their family is comfortable.</w:t>
-      </w:r>
-    </w:p>
-    <w:p>
-      <w:pPr>
-        <w:spacing w:after="20"/>
-        <w:numPr>
-          <w:ilvl w:val="0"/>
-          <w:numId w:val="61"/>
-        </w:numPr>
-      </w:pPr>
-      <w:r>
-        <w:t>Each Scout states one respectful daily action: prayer, reflection, gratitude, service, kindness, or learning.</w:t>
-      </w:r>
-    </w:p>
-    <w:p>
-      <w:pPr>
-        <w:spacing w:after="20"/>
-        <w:numPr>
-          <w:ilvl w:val="0"/>
-          <w:numId w:val="61"/>
-        </w:numPr>
-      </w:pPr>
-      <w:r>
-        <w:t>Leader notes who still needs the parent/guardian discussion at home.</w:t>
-      </w:r>
-    </w:p>
-    <w:p>
-      <w:pPr>
-        <w:spacing w:after="20"/>
-      </w:pPr>
-      <w:r>
-        <w:rPr>
-          <w:b/>
-        </w:rPr>
-        <w:t>Closing — Closing Ceremony - the Living Circle</w:t>
-      </w:r>
-    </w:p>
-    <w:p>
-      <w:pPr>
-        <w:spacing w:after="20"/>
-        <w:numPr>
-          <w:ilvl w:val="0"/>
-          <w:numId w:val="62"/>
-        </w:numPr>
-      </w:pPr>
-      <w:r>
-        <w:t>Form a circle. Everyone puts their left hand toward the center, little fingers linked to the next Scout.</w:t>
-      </w:r>
-    </w:p>
-    <w:p>
-      <w:pPr>
-        <w:spacing w:after="20"/>
-        <w:numPr>
-          <w:ilvl w:val="0"/>
-          <w:numId w:val="62"/>
-        </w:numPr>
-      </w:pPr>
-      <w:r>
-        <w:t>Den Chief shares a 1-sentence thought tied to tonight (e.g., 'Tonight we practiced being Helpful.').</w:t>
-      </w:r>
-    </w:p>
-    <w:p>
-      <w:pPr>
-        <w:spacing w:after="20"/>
-        <w:numPr>
-          <w:ilvl w:val="0"/>
-          <w:numId w:val="62"/>
-        </w:numPr>
-      </w:pPr>
-      <w:r>
-        <w:t>On the Den Chief's signal, everyone raises the circle and gives a quiet 'Do Your Best!' Dismiss.</w:t>
-      </w:r>
-    </w:p>
-    <w:p>
-      <w:pPr>
-        <w:spacing w:after="40"/>
-      </w:pPr>
-      <w:r>
-        <w:rPr>
-          <w:b/>
-        </w:rPr>
-        <w:t>Send home / follow-up:</w:t>
-      </w:r>
-    </w:p>
-    <w:p>
-      <w:pPr>
-        <w:pStyle w:val="ListBullet"/>
-      </w:pPr>
-      <w:r>
-        <w:t>Finish any remaining Duty to God home discussions with a parent/guardian.</w:t>
-      </w:r>
-    </w:p>
-    <w:p>
-      <w:pPr>
-        <w:spacing w:after="120"/>
-      </w:pPr>
-      <w:r>
-        <w:rPr>
-          <w:b/>
-        </w:rPr>
-        <w:t xml:space="preserve">Den Chief tip: </w:t>
-      </w:r>
-      <w:r>
-        <w:t>Some requirements are intentionally family-led. Provide a simple sign-off reminder and avoid putting Scouts on the spot.</w:t>
+        <w:t>Keep this inclusive: focus on reverence, service, and respect - never compare whose beliefs are right. With this done, the patrol has finished all six required adventures before crossover.</w:t>
       </w:r>
     </w:p>
     <w:p>
@@ -4780,7 +4970,7 @@
         <w:t xml:space="preserve">Flex week idea: </w:t>
       </w:r>
       <w:r>
-        <w:t>No separate flex week in Feb (2/18 is dark). Use Blue &amp; Gold on 2/25 to celebrate AOL leadership and invite the troop.</w:t>
+        <w:t>No separate flex week in Feb (2/18 is dark). Blue &amp; Gold on 2/25 celebrates AOL; the Crossover ceremony (about Feb 28) sends the patrol into their troop with all six adventures complete.</w:t>
       </w:r>
     </w:p>
     <w:p>
@@ -4793,7 +4983,7 @@
           <w:color w:val="5B2A86"/>
           <w:sz w:val="28"/>
         </w:rPr>
-        <w:t>March 2027: Outdoor Adventurer</w:t>
+        <w:t>March 2027: Complete - Optional: Knife Safety</w:t>
       </w:r>
     </w:p>
     <w:p>
@@ -4801,7 +4991,7 @@
         <w:rPr>
           <w:i/>
         </w:rPr>
-        <w:t>Prepare for, participate in, and learn from the pack spring campout around March 5-7, 2027; the campout itself is the required outing.</w:t>
+        <w:t>All six required adventures are DONE and the patrol has crossed over (about Feb 28). These den slots are optional enrichment. Knife Safety is a great bridge skill toward the Scouts BSA Totin' Chip - run it for any AOL Scouts who stay engaged with the pack through spring.</w:t>
       </w:r>
     </w:p>
     <w:tbl>
@@ -4893,7 +5083,7 @@
         <w:pStyle w:val="ListBullet"/>
       </w:pPr>
       <w:r>
-        <w:t>Outdoor Adventurer req 5-7: Participate in the pack spring campout around March 5-7, 2027, help set up patrol gear before your own tent, and demonstrate food/kitchen sanitation during the outing.</w:t>
+        <w:t>No required adventures remain. Anyone who missed a required item should finish the make-up with their new troop or the den leader as soon as possible.</w:t>
       </w:r>
     </w:p>
     <w:p>
@@ -4906,7 +5096,7 @@
           <w:color w:val="5B2A86"/>
           <w:sz w:val="25"/>
         </w:rPr>
-        <w:t>Thu Mar 4  —  Campout Prep and Patrol Plan</w:t>
+        <w:t>Thu Mar 4  —  Knife Rules and Safety Circle (optional)</w:t>
       </w:r>
     </w:p>
     <w:p>
@@ -4920,7 +5110,7 @@
         <w:t xml:space="preserve">Focus: </w:t>
       </w:r>
       <w:r>
-        <w:t>Prepare for the spring campout: essentials, overnight gear, SAFE checklist, map, and campsite plan.</w:t>
+        <w:t>Read and promise to follow the Cub Scout Knife Safety Rules; practice the safety circle, care, and handling.</w:t>
       </w:r>
     </w:p>
     <w:p>
@@ -4939,7 +5129,7 @@
         <w:pStyle w:val="ListBullet"/>
       </w:pPr>
       <w:r>
-        <w:t>Outdoor Adventurer 1 (Scout Basic Essentials)</w:t>
+        <w:t>Optional elective - Knife Safety 1 (Rules and promise)</w:t>
       </w:r>
     </w:p>
     <w:p>
@@ -4947,7 +5137,7 @@
         <w:pStyle w:val="ListBullet"/>
       </w:pPr>
       <w:r>
-        <w:t>Outdoor Adventurer 2 (What to bring and how to carry it)</w:t>
+        <w:t>Knife Safety 2 (Safety circle)</w:t>
       </w:r>
     </w:p>
     <w:p>
@@ -4955,15 +5145,7 @@
         <w:pStyle w:val="ListBullet"/>
       </w:pPr>
       <w:r>
-        <w:t>Outdoor Adventurer 3 (BSA SAFE Checklist)</w:t>
-      </w:r>
-    </w:p>
-    <w:p>
-      <w:pPr>
-        <w:pStyle w:val="ListBullet"/>
-      </w:pPr>
-      <w:r>
-        <w:t>Outdoor Adventurer 4 (Locate camp and campsite on a map)</w:t>
+        <w:t>Knife Safety 3 (Care for and use a knife safely)</w:t>
       </w:r>
     </w:p>
     <w:p>
@@ -4979,7 +5161,7 @@
     </w:p>
     <w:p>
       <w:r>
-        <w:t>packing checklist, pencils, sample gear, BSA SAFE Checklist, chart paper, markers, camp map, printed site map or blank paper</w:t>
+        <w:t>printed Cub Scout Knife Safety Rules, pencils, trainer knives or approved pocketknives, work gloves if desired, clean cloth, small sharpening stone for demo only</w:t>
       </w:r>
     </w:p>
     <w:p>
@@ -4990,101 +5172,7 @@
         <w:rPr>
           <w:b/>
         </w:rPr>
-        <w:t>Gathering — Pack Shakedown</w:t>
-      </w:r>
-    </w:p>
-    <w:p>
-      <w:pPr>
-        <w:spacing w:after="20"/>
-        <w:numPr>
-          <w:ilvl w:val="0"/>
-          <w:numId w:val="63"/>
-        </w:numPr>
-      </w:pPr>
-      <w:r>
-        <w:t>Lay out real gear plus a few silly extras.</w:t>
-      </w:r>
-    </w:p>
-    <w:p>
-      <w:pPr>
-        <w:spacing w:after="20"/>
-        <w:numPr>
-          <w:ilvl w:val="0"/>
-          <w:numId w:val="63"/>
-        </w:numPr>
-      </w:pPr>
-      <w:r>
-        <w:t>Scouts sort what belongs in a day pack, overnight bag, patrol gear, or leave at home.</w:t>
-      </w:r>
-    </w:p>
-    <w:p>
-      <w:pPr>
-        <w:spacing w:after="20"/>
-        <w:numPr>
-          <w:ilvl w:val="0"/>
-          <w:numId w:val="63"/>
-        </w:numPr>
-      </w:pPr>
-      <w:r>
-        <w:t>Patrol leader asks each Scout to explain one choice.</w:t>
-      </w:r>
-    </w:p>
-    <w:p>
-      <w:pPr>
-        <w:spacing w:after="20"/>
-      </w:pPr>
-      <w:r>
-        <w:rPr>
-          <w:b/>
-        </w:rPr>
-        <w:t>Opening — Opening Ceremony</w:t>
-      </w:r>
-    </w:p>
-    <w:p>
-      <w:pPr>
-        <w:spacing w:after="20"/>
-        <w:numPr>
-          <w:ilvl w:val="0"/>
-          <w:numId w:val="64"/>
-        </w:numPr>
-      </w:pPr>
-      <w:r>
-        <w:t>Form up in a horseshoe or circle. Ask a Scout to lead the Pledge of Allegiance to the flag.</w:t>
-      </w:r>
-    </w:p>
-    <w:p>
-      <w:pPr>
-        <w:spacing w:after="20"/>
-        <w:numPr>
-          <w:ilvl w:val="0"/>
-          <w:numId w:val="64"/>
-        </w:numPr>
-      </w:pPr>
-      <w:r>
-        <w:t>Everyone gives the Cub Scout sign and recites the Scout Oath together.</w:t>
-      </w:r>
-    </w:p>
-    <w:p>
-      <w:pPr>
-        <w:spacing w:after="20"/>
-        <w:numPr>
-          <w:ilvl w:val="0"/>
-          <w:numId w:val="64"/>
-        </w:numPr>
-      </w:pPr>
-      <w:r>
-        <w:t>Recite the Scout Law together. Younger dens may say it line-by-line after the Den Chief.</w:t>
-      </w:r>
-    </w:p>
-    <w:p>
-      <w:pPr>
-        <w:spacing w:after="20"/>
-      </w:pPr>
-      <w:r>
-        <w:rPr>
-          <w:b/>
-        </w:rPr>
-        <w:t>Activity — Essentials and Overnight Gear</w:t>
+        <w:t>Gathering — Safety Circle Setup</w:t>
       </w:r>
     </w:p>
     <w:p>
@@ -5096,7 +5184,7 @@
         </w:numPr>
       </w:pPr>
       <w:r>
-        <w:t>Review the Scout Basic Essentials and why each matters on a campout.</w:t>
+        <w:t>Scouts use arm's-length spacing to find safe work spots as they arrive.</w:t>
       </w:r>
     </w:p>
     <w:p>
@@ -5108,7 +5196,7 @@
         </w:numPr>
       </w:pPr>
       <w:r>
-        <w:t>Scouts build a personal packing list including tent/sleeping gear and how they will carry it.</w:t>
+        <w:t>Den Chief checks each circle before any knife or trainer comes out.</w:t>
       </w:r>
     </w:p>
     <w:p>
@@ -5120,19 +5208,7 @@
         </w:numPr>
       </w:pPr>
       <w:r>
-        <w:t>Discuss what is personal gear versus patrol gear.</w:t>
-      </w:r>
-    </w:p>
-    <w:p>
-      <w:pPr>
-        <w:spacing w:after="40"/>
-      </w:pPr>
-      <w:r>
-        <w:rPr>
-          <w:i/>
-          <w:sz w:val="18"/>
-        </w:rPr>
-        <w:t>Needs: packing checklist, pencils, sample gear</w:t>
+        <w:t>Patrol leader posts the stop signal and cleanup command.</w:t>
       </w:r>
     </w:p>
     <w:p>
@@ -5143,7 +5219,7 @@
         <w:rPr>
           <w:b/>
         </w:rPr>
-        <w:t>Activity — SAFE Campout Plan</w:t>
+        <w:t>Opening — Opening Ceremony</w:t>
       </w:r>
     </w:p>
     <w:p>
@@ -5155,7 +5231,7 @@
         </w:numPr>
       </w:pPr>
       <w:r>
-        <w:t>Review the four points of the BSA SAFE Checklist and apply each to the March campout.</w:t>
+        <w:t>Form up in a horseshoe or circle. Ask a Scout to lead the Pledge of Allegiance to the flag.</w:t>
       </w:r>
     </w:p>
     <w:p>
@@ -5167,7 +5243,7 @@
         </w:numPr>
       </w:pPr>
       <w:r>
-        <w:t>Identify weather, buddy system, adult supervision, medical forms, cooking, and fire boundaries.</w:t>
+        <w:t>Everyone gives the Cub Scout sign and recites the Scout Oath together.</w:t>
       </w:r>
     </w:p>
     <w:p>
@@ -5179,19 +5255,7 @@
         </w:numPr>
       </w:pPr>
       <w:r>
-        <w:t>Patrol leader records questions to ask the campout coordinator.</w:t>
-      </w:r>
-    </w:p>
-    <w:p>
-      <w:pPr>
-        <w:spacing w:after="40"/>
-      </w:pPr>
-      <w:r>
-        <w:rPr>
-          <w:i/>
-          <w:sz w:val="18"/>
-        </w:rPr>
-        <w:t>Needs: BSA SAFE Checklist, chart paper, markers</w:t>
+        <w:t>Recite the Scout Law together. Younger dens may say it line-by-line after the Den Chief.</w:t>
       </w:r>
     </w:p>
     <w:p>
@@ -5202,7 +5266,7 @@
         <w:rPr>
           <w:b/>
         </w:rPr>
-        <w:t>Activity — Map and Campsite Layout</w:t>
+        <w:t>Activity — Cub Scout Knife Safety Rules</w:t>
       </w:r>
     </w:p>
     <w:p>
@@ -5214,7 +5278,7 @@
         </w:numPr>
       </w:pPr>
       <w:r>
-        <w:t>Locate the camp and campsite on a map or printed camp map.</w:t>
+        <w:t>Read the rules together and have Scouts explain each one in their own words.</w:t>
       </w:r>
     </w:p>
     <w:p>
@@ -5226,7 +5290,7 @@
         </w:numPr>
       </w:pPr>
       <w:r>
-        <w:t>Sketch where kitchen, eating area, tents, firepit, handwash, and trash should go.</w:t>
+        <w:t>Each Scout makes the promise to follow the rules before handling a knife.</w:t>
       </w:r>
     </w:p>
     <w:p>
@@ -5238,7 +5302,7 @@
         </w:numPr>
       </w:pPr>
       <w:r>
-        <w:t>Agree that patrol gear setup comes before personal tents on arrival.</w:t>
+        <w:t>Review when a knife is a tool, not a toy, and when it must be closed and put away.</w:t>
       </w:r>
     </w:p>
     <w:p>
@@ -5250,7 +5314,7 @@
           <w:i/>
           <w:sz w:val="18"/>
         </w:rPr>
-        <w:t>Needs: camp map, printed site map or blank paper, markers</w:t>
+        <w:t>Needs: printed Cub Scout Knife Safety Rules, pencils</w:t>
       </w:r>
     </w:p>
     <w:p>
@@ -5261,7 +5325,7 @@
         <w:rPr>
           <w:b/>
         </w:rPr>
-        <w:t>Closing — Closing Ceremony - the Living Circle</w:t>
+        <w:t>Activity — Knife Care and Handling Lab</w:t>
       </w:r>
     </w:p>
     <w:p>
@@ -5273,7 +5337,7 @@
         </w:numPr>
       </w:pPr>
       <w:r>
-        <w:t>Form a circle. Everyone puts their left hand toward the center, little fingers linked to the next Scout.</w:t>
+        <w:t>Demonstrate opening, closing, passing, carrying, and storing a pocketknife safely using EDGE.</w:t>
       </w:r>
     </w:p>
     <w:p>
@@ -5285,7 +5349,7 @@
         </w:numPr>
       </w:pPr>
       <w:r>
-        <w:t>Den Chief shares a 1-sentence thought tied to tonight (e.g., 'Tonight we practiced being Helpful.').</w:t>
+        <w:t>Scouts practice first with trainer knives or closed knives, then with approved knives under close supervision.</w:t>
       </w:r>
     </w:p>
     <w:p>
@@ -5297,6 +5361,65 @@
         </w:numPr>
       </w:pPr>
       <w:r>
+        <w:t>Show basic care: clean, dry, sharp enough to be safe, and stored closed.</w:t>
+      </w:r>
+    </w:p>
+    <w:p>
+      <w:pPr>
+        <w:spacing w:after="40"/>
+      </w:pPr>
+      <w:r>
+        <w:rPr>
+          <w:i/>
+          <w:sz w:val="18"/>
+        </w:rPr>
+        <w:t>Needs: trainer knives or approved pocketknives, work gloves if desired, clean cloth, small sharpening stone for demo only</w:t>
+      </w:r>
+    </w:p>
+    <w:p>
+      <w:pPr>
+        <w:spacing w:after="20"/>
+      </w:pPr>
+      <w:r>
+        <w:rPr>
+          <w:b/>
+        </w:rPr>
+        <w:t>Closing — Closing Ceremony - the Living Circle</w:t>
+      </w:r>
+    </w:p>
+    <w:p>
+      <w:pPr>
+        <w:spacing w:after="20"/>
+        <w:numPr>
+          <w:ilvl w:val="0"/>
+          <w:numId w:val="69"/>
+        </w:numPr>
+      </w:pPr>
+      <w:r>
+        <w:t>Form a circle. Everyone puts their left hand toward the center, little fingers linked to the next Scout.</w:t>
+      </w:r>
+    </w:p>
+    <w:p>
+      <w:pPr>
+        <w:spacing w:after="20"/>
+        <w:numPr>
+          <w:ilvl w:val="0"/>
+          <w:numId w:val="69"/>
+        </w:numPr>
+      </w:pPr>
+      <w:r>
+        <w:t>Den Chief shares a 1-sentence thought tied to tonight (e.g., 'Tonight we practiced being Helpful.').</w:t>
+      </w:r>
+    </w:p>
+    <w:p>
+      <w:pPr>
+        <w:spacing w:after="20"/>
+        <w:numPr>
+          <w:ilvl w:val="0"/>
+          <w:numId w:val="69"/>
+        </w:numPr>
+      </w:pPr>
+      <w:r>
         <w:t>On the Den Chief's signal, everyone raises the circle and gives a quiet 'Do Your Best!' Dismiss.</w:t>
       </w:r>
     </w:p>
@@ -5316,7 +5439,7 @@
         <w:pStyle w:val="ListBullet"/>
       </w:pPr>
       <w:r>
-        <w:t>Pack for the March 5-7 spring campout using tonight's checklist.</w:t>
+        <w:t>Tell families whether Scouts may bring an approved pocketknife next time and what supervision rules apply.</w:t>
       </w:r>
     </w:p>
     <w:p>
@@ -5324,7 +5447,7 @@
         <w:pStyle w:val="ListBullet"/>
       </w:pPr>
       <w:r>
-        <w:t>Bring weather layers, sleeping gear, water bottle, and any required forms.</w:t>
+        <w:t>This is enrichment - it also front-loads the Scouts BSA Totin' Chip.</w:t>
       </w:r>
     </w:p>
     <w:p>
@@ -5338,7 +5461,7 @@
         <w:t xml:space="preserve">Den Chief tip: </w:t>
       </w:r>
       <w:r>
-        <w:t>S1 is Thu Mar 4, right before the campout. Keep it practical: gear check, safety plan, map, and patrol jobs.</w:t>
+        <w:t>Follow pack policy, Guide to Safe Scouting, and local rules. Maintain tight supervision and stop immediately for unsafe behavior. Purely optional after crossover.</w:t>
       </w:r>
     </w:p>
     <w:p>
@@ -5351,7 +5474,7 @@
           <w:color w:val="5B2A86"/>
           <w:sz w:val="25"/>
         </w:rPr>
-        <w:t>Thu Mar 18  —  Campout Debrief and Outdoor Ethics</w:t>
+        <w:t>Thu Mar 18  —  Whittle a Useful Object (optional)</w:t>
       </w:r>
     </w:p>
     <w:p>
@@ -5365,7 +5488,7 @@
         <w:t xml:space="preserve">Focus: </w:t>
       </w:r>
       <w:r>
-        <w:t>Debrief the campout and connect campsite choices, sanitation, Outdoor Code, and Leave No Trace.</w:t>
+        <w:t>Use a pocketknife to make a useful object and choose the correct cooking knife for slice, chop, and mince.</w:t>
       </w:r>
     </w:p>
     <w:p>
@@ -5384,7 +5507,7 @@
         <w:pStyle w:val="ListBullet"/>
       </w:pPr>
       <w:r>
-        <w:t>Outdoor Adventurer 5 (Participated in campout - outing)</w:t>
+        <w:t>Optional elective - Knife Safety 4 (Make a useful object)</w:t>
       </w:r>
     </w:p>
     <w:p>
@@ -5392,23 +5515,7 @@
         <w:pStyle w:val="ListBullet"/>
       </w:pPr>
       <w:r>
-        <w:t>Outdoor Adventurer 6 (Campsite setup and patrol gear - outing)</w:t>
-      </w:r>
-    </w:p>
-    <w:p>
-      <w:pPr>
-        <w:pStyle w:val="ListBullet"/>
-      </w:pPr>
-      <w:r>
-        <w:t>Outdoor Adventurer 7 (Food safety/kitchen sanitation - outing)</w:t>
-      </w:r>
-    </w:p>
-    <w:p>
-      <w:pPr>
-        <w:pStyle w:val="ListBullet"/>
-      </w:pPr>
-      <w:r>
-        <w:t>Outdoor Adventurer 8 (Discuss what went well/differently; Outdoor Code and Leave No Trace Principles for Kids)</w:t>
+        <w:t>Knife Safety 5 (Correct cooking knife; slice, chop, mince)</w:t>
       </w:r>
     </w:p>
     <w:p>
@@ -5424,7 +5531,7 @@
     </w:p>
     <w:p>
       <w:r>
-        <w:t>chart paper, markers, service/campout attendance notes, Outdoor Code card, Leave No Trace Principles for Kids cards</w:t>
+        <w:t>approved pocketknives, soft wood blanks or sticks, cut-resistant gloves if available, drop cloth, first-aid kit, cutting boards, paring knife, chef's knife, serrated knife, soft foods such as bananas, cucumbers, or herbs, sanitizer and paper towels</w:t>
       </w:r>
     </w:p>
     <w:p>
@@ -5435,54 +5542,7 @@
         <w:rPr>
           <w:b/>
         </w:rPr>
-        <w:t>Gathering — Campout Photo Sort</w:t>
-      </w:r>
-    </w:p>
-    <w:p>
-      <w:pPr>
-        <w:spacing w:after="20"/>
-        <w:numPr>
-          <w:ilvl w:val="0"/>
-          <w:numId w:val="69"/>
-        </w:numPr>
-      </w:pPr>
-      <w:r>
-        <w:t>Post campout photos or written moments: setup, cooking, campfire, cleanup, weather, sleep.</w:t>
-      </w:r>
-    </w:p>
-    <w:p>
-      <w:pPr>
-        <w:spacing w:after="20"/>
-        <w:numPr>
-          <w:ilvl w:val="0"/>
-          <w:numId w:val="69"/>
-        </w:numPr>
-      </w:pPr>
-      <w:r>
-        <w:t>Scouts add sticky notes: went well, change next time, or question.</w:t>
-      </w:r>
-    </w:p>
-    <w:p>
-      <w:pPr>
-        <w:spacing w:after="20"/>
-        <w:numPr>
-          <w:ilvl w:val="0"/>
-          <w:numId w:val="69"/>
-        </w:numPr>
-      </w:pPr>
-      <w:r>
-        <w:t>Patrol leader chooses three notes to start the debrief.</w:t>
-      </w:r>
-    </w:p>
-    <w:p>
-      <w:pPr>
-        <w:spacing w:after="20"/>
-      </w:pPr>
-      <w:r>
-        <w:rPr>
-          <w:b/>
-        </w:rPr>
-        <w:t>Opening — Opening Ceremony</w:t>
+        <w:t>Gathering — Edge-Away Review</w:t>
       </w:r>
     </w:p>
     <w:p>
@@ -5494,7 +5554,7 @@
         </w:numPr>
       </w:pPr>
       <w:r>
-        <w:t>Form up in a horseshoe or circle. Ask a Scout to lead the Pledge of Allegiance to the flag.</w:t>
+        <w:t>Scouts demonstrate their safety circle with closed knives or trainers.</w:t>
       </w:r>
     </w:p>
     <w:p>
@@ -5506,7 +5566,7 @@
         </w:numPr>
       </w:pPr>
       <w:r>
-        <w:t>Everyone gives the Cub Scout sign and recites the Scout Oath together.</w:t>
+        <w:t>Patrol leader asks the group to name the top three rules before work begins.</w:t>
       </w:r>
     </w:p>
     <w:p>
@@ -5518,7 +5578,7 @@
         </w:numPr>
       </w:pPr>
       <w:r>
-        <w:t>Recite the Scout Law together. Younger dens may say it line-by-line after the Den Chief.</w:t>
+        <w:t>Anyone who cannot state the rules observes until coached.</w:t>
       </w:r>
     </w:p>
     <w:p>
@@ -5529,7 +5589,7 @@
         <w:rPr>
           <w:b/>
         </w:rPr>
-        <w:t>Activity — Start-Stop-Continue Debrief</w:t>
+        <w:t>Opening — Opening Ceremony</w:t>
       </w:r>
     </w:p>
     <w:p>
@@ -5541,7 +5601,7 @@
         </w:numPr>
       </w:pPr>
       <w:r>
-        <w:t>Discuss what went well, what the patrol would do differently, and what to keep doing next campout.</w:t>
+        <w:t>Form up in a horseshoe or circle. Ask a Scout to lead the Pledge of Allegiance to the flag.</w:t>
       </w:r>
     </w:p>
     <w:p>
@@ -5553,7 +5613,7 @@
         </w:numPr>
       </w:pPr>
       <w:r>
-        <w:t>Review whether patrol gear was set before personal tents and how the kitchen stayed sanitary.</w:t>
+        <w:t>Everyone gives the Cub Scout sign and recites the Scout Oath together.</w:t>
       </w:r>
     </w:p>
     <w:p>
@@ -5565,19 +5625,7 @@
         </w:numPr>
       </w:pPr>
       <w:r>
-        <w:t>Record one patrol improvement goal for Scouts BSA crossover.</w:t>
-      </w:r>
-    </w:p>
-    <w:p>
-      <w:pPr>
-        <w:spacing w:after="40"/>
-      </w:pPr>
-      <w:r>
-        <w:rPr>
-          <w:i/>
-          <w:sz w:val="18"/>
-        </w:rPr>
-        <w:t>Needs: chart paper, markers, service/campout attendance notes</w:t>
+        <w:t>Recite the Scout Law together. Younger dens may say it line-by-line after the Den Chief.</w:t>
       </w:r>
     </w:p>
     <w:p>
@@ -5588,7 +5636,7 @@
         <w:rPr>
           <w:b/>
         </w:rPr>
-        <w:t>Activity — Outdoor Code and Leave No Trace</w:t>
+        <w:t>Activity — Whittle a Useful Object</w:t>
       </w:r>
     </w:p>
     <w:p>
@@ -5600,7 +5648,7 @@
         </w:numPr>
       </w:pPr>
       <w:r>
-        <w:t>Read the Outdoor Code and Leave No Trace Principles for Kids in Scout-led sections.</w:t>
+        <w:t>Choose a simple useful object: tent stake, fuzz stick, pot scraper, or labeled garden marker.</w:t>
       </w:r>
     </w:p>
     <w:p>
@@ -5612,7 +5660,7 @@
         </w:numPr>
       </w:pPr>
       <w:r>
-        <w:t>Scouts match each principle to something that happened at the campout.</w:t>
+        <w:t>Scouts whittle away from themselves inside safety circles with adult/Den Chief coaching.</w:t>
       </w:r>
     </w:p>
     <w:p>
@@ -5624,7 +5672,7 @@
         </w:numPr>
       </w:pPr>
       <w:r>
-        <w:t>Patrol leader leads a final pledge for the next outdoor activity.</w:t>
+        <w:t>Stop, close knives, clean the area, and have each Scout explain what they made.</w:t>
       </w:r>
     </w:p>
     <w:p>
@@ -5636,7 +5684,7 @@
           <w:i/>
           <w:sz w:val="18"/>
         </w:rPr>
-        <w:t>Needs: Outdoor Code card, Leave No Trace Principles for Kids cards</w:t>
+        <w:t>Needs: approved pocketknives, soft wood blanks or sticks, cut-resistant gloves if available, drop cloth, first-aid kit</w:t>
       </w:r>
     </w:p>
     <w:p>
@@ -5647,7 +5695,7 @@
         <w:rPr>
           <w:b/>
         </w:rPr>
-        <w:t>Closing — Closing Ceremony - the Living Circle</w:t>
+        <w:t>Activity — Camp Kitchen Knife Skills</w:t>
       </w:r>
     </w:p>
     <w:p>
@@ -5659,7 +5707,7 @@
         </w:numPr>
       </w:pPr>
       <w:r>
-        <w:t>Form a circle. Everyone puts their left hand toward the center, little fingers linked to the next Scout.</w:t>
+        <w:t>Show which cooking knife fits each job: paring, chef's knife, or serrated knife.</w:t>
       </w:r>
     </w:p>
     <w:p>
@@ -5671,7 +5719,7 @@
         </w:numPr>
       </w:pPr>
       <w:r>
-        <w:t>Den Chief shares a 1-sentence thought tied to tonight (e.g., 'Tonight we practiced being Helpful.').</w:t>
+        <w:t>Scouts demonstrate slice, chop, and mince on soft foods using claw-hand technique.</w:t>
       </w:r>
     </w:p>
     <w:p>
@@ -5683,6 +5731,65 @@
         </w:numPr>
       </w:pPr>
       <w:r>
+        <w:t>Use the cut food in a simple camp snack if time allows.</w:t>
+      </w:r>
+    </w:p>
+    <w:p>
+      <w:pPr>
+        <w:spacing w:after="40"/>
+      </w:pPr>
+      <w:r>
+        <w:rPr>
+          <w:i/>
+          <w:sz w:val="18"/>
+        </w:rPr>
+        <w:t>Needs: cutting boards, paring knife, chef's knife, serrated knife, soft foods such as bananas, cucumbers, or herbs, sanitizer and paper towels</w:t>
+      </w:r>
+    </w:p>
+    <w:p>
+      <w:pPr>
+        <w:spacing w:after="20"/>
+      </w:pPr>
+      <w:r>
+        <w:rPr>
+          <w:b/>
+        </w:rPr>
+        <w:t>Closing — Closing Ceremony - the Living Circle</w:t>
+      </w:r>
+    </w:p>
+    <w:p>
+      <w:pPr>
+        <w:spacing w:after="20"/>
+        <w:numPr>
+          <w:ilvl w:val="0"/>
+          <w:numId w:val="74"/>
+        </w:numPr>
+      </w:pPr>
+      <w:r>
+        <w:t>Form a circle. Everyone puts their left hand toward the center, little fingers linked to the next Scout.</w:t>
+      </w:r>
+    </w:p>
+    <w:p>
+      <w:pPr>
+        <w:spacing w:after="20"/>
+        <w:numPr>
+          <w:ilvl w:val="0"/>
+          <w:numId w:val="74"/>
+        </w:numPr>
+      </w:pPr>
+      <w:r>
+        <w:t>Den Chief shares a 1-sentence thought tied to tonight (e.g., 'Tonight we practiced being Helpful.').</w:t>
+      </w:r>
+    </w:p>
+    <w:p>
+      <w:pPr>
+        <w:spacing w:after="20"/>
+        <w:numPr>
+          <w:ilvl w:val="0"/>
+          <w:numId w:val="74"/>
+        </w:numPr>
+      </w:pPr>
+      <w:r>
         <w:t>On the Den Chief's signal, everyone raises the circle and gives a quiet 'Do Your Best!' Dismiss.</w:t>
       </w:r>
     </w:p>
@@ -5702,7 +5809,15 @@
         <w:pStyle w:val="ListBullet"/>
       </w:pPr>
       <w:r>
-        <w:t>Air out and store gear. Thank the adult who helped you get to the campout.</w:t>
+        <w:t>Keep practicing safe knife habits in your new Scouts BSA troop.</w:t>
+      </w:r>
+    </w:p>
+    <w:p>
+      <w:pPr>
+        <w:pStyle w:val="ListBullet"/>
+      </w:pPr>
+      <w:r>
+        <w:t>Ask your troop about earning the Totin' Chip.</w:t>
       </w:r>
     </w:p>
     <w:p>
@@ -5716,7 +5831,7 @@
         <w:t xml:space="preserve">Den Chief tip: </w:t>
       </w:r>
       <w:r>
-        <w:t>If a Scout missed the campout, schedule a make-up overnight with family, patrol, pack, or troop before awards.</w:t>
+        <w:t>Optional enrichment only. If most Scouts have moved fully to their troop, run this as a combined bridging activity or skip it.</w:t>
       </w:r>
     </w:p>
     <w:p>
@@ -5730,7 +5845,7 @@
         <w:t xml:space="preserve">Flex week idea: </w:t>
       </w:r>
       <w:r>
-        <w:t>Mar 11 (Roundtable): gear cleanup, campout make-up planning, or a patrol cooking/cleanup challenge after the spring campout.</w:t>
+        <w:t>Mar 11 (Roundtable): optional - AOL alumni help lead a Webelos or younger-den activity, or hold a patrol reunion cookout.</w:t>
       </w:r>
     </w:p>
     <w:p>
@@ -5743,7 +5858,7 @@
           <w:color w:val="5B2A86"/>
           <w:sz w:val="28"/>
         </w:rPr>
-        <w:t>April 2027: Knife Safety (elective) + Catch-Up</w:t>
+        <w:t>April 2027: Crossed Over - Mentor &amp; Celebrate</w:t>
       </w:r>
     </w:p>
     <w:p>
@@ -5751,7 +5866,7 @@
         <w:rPr>
           <w:i/>
         </w:rPr>
-        <w:t>Use April as a buffer to finish any incomplete required adventures before the April 29 End-of-Year Awards and crossover, while adding a fun crossover skill: safe knife use.</w:t>
+        <w:t>AOL Scouts have crossed over into their Scouts BSA troop. No required work remains. If they stay connected to the pack through the school year, use these slots to mentor younger dens and celebrate at the End-of-Year Awards on April 29.</w:t>
       </w:r>
     </w:p>
     <w:tbl>
@@ -5843,7 +5958,7 @@
         <w:pStyle w:val="ListBullet"/>
       </w:pPr>
       <w:r>
-        <w:t>Any AOL missing Bobcat, First Aid, Personal Fitness, Citizenship, Duty to God, or Outdoor Adventurer requirements should finish make-ups before the April 29 awards and crossover.</w:t>
+        <w:t>Nothing required. New Scouts should be attending their troop meetings; returning to help the pack is a bonus Good Turn.</w:t>
       </w:r>
     </w:p>
     <w:p>
@@ -5856,7 +5971,7 @@
           <w:color w:val="5B2A86"/>
           <w:sz w:val="25"/>
         </w:rPr>
-        <w:t>Thu Apr 8  —  Knife Rules and Safety Circle</w:t>
+        <w:t>Thu Apr 8  —  Mentor a Younger Den (optional)</w:t>
       </w:r>
     </w:p>
     <w:p>
@@ -5870,7 +5985,7 @@
         <w:t xml:space="preserve">Focus: </w:t>
       </w:r>
       <w:r>
-        <w:t>Read and promise to follow the Cub Scout Knife Safety Rules; practice safety circle, care, and handling.</w:t>
+        <w:t>Give back: crossed-over Scouts return to lead a game or skill for a younger den.</w:t>
       </w:r>
     </w:p>
     <w:p>
@@ -5889,23 +6004,7 @@
         <w:pStyle w:val="ListBullet"/>
       </w:pPr>
       <w:r>
-        <w:t>Knife Safety 1 (Read, understand, and promise to follow Cub Scout Knife Safety Rules)</w:t>
-      </w:r>
-    </w:p>
-    <w:p>
-      <w:pPr>
-        <w:pStyle w:val="ListBullet"/>
-      </w:pPr>
-      <w:r>
-        <w:t>Knife Safety 2 (Demonstrate knife safety circle)</w:t>
-      </w:r>
-    </w:p>
-    <w:p>
-      <w:pPr>
-        <w:pStyle w:val="ListBullet"/>
-      </w:pPr>
-      <w:r>
-        <w:t>Knife Safety 3 (Care for and use a knife safely)</w:t>
+        <w:t>No required adventure - leadership/service bonus</w:t>
       </w:r>
     </w:p>
     <w:p>
@@ -5921,7 +6020,7 @@
     </w:p>
     <w:p>
       <w:r>
-        <w:t>printed Cub Scout Knife Safety Rules, pencils, trainer knives or approved pocketknives, work gloves if desired, clean cloth, small sharpening stone for demo only</w:t>
+        <w:t>chosen station supplies</w:t>
       </w:r>
     </w:p>
     <w:p>
@@ -5932,54 +6031,7 @@
         <w:rPr>
           <w:b/>
         </w:rPr>
-        <w:t>Gathering — Safety Circle Setup</w:t>
-      </w:r>
-    </w:p>
-    <w:p>
-      <w:pPr>
-        <w:spacing w:after="20"/>
-        <w:numPr>
-          <w:ilvl w:val="0"/>
-          <w:numId w:val="74"/>
-        </w:numPr>
-      </w:pPr>
-      <w:r>
-        <w:t>Scouts use arm's-length spacing to find safe work spots as they arrive.</w:t>
-      </w:r>
-    </w:p>
-    <w:p>
-      <w:pPr>
-        <w:spacing w:after="20"/>
-        <w:numPr>
-          <w:ilvl w:val="0"/>
-          <w:numId w:val="74"/>
-        </w:numPr>
-      </w:pPr>
-      <w:r>
-        <w:t>Den Chief checks each circle before any knife or trainer comes out.</w:t>
-      </w:r>
-    </w:p>
-    <w:p>
-      <w:pPr>
-        <w:spacing w:after="20"/>
-        <w:numPr>
-          <w:ilvl w:val="0"/>
-          <w:numId w:val="74"/>
-        </w:numPr>
-      </w:pPr>
-      <w:r>
-        <w:t>Patrol leader posts the stop signal and cleanup command.</w:t>
-      </w:r>
-    </w:p>
-    <w:p>
-      <w:pPr>
-        <w:spacing w:after="20"/>
-      </w:pPr>
-      <w:r>
-        <w:rPr>
-          <w:b/>
-        </w:rPr>
-        <w:t>Opening — Opening Ceremony</w:t>
+        <w:t>Gathering — Leader's Huddle</w:t>
       </w:r>
     </w:p>
     <w:p>
@@ -5991,7 +6043,7 @@
         </w:numPr>
       </w:pPr>
       <w:r>
-        <w:t>Form up in a horseshoe or circle. Ask a Scout to lead the Pledge of Allegiance to the flag.</w:t>
+        <w:t>Returning Scouts pick which younger den they will help and what they will teach.</w:t>
       </w:r>
     </w:p>
     <w:p>
@@ -6003,7 +6055,7 @@
         </w:numPr>
       </w:pPr>
       <w:r>
-        <w:t>Everyone gives the Cub Scout sign and recites the Scout Oath together.</w:t>
+        <w:t>Plan a 10-minute game or skill (knots, first aid, an active game).</w:t>
       </w:r>
     </w:p>
     <w:p>
@@ -6015,7 +6067,7 @@
         </w:numPr>
       </w:pPr>
       <w:r>
-        <w:t>Recite the Scout Law together. Younger dens may say it line-by-line after the Den Chief.</w:t>
+        <w:t>Assign who leads, who demos, and who encourages.</w:t>
       </w:r>
     </w:p>
     <w:p>
@@ -6026,7 +6078,7 @@
         <w:rPr>
           <w:b/>
         </w:rPr>
-        <w:t>Activity — Cub Scout Knife Safety Rules</w:t>
+        <w:t>Opening — Opening Ceremony</w:t>
       </w:r>
     </w:p>
     <w:p>
@@ -6038,7 +6090,7 @@
         </w:numPr>
       </w:pPr>
       <w:r>
-        <w:t>Read the rules together and have Scouts explain each one in their own words.</w:t>
+        <w:t>Form up in a horseshoe or circle. Ask a Scout to lead the Pledge of Allegiance to the flag.</w:t>
       </w:r>
     </w:p>
     <w:p>
@@ -6050,7 +6102,7 @@
         </w:numPr>
       </w:pPr>
       <w:r>
-        <w:t>Each Scout makes the promise to follow the rules before handling a knife.</w:t>
+        <w:t>Everyone gives the Cub Scout sign and recites the Scout Oath together.</w:t>
       </w:r>
     </w:p>
     <w:p>
@@ -6062,19 +6114,7 @@
         </w:numPr>
       </w:pPr>
       <w:r>
-        <w:t>Review when a knife is a tool, not a toy, and when it must be closed and put away.</w:t>
-      </w:r>
-    </w:p>
-    <w:p>
-      <w:pPr>
-        <w:spacing w:after="40"/>
-      </w:pPr>
-      <w:r>
-        <w:rPr>
-          <w:i/>
-          <w:sz w:val="18"/>
-        </w:rPr>
-        <w:t>Needs: printed Cub Scout Knife Safety Rules, pencils</w:t>
+        <w:t>Recite the Scout Law together. Younger dens may say it line-by-line after the Den Chief.</w:t>
       </w:r>
     </w:p>
     <w:p>
@@ -6085,7 +6125,7 @@
         <w:rPr>
           <w:b/>
         </w:rPr>
-        <w:t>Activity — Knife Care and Handling Lab</w:t>
+        <w:t>Activity — Lead a Station</w:t>
       </w:r>
     </w:p>
     <w:p>
@@ -6097,7 +6137,7 @@
         </w:numPr>
       </w:pPr>
       <w:r>
-        <w:t>Demonstrate opening, closing, passing, carrying, and storing a pocketknife safely using EDGE.</w:t>
+        <w:t>Run the planned game or skill for a Lion, Tiger, Wolf, Bear, or Webelos den using EDGE.</w:t>
       </w:r>
     </w:p>
     <w:p>
@@ -6109,7 +6149,7 @@
         </w:numPr>
       </w:pPr>
       <w:r>
-        <w:t>Scouts practice first with trainer knives or closed knives, then with approved knives under close supervision.</w:t>
+        <w:t>Model the Scout Oath and Law for the younger Scouts who look up to you.</w:t>
       </w:r>
     </w:p>
     <w:p>
@@ -6121,7 +6161,7 @@
         </w:numPr>
       </w:pPr>
       <w:r>
-        <w:t>Show basic care: clean, dry, sharp enough to be safe, and stored closed.</w:t>
+        <w:t>Debrief: what went well leading younger kids, and how does it feel to be the example?</w:t>
       </w:r>
     </w:p>
     <w:p>
@@ -6133,7 +6173,7 @@
           <w:i/>
           <w:sz w:val="18"/>
         </w:rPr>
-        <w:t>Needs: trainer knives or approved pocketknives, work gloves if desired, clean cloth, small sharpening stone for demo only</w:t>
+        <w:t>Needs: chosen station supplies</w:t>
       </w:r>
     </w:p>
     <w:p>
@@ -6199,7 +6239,7 @@
         <w:pStyle w:val="ListBullet"/>
       </w:pPr>
       <w:r>
-        <w:t>Tell families whether Scouts may bring an approved pocketknife next time and what supervision rules apply.</w:t>
+        <w:t>Keep showing up for your troop first; help the pack when you can.</w:t>
       </w:r>
     </w:p>
     <w:p>
@@ -6207,7 +6247,7 @@
         <w:pStyle w:val="ListBullet"/>
       </w:pPr>
       <w:r>
-        <w:t>Check Scoutbook for any missing required-adventure items.</w:t>
+        <w:t>Invite your family to the April 29 End-of-Year Awards.</w:t>
       </w:r>
     </w:p>
     <w:p>
@@ -6221,7 +6261,7 @@
         <w:t xml:space="preserve">Den Chief tip: </w:t>
       </w:r>
       <w:r>
-        <w:t>Follow pack policy, Guide to Safe Scouting, and local rules. Maintain tight supervision and stop immediately for unsafe behavior.</w:t>
+        <w:t>Purely optional. This is a beautiful way for new Scouts to stay connected and for the pack to see where Cub Scouting leads.</w:t>
       </w:r>
     </w:p>
     <w:p>
@@ -6234,7 +6274,7 @@
           <w:color w:val="5B2A86"/>
           <w:sz w:val="25"/>
         </w:rPr>
-        <w:t>Thu Apr 22  —  Whittle a Useful Object and Kitchen Cuts</w:t>
+        <w:t>Thu Apr 22  —  End-of-Year Send-Off (optional)</w:t>
       </w:r>
     </w:p>
     <w:p>
@@ -6248,7 +6288,7 @@
         <w:t xml:space="preserve">Focus: </w:t>
       </w:r>
       <w:r>
-        <w:t>Use a pocketknife to make a useful object and choose the correct cooking knife for slice, chop, and mince.</w:t>
+        <w:t>Celebrate the crossover class at the April 29 pack awards and campfire.</w:t>
       </w:r>
     </w:p>
     <w:p>
@@ -6267,15 +6307,7 @@
         <w:pStyle w:val="ListBullet"/>
       </w:pPr>
       <w:r>
-        <w:t>Knife Safety 4 (Use a pocketknife to make a useful object)</w:t>
-      </w:r>
-    </w:p>
-    <w:p>
-      <w:pPr>
-        <w:pStyle w:val="ListBullet"/>
-      </w:pPr>
-      <w:r>
-        <w:t>Knife Safety 5 (Choose correct cooking knife and demonstrate slice, chop, mince)</w:t>
+        <w:t>No required adventure - celebration</w:t>
       </w:r>
     </w:p>
     <w:p>
@@ -6291,7 +6323,7 @@
     </w:p>
     <w:p>
       <w:r>
-        <w:t>approved pocketknives, soft wood blanks or sticks, cut-resistant gloves if available, drop cloth, first-aid kit, cutting boards, paring knife, chef's knife, serrated knife, soft foods such as bananas, cucumbers, or herbs, sanitizer and paper towels</w:t>
+        <w:t>awards/certificates from the pack, campfire program</w:t>
       </w:r>
     </w:p>
     <w:p>
@@ -6302,7 +6334,7 @@
         <w:rPr>
           <w:b/>
         </w:rPr>
-        <w:t>Gathering — Edge-Away Review</w:t>
+        <w:t>Gathering — Memory Wall</w:t>
       </w:r>
     </w:p>
     <w:p>
@@ -6314,7 +6346,7 @@
         </w:numPr>
       </w:pPr>
       <w:r>
-        <w:t>Scouts demonstrate their safety circle with closed knives or trainers.</w:t>
+        <w:t>Scouts and families post favorite Cub Scout photos or memories.</w:t>
       </w:r>
     </w:p>
     <w:p>
@@ -6326,7 +6358,7 @@
         </w:numPr>
       </w:pPr>
       <w:r>
-        <w:t>Patrol leader asks the group to name the top three rules before work begins.</w:t>
+        <w:t>Each new Scout writes one hope for their Scouts BSA journey.</w:t>
       </w:r>
     </w:p>
     <w:p>
@@ -6338,7 +6370,7 @@
         </w:numPr>
       </w:pPr>
       <w:r>
-        <w:t>Anyone who cannot state the rules observes until coached.</w:t>
+        <w:t>Share a few aloud to open the celebration.</w:t>
       </w:r>
     </w:p>
     <w:p>
@@ -6396,7 +6428,7 @@
         <w:rPr>
           <w:b/>
         </w:rPr>
-        <w:t>Activity — Whittle a Useful Object</w:t>
+        <w:t>Activity — Recognition &amp; Campfire</w:t>
       </w:r>
     </w:p>
     <w:p>
@@ -6408,7 +6440,7 @@
         </w:numPr>
       </w:pPr>
       <w:r>
-        <w:t>Choose a simple useful object: tent stake, fuzz stick, pot scraper, or labeled garden marker.</w:t>
+        <w:t>Recognize the AOL crossover class in front of the pack at the April 29 awards.</w:t>
       </w:r>
     </w:p>
     <w:p>
@@ -6420,7 +6452,7 @@
         </w:numPr>
       </w:pPr>
       <w:r>
-        <w:t>Scouts whittle away from themselves inside safety circles with adult/Den Chief coaching.</w:t>
+        <w:t>New Scouts lead a cheer, skit, or song to model Scout spirit for younger dens.</w:t>
       </w:r>
     </w:p>
     <w:p>
@@ -6432,7 +6464,7 @@
         </w:numPr>
       </w:pPr>
       <w:r>
-        <w:t>Stop, close knives, clean the area, and have each Scout explain what they made.</w:t>
+        <w:t>Close with the Scout Oath and Law led by the crossover class.</w:t>
       </w:r>
     </w:p>
     <w:p>
@@ -6444,7 +6476,7 @@
           <w:i/>
           <w:sz w:val="18"/>
         </w:rPr>
-        <w:t>Needs: approved pocketknives, soft wood blanks or sticks, cut-resistant gloves if available, drop cloth, first-aid kit</w:t>
+        <w:t>Needs: awards/certificates from the pack, campfire program</w:t>
       </w:r>
     </w:p>
     <w:p>
@@ -6455,7 +6487,7 @@
         <w:rPr>
           <w:b/>
         </w:rPr>
-        <w:t>Activity — Camp Kitchen Knife Skills</w:t>
+        <w:t>Closing — Closing Ceremony - the Living Circle</w:t>
       </w:r>
     </w:p>
     <w:p>
@@ -6467,7 +6499,7 @@
         </w:numPr>
       </w:pPr>
       <w:r>
-        <w:t>Show which cooking knife fits each job: paring, chef's knife, or serrated knife.</w:t>
+        <w:t>Form a circle. Everyone puts their left hand toward the center, little fingers linked to the next Scout.</w:t>
       </w:r>
     </w:p>
     <w:p>
@@ -6479,7 +6511,7 @@
         </w:numPr>
       </w:pPr>
       <w:r>
-        <w:t>Scouts demonstrate slice, chop, and mince on soft foods using claw-hand technique.</w:t>
+        <w:t>Den Chief shares a 1-sentence thought tied to tonight (e.g., 'Tonight we practiced being Helpful.').</w:t>
       </w:r>
     </w:p>
     <w:p>
@@ -6491,65 +6523,6 @@
         </w:numPr>
       </w:pPr>
       <w:r>
-        <w:t>Use the cut food in a simple camp snack if time allows.</w:t>
-      </w:r>
-    </w:p>
-    <w:p>
-      <w:pPr>
-        <w:spacing w:after="40"/>
-      </w:pPr>
-      <w:r>
-        <w:rPr>
-          <w:i/>
-          <w:sz w:val="18"/>
-        </w:rPr>
-        <w:t>Needs: cutting boards, paring knife, chef's knife, serrated knife, soft foods such as bananas, cucumbers, or herbs, sanitizer and paper towels</w:t>
-      </w:r>
-    </w:p>
-    <w:p>
-      <w:pPr>
-        <w:spacing w:after="20"/>
-      </w:pPr>
-      <w:r>
-        <w:rPr>
-          <w:b/>
-        </w:rPr>
-        <w:t>Closing — Closing Ceremony - the Living Circle</w:t>
-      </w:r>
-    </w:p>
-    <w:p>
-      <w:pPr>
-        <w:spacing w:after="20"/>
-        <w:numPr>
-          <w:ilvl w:val="0"/>
-          <w:numId w:val="83"/>
-        </w:numPr>
-      </w:pPr>
-      <w:r>
-        <w:t>Form a circle. Everyone puts their left hand toward the center, little fingers linked to the next Scout.</w:t>
-      </w:r>
-    </w:p>
-    <w:p>
-      <w:pPr>
-        <w:spacing w:after="20"/>
-        <w:numPr>
-          <w:ilvl w:val="0"/>
-          <w:numId w:val="83"/>
-        </w:numPr>
-      </w:pPr>
-      <w:r>
-        <w:t>Den Chief shares a 1-sentence thought tied to tonight (e.g., 'Tonight we practiced being Helpful.').</w:t>
-      </w:r>
-    </w:p>
-    <w:p>
-      <w:pPr>
-        <w:spacing w:after="20"/>
-        <w:numPr>
-          <w:ilvl w:val="0"/>
-          <w:numId w:val="83"/>
-        </w:numPr>
-      </w:pPr>
-      <w:r>
         <w:t>On the Den Chief's signal, everyone raises the circle and gives a quiet 'Do Your Best!' Dismiss.</w:t>
       </w:r>
     </w:p>
@@ -6569,15 +6542,7 @@
         <w:pStyle w:val="ListBullet"/>
       </w:pPr>
       <w:r>
-        <w:t>Bring any final make-up evidence before the April 29 End-of-Year Awards and crossover.</w:t>
-      </w:r>
-    </w:p>
-    <w:p>
-      <w:pPr>
-        <w:pStyle w:val="ListBullet"/>
-      </w:pPr>
-      <w:r>
-        <w:t>Celebrate crossing over - keep practicing safe knife habits in Scouts BSA.</w:t>
+        <w:t>Congratulations - you finished Cub Scouting and crossed over! Be Prepared and Do a Good Turn Daily.</w:t>
       </w:r>
     </w:p>
     <w:p>
@@ -6591,7 +6556,7 @@
         <w:t xml:space="preserve">Den Chief tip: </w:t>
       </w:r>
       <w:r>
-        <w:t>April is the safety net. Do not let the fun elective crowd out rank completion checks before awards night.</w:t>
+        <w:t>The April 29 awards are the pack's send-off. Let the new Scouts lead the ceremony pieces - they are the role models now.</w:t>
       </w:r>
     </w:p>
     <w:p>
@@ -6605,7 +6570,7 @@
         <w:t xml:space="preserve">Flex week idea: </w:t>
       </w:r>
       <w:r>
-        <w:t>Apr 15 (Roundtable): final catch-up night for required adventures, Scoutbook cleanup, crossover rehearsal, or extra supervised whittling practice.</w:t>
+        <w:t>Apr 15 (Roundtable): optional - final Scoutbook cleanup for any late records, or plan the crossover class's role at the April 29 awards.</w:t>
       </w:r>
     </w:p>
     <w:sectPr>
@@ -7268,12 +7233,6 @@
       <w:startOverride w:val="1"/>
     </w:lvlOverride>
   </w:num>
-  <w:num w:numId="83">
-    <w:abstractNumId w:val="9"/>
-    <w:lvlOverride w:ilvl="0">
-      <w:startOverride w:val="1"/>
-    </w:lvlOverride>
-  </w:num>
 </w:numbering>
 </file>
 

</xml_diff>

<commit_message>
Add August startup month (Welcome Back Party, New Scout Night, Aug 27 Bobcat Kickoff) as partial month across all dens
</commit_message>
<xml_diff>
--- a/downloads/Den Guide - Arrow of Light.docx
+++ b/downloads/Den Guide - Arrow of Light.docx
@@ -372,6 +372,542 @@
     <w:p>
       <w:r>
         <w:br w:type="page"/>
+      </w:r>
+    </w:p>
+    <w:p>
+      <w:pPr>
+        <w:spacing w:before="280" w:after="80"/>
+      </w:pPr>
+      <w:r>
+        <w:rPr>
+          <w:b/>
+          <w:color w:val="5B2A86"/>
+          <w:sz w:val="28"/>
+        </w:rPr>
+        <w:t>August 2026: Bobcat Kickoff</w:t>
+      </w:r>
+    </w:p>
+    <w:p>
+      <w:r>
+        <w:rPr>
+          <w:i/>
+        </w:rPr>
+        <w:t>August is a partial startup month: the Welcome Back Party (Aug 13) and New Scout Night (Aug 20) kick off the year, and the first patrol meeting (Aug 27) starts Bobcat. Meet everyone, set up how the patrol runs, and get a first taste of the Scout Oath, Law, and sign. Bobcat is finished in September, so Scouts who join in early fall still catch up.</w:t>
+      </w:r>
+    </w:p>
+    <w:tbl>
+      <w:tblPr>
+        <w:tblStyle w:val="LightGrid-Accent1"/>
+        <w:tblW w:type="auto" w:w="0"/>
+        <w:tblLook w:firstColumn="1" w:firstRow="1" w:lastColumn="0" w:lastRow="0" w:noHBand="0" w:noVBand="1" w:val="04A0"/>
+      </w:tblPr>
+      <w:tblGrid>
+        <w:gridCol w:w="3360"/>
+        <w:gridCol w:w="3360"/>
+        <w:gridCol w:w="3360"/>
+      </w:tblGrid>
+      <w:tr>
+        <w:tc>
+          <w:tcPr>
+            <w:tcW w:type="dxa" w:w="3360"/>
+          </w:tcPr>
+          <w:p>
+            <w:r>
+              <w:rPr>
+                <w:sz w:val="17"/>
+              </w:rPr>
+              <w:t>Aligned Den Meeting</w:t>
+              <w:br/>
+              <w:t>Thu Aug 27</w:t>
+            </w:r>
+          </w:p>
+        </w:tc>
+        <w:tc>
+          <w:tcPr>
+            <w:tcW w:type="dxa" w:w="3360"/>
+          </w:tcPr>
+          <w:p>
+            <w:r>
+              <w:rPr>
+                <w:sz w:val="17"/>
+              </w:rPr>
+              <w:t>New Scout Night</w:t>
+              <w:br/>
+              <w:t>Thu Aug 20</w:t>
+            </w:r>
+          </w:p>
+        </w:tc>
+        <w:tc>
+          <w:tcPr>
+            <w:tcW w:type="dxa" w:w="3360"/>
+          </w:tcPr>
+          <w:p>
+            <w:r>
+              <w:rPr>
+                <w:sz w:val="17"/>
+              </w:rPr>
+              <w:t>Pack Meeting</w:t>
+              <w:br/>
+              <w:t>Thu Aug 13</w:t>
+            </w:r>
+          </w:p>
+        </w:tc>
+      </w:tr>
+    </w:tbl>
+    <w:p/>
+    <w:p>
+      <w:r>
+        <w:rPr>
+          <w:b/>
+        </w:rPr>
+        <w:t>Family / at-home requirements this month:</w:t>
+      </w:r>
+    </w:p>
+    <w:p>
+      <w:pPr>
+        <w:pStyle w:val="ListBullet"/>
+      </w:pPr>
+      <w:r>
+        <w:t>Pick up the family welcome packet and the pack calendar at the Aug 13 Welcome Back Party.</w:t>
+      </w:r>
+    </w:p>
+    <w:p>
+      <w:pPr>
+        <w:pStyle w:val="ListBullet"/>
+      </w:pPr>
+      <w:r>
+        <w:t>Bobcat starts now and is completed in September - new families who join at New Scout Night (Aug 20) jump in then.</w:t>
+      </w:r>
+    </w:p>
+    <w:p>
+      <w:pPr>
+        <w:spacing w:before="200" w:after="80"/>
+      </w:pPr>
+      <w:r>
+        <w:rPr>
+          <w:b/>
+          <w:color w:val="5B2A86"/>
+          <w:sz w:val="25"/>
+        </w:rPr>
+        <w:t>Thu Aug 27  —  Form the Patrol &amp; Start Bobcat</w:t>
+      </w:r>
+    </w:p>
+    <w:p>
+      <w:pPr>
+        <w:spacing w:after="40"/>
+      </w:pPr>
+      <w:r>
+        <w:rPr>
+          <w:b/>
+        </w:rPr>
+        <w:t xml:space="preserve">Focus: </w:t>
+      </w:r>
+      <w:r>
+        <w:t>Get to know your patrol, set up how meetings run, and get a first look at the Scout Oath, Scout Law, and Cub Scout sign.</w:t>
+      </w:r>
+    </w:p>
+    <w:p>
+      <w:pPr>
+        <w:spacing w:after="40"/>
+      </w:pPr>
+      <w:r>
+        <w:rPr>
+          <w:b/>
+        </w:rPr>
+        <w:t>Requirements completed tonight:</w:t>
+      </w:r>
+    </w:p>
+    <w:p>
+      <w:pPr>
+        <w:pStyle w:val="ListBullet"/>
+      </w:pPr>
+      <w:r>
+        <w:t>Bobcat (start): Get to know the members of your patrol.</w:t>
+      </w:r>
+    </w:p>
+    <w:p>
+      <w:pPr>
+        <w:pStyle w:val="ListBullet"/>
+      </w:pPr>
+      <w:r>
+        <w:t>Bobcat (start): First look at the Scout Oath, Scout Law, and Cub Scout sign - completed in September.</w:t>
+      </w:r>
+    </w:p>
+    <w:p>
+      <w:pPr>
+        <w:spacing w:after="40"/>
+      </w:pPr>
+      <w:r>
+        <w:rPr>
+          <w:b/>
+        </w:rPr>
+        <w:t>Materials to bring:</w:t>
+      </w:r>
+    </w:p>
+    <w:p>
+      <w:r>
+        <w:t>whiteboard or chart paper, markers, slips of paper for voting, printable Scout Oath / Scout Law / Sign cards</w:t>
+      </w:r>
+    </w:p>
+    <w:p>
+      <w:pPr>
+        <w:spacing w:after="20"/>
+      </w:pPr>
+      <w:r>
+        <w:rPr>
+          <w:b/>
+        </w:rPr>
+        <w:t>Gathering — Name Game Mixer</w:t>
+      </w:r>
+    </w:p>
+    <w:p>
+      <w:pPr>
+        <w:spacing w:after="20"/>
+        <w:numPr>
+          <w:ilvl w:val="0"/>
+          <w:numId w:val="11"/>
+        </w:numPr>
+      </w:pPr>
+      <w:r>
+        <w:t>As Scouts arrive, play a quick name game (name + favorite animal, or toss-a-ball name catch).</w:t>
+      </w:r>
+    </w:p>
+    <w:p>
+      <w:pPr>
+        <w:spacing w:after="20"/>
+        <w:numPr>
+          <w:ilvl w:val="0"/>
+          <w:numId w:val="11"/>
+        </w:numPr>
+      </w:pPr>
+      <w:r>
+        <w:t>Den Chief learns and uses every Scout's name right away.</w:t>
+      </w:r>
+    </w:p>
+    <w:p>
+      <w:pPr>
+        <w:spacing w:after="20"/>
+        <w:numPr>
+          <w:ilvl w:val="0"/>
+          <w:numId w:val="11"/>
+        </w:numPr>
+      </w:pPr>
+      <w:r>
+        <w:t>New Scouts and returning Scouts pair up so no one stands alone.</w:t>
+      </w:r>
+    </w:p>
+    <w:p>
+      <w:pPr>
+        <w:spacing w:after="20"/>
+      </w:pPr>
+      <w:r>
+        <w:rPr>
+          <w:b/>
+        </w:rPr>
+        <w:t>Opening — Opening Ceremony</w:t>
+      </w:r>
+    </w:p>
+    <w:p>
+      <w:pPr>
+        <w:spacing w:after="20"/>
+        <w:numPr>
+          <w:ilvl w:val="0"/>
+          <w:numId w:val="12"/>
+        </w:numPr>
+      </w:pPr>
+      <w:r>
+        <w:t>Form up in a horseshoe or circle. Ask a Scout to lead the Pledge of Allegiance to the flag.</w:t>
+      </w:r>
+    </w:p>
+    <w:p>
+      <w:pPr>
+        <w:spacing w:after="20"/>
+        <w:numPr>
+          <w:ilvl w:val="0"/>
+          <w:numId w:val="12"/>
+        </w:numPr>
+      </w:pPr>
+      <w:r>
+        <w:t>Everyone gives the Cub Scout sign and recites the Scout Oath together.</w:t>
+      </w:r>
+    </w:p>
+    <w:p>
+      <w:pPr>
+        <w:spacing w:after="20"/>
+        <w:numPr>
+          <w:ilvl w:val="0"/>
+          <w:numId w:val="12"/>
+        </w:numPr>
+      </w:pPr>
+      <w:r>
+        <w:t>Recite the Scout Law together. Younger dens may say it line-by-line after the Den Chief.</w:t>
+      </w:r>
+    </w:p>
+    <w:p>
+      <w:pPr>
+        <w:spacing w:after="20"/>
+      </w:pPr>
+      <w:r>
+        <w:rPr>
+          <w:b/>
+        </w:rPr>
+        <w:t>Activity — Welcome Circle</w:t>
+      </w:r>
+    </w:p>
+    <w:p>
+      <w:pPr>
+        <w:spacing w:after="20"/>
+        <w:numPr>
+          <w:ilvl w:val="0"/>
+          <w:numId w:val="13"/>
+        </w:numPr>
+      </w:pPr>
+      <w:r>
+        <w:t>Everyone shares their name, grade, and one thing they hope to do in Scouts this year.</w:t>
+      </w:r>
+    </w:p>
+    <w:p>
+      <w:pPr>
+        <w:spacing w:after="20"/>
+        <w:numPr>
+          <w:ilvl w:val="0"/>
+          <w:numId w:val="13"/>
+        </w:numPr>
+      </w:pPr>
+      <w:r>
+        <w:t>Den Chief and leader introduce themselves and how the year works.</w:t>
+      </w:r>
+    </w:p>
+    <w:p>
+      <w:pPr>
+        <w:spacing w:after="20"/>
+        <w:numPr>
+          <w:ilvl w:val="0"/>
+          <w:numId w:val="13"/>
+        </w:numPr>
+      </w:pPr>
+      <w:r>
+        <w:t>Celebrate that this is the start of a fun year together.</w:t>
+      </w:r>
+    </w:p>
+    <w:p>
+      <w:pPr>
+        <w:spacing w:after="20"/>
+      </w:pPr>
+      <w:r>
+        <w:rPr>
+          <w:b/>
+        </w:rPr>
+        <w:t>Activity — Form Your Patrol</w:t>
+      </w:r>
+    </w:p>
+    <w:p>
+      <w:pPr>
+        <w:spacing w:after="20"/>
+        <w:numPr>
+          <w:ilvl w:val="0"/>
+          <w:numId w:val="14"/>
+        </w:numPr>
+      </w:pPr>
+      <w:r>
+        <w:t>Explain the patrol method: Scouts plan and lead while adults coach from the side.</w:t>
+      </w:r>
+    </w:p>
+    <w:p>
+      <w:pPr>
+        <w:spacing w:after="20"/>
+        <w:numPr>
+          <w:ilvl w:val="0"/>
+          <w:numId w:val="14"/>
+        </w:numPr>
+      </w:pPr>
+      <w:r>
+        <w:t>Vote on a patrol name and elect a patrol leader for the startup weeks.</w:t>
+      </w:r>
+    </w:p>
+    <w:p>
+      <w:pPr>
+        <w:spacing w:after="20"/>
+        <w:numPr>
+          <w:ilvl w:val="0"/>
+          <w:numId w:val="14"/>
+        </w:numPr>
+      </w:pPr>
+      <w:r>
+        <w:t>Draft a quick patrol Code of Conduct using Scout Law words; everyone signs it.</w:t>
+      </w:r>
+    </w:p>
+    <w:p>
+      <w:pPr>
+        <w:spacing w:after="40"/>
+      </w:pPr>
+      <w:r>
+        <w:rPr>
+          <w:i/>
+          <w:sz w:val="18"/>
+        </w:rPr>
+        <w:t>Needs: whiteboard or chart paper, markers, slips of paper for voting</w:t>
+      </w:r>
+    </w:p>
+    <w:p>
+      <w:pPr>
+        <w:spacing w:after="20"/>
+      </w:pPr>
+      <w:r>
+        <w:rPr>
+          <w:b/>
+        </w:rPr>
+        <w:t>Activity — First Look: Oath, Law &amp; Sign</w:t>
+      </w:r>
+    </w:p>
+    <w:p>
+      <w:pPr>
+        <w:spacing w:after="20"/>
+        <w:numPr>
+          <w:ilvl w:val="0"/>
+          <w:numId w:val="15"/>
+        </w:numPr>
+      </w:pPr>
+      <w:r>
+        <w:t>Show the Cub Scout sign (two fingers up) and practice it together.</w:t>
+      </w:r>
+    </w:p>
+    <w:p>
+      <w:pPr>
+        <w:spacing w:after="20"/>
+        <w:numPr>
+          <w:ilvl w:val="0"/>
+          <w:numId w:val="15"/>
+        </w:numPr>
+      </w:pPr>
+      <w:r>
+        <w:t>Read the Scout Oath and Scout Law aloud; Scouts repeat a line at a time.</w:t>
+      </w:r>
+    </w:p>
+    <w:p>
+      <w:pPr>
+        <w:spacing w:after="20"/>
+        <w:numPr>
+          <w:ilvl w:val="0"/>
+          <w:numId w:val="15"/>
+        </w:numPr>
+      </w:pPr>
+      <w:r>
+        <w:t>Hand out or display the printable Oath, Law, and Sign cards to take home and practice.</w:t>
+      </w:r>
+    </w:p>
+    <w:p>
+      <w:pPr>
+        <w:spacing w:after="40"/>
+      </w:pPr>
+      <w:r>
+        <w:rPr>
+          <w:i/>
+          <w:sz w:val="18"/>
+        </w:rPr>
+        <w:t>Needs: printable Scout Oath / Scout Law / Sign cards</w:t>
+      </w:r>
+    </w:p>
+    <w:p>
+      <w:pPr>
+        <w:spacing w:after="20"/>
+      </w:pPr>
+      <w:r>
+        <w:rPr>
+          <w:b/>
+        </w:rPr>
+        <w:t>Closing — Closing Ceremony - the Living Circle</w:t>
+      </w:r>
+    </w:p>
+    <w:p>
+      <w:pPr>
+        <w:spacing w:after="20"/>
+        <w:numPr>
+          <w:ilvl w:val="0"/>
+          <w:numId w:val="16"/>
+        </w:numPr>
+      </w:pPr>
+      <w:r>
+        <w:t>Form a circle. Everyone puts their left hand toward the center, little fingers linked to the next Scout.</w:t>
+      </w:r>
+    </w:p>
+    <w:p>
+      <w:pPr>
+        <w:spacing w:after="20"/>
+        <w:numPr>
+          <w:ilvl w:val="0"/>
+          <w:numId w:val="16"/>
+        </w:numPr>
+      </w:pPr>
+      <w:r>
+        <w:t>Den Chief shares a 1-sentence thought tied to tonight (e.g., 'Tonight we practiced being Helpful.').</w:t>
+      </w:r>
+    </w:p>
+    <w:p>
+      <w:pPr>
+        <w:spacing w:after="20"/>
+        <w:numPr>
+          <w:ilvl w:val="0"/>
+          <w:numId w:val="16"/>
+        </w:numPr>
+      </w:pPr>
+      <w:r>
+        <w:t>On the Den Chief's signal, everyone raises the circle and gives a quiet 'Do Your Best!' Dismiss.</w:t>
+      </w:r>
+    </w:p>
+    <w:p>
+      <w:pPr>
+        <w:spacing w:after="40"/>
+      </w:pPr>
+      <w:r>
+        <w:rPr>
+          <w:b/>
+        </w:rPr>
+        <w:t>Send home / follow-up:</w:t>
+      </w:r>
+    </w:p>
+    <w:p>
+      <w:pPr>
+        <w:pStyle w:val="ListBullet"/>
+      </w:pPr>
+      <w:r>
+        <w:t>Practice the Cub Scout sign and the Scout Oath and Law at home using the printable cards.</w:t>
+      </w:r>
+    </w:p>
+    <w:p>
+      <w:pPr>
+        <w:pStyle w:val="ListBullet"/>
+      </w:pPr>
+      <w:r>
+        <w:t>Watch for the weekly meeting reminder and mark the pack calendar.</w:t>
+      </w:r>
+    </w:p>
+    <w:p>
+      <w:pPr>
+        <w:spacing w:after="120"/>
+      </w:pPr>
+      <w:r>
+        <w:rPr>
+          <w:b/>
+        </w:rPr>
+        <w:t xml:space="preserve">Den Chief tip: </w:t>
+      </w:r>
+      <w:r>
+        <w:t>Keep it warm and easy - August is a soft start and families are still joining. The goal tonight is belonging and excitement, not finishing requirements. Bobcat gets completed in September.</w:t>
+      </w:r>
+    </w:p>
+    <w:p>
+      <w:pPr>
+        <w:spacing w:after="160"/>
+      </w:pPr>
+      <w:r>
+        <w:rPr>
+          <w:b/>
+        </w:rPr>
+        <w:t xml:space="preserve">Flex week idea: </w:t>
+      </w:r>
+      <w:r>
+        <w:t>Aug 13 Welcome Back Party and Aug 20 New Scout Night are pack-run. Use them to recruit, hand out calendars, and welcome new families before the Aug 27 patrol kickoff.</w:t>
       </w:r>
     </w:p>
     <w:p>
@@ -589,7 +1125,7 @@
         <w:spacing w:after="20"/>
         <w:numPr>
           <w:ilvl w:val="0"/>
-          <w:numId w:val="11"/>
+          <w:numId w:val="17"/>
         </w:numPr>
       </w:pPr>
       <w:r>
@@ -601,7 +1137,7 @@
         <w:spacing w:after="20"/>
         <w:numPr>
           <w:ilvl w:val="0"/>
-          <w:numId w:val="11"/>
+          <w:numId w:val="17"/>
         </w:numPr>
       </w:pPr>
       <w:r>
@@ -613,7 +1149,7 @@
         <w:spacing w:after="20"/>
         <w:numPr>
           <w:ilvl w:val="0"/>
-          <w:numId w:val="11"/>
+          <w:numId w:val="17"/>
         </w:numPr>
       </w:pPr>
       <w:r>
@@ -636,7 +1172,7 @@
         <w:spacing w:after="20"/>
         <w:numPr>
           <w:ilvl w:val="0"/>
-          <w:numId w:val="12"/>
+          <w:numId w:val="18"/>
         </w:numPr>
       </w:pPr>
       <w:r>
@@ -648,7 +1184,7 @@
         <w:spacing w:after="20"/>
         <w:numPr>
           <w:ilvl w:val="0"/>
-          <w:numId w:val="12"/>
+          <w:numId w:val="18"/>
         </w:numPr>
       </w:pPr>
       <w:r>
@@ -660,7 +1196,7 @@
         <w:spacing w:after="20"/>
         <w:numPr>
           <w:ilvl w:val="0"/>
-          <w:numId w:val="12"/>
+          <w:numId w:val="18"/>
         </w:numPr>
       </w:pPr>
       <w:r>
@@ -683,7 +1219,7 @@
         <w:spacing w:after="20"/>
         <w:numPr>
           <w:ilvl w:val="0"/>
-          <w:numId w:val="13"/>
+          <w:numId w:val="19"/>
         </w:numPr>
       </w:pPr>
       <w:r>
@@ -695,7 +1231,7 @@
         <w:spacing w:after="20"/>
         <w:numPr>
           <w:ilvl w:val="0"/>
-          <w:numId w:val="13"/>
+          <w:numId w:val="19"/>
         </w:numPr>
       </w:pPr>
       <w:r>
@@ -707,7 +1243,7 @@
         <w:spacing w:after="20"/>
         <w:numPr>
           <w:ilvl w:val="0"/>
-          <w:numId w:val="13"/>
+          <w:numId w:val="19"/>
         </w:numPr>
       </w:pPr>
       <w:r>
@@ -742,7 +1278,7 @@
         <w:spacing w:after="20"/>
         <w:numPr>
           <w:ilvl w:val="0"/>
-          <w:numId w:val="14"/>
+          <w:numId w:val="20"/>
         </w:numPr>
       </w:pPr>
       <w:r>
@@ -754,7 +1290,7 @@
         <w:spacing w:after="20"/>
         <w:numPr>
           <w:ilvl w:val="0"/>
-          <w:numId w:val="14"/>
+          <w:numId w:val="20"/>
         </w:numPr>
       </w:pPr>
       <w:r>
@@ -766,7 +1302,7 @@
         <w:spacing w:after="20"/>
         <w:numPr>
           <w:ilvl w:val="0"/>
-          <w:numId w:val="14"/>
+          <w:numId w:val="20"/>
         </w:numPr>
       </w:pPr>
       <w:r>
@@ -801,7 +1337,7 @@
         <w:spacing w:after="20"/>
         <w:numPr>
           <w:ilvl w:val="0"/>
-          <w:numId w:val="15"/>
+          <w:numId w:val="21"/>
         </w:numPr>
       </w:pPr>
       <w:r>
@@ -813,7 +1349,7 @@
         <w:spacing w:after="20"/>
         <w:numPr>
           <w:ilvl w:val="0"/>
-          <w:numId w:val="15"/>
+          <w:numId w:val="21"/>
         </w:numPr>
       </w:pPr>
       <w:r>
@@ -825,7 +1361,7 @@
         <w:spacing w:after="20"/>
         <w:numPr>
           <w:ilvl w:val="0"/>
-          <w:numId w:val="15"/>
+          <w:numId w:val="21"/>
         </w:numPr>
       </w:pPr>
       <w:r>
@@ -860,7 +1396,7 @@
         <w:spacing w:after="20"/>
         <w:numPr>
           <w:ilvl w:val="0"/>
-          <w:numId w:val="16"/>
+          <w:numId w:val="22"/>
         </w:numPr>
       </w:pPr>
       <w:r>
@@ -872,7 +1408,7 @@
         <w:spacing w:after="20"/>
         <w:numPr>
           <w:ilvl w:val="0"/>
-          <w:numId w:val="16"/>
+          <w:numId w:val="22"/>
         </w:numPr>
       </w:pPr>
       <w:r>
@@ -884,7 +1420,7 @@
         <w:spacing w:after="20"/>
         <w:numPr>
           <w:ilvl w:val="0"/>
-          <w:numId w:val="16"/>
+          <w:numId w:val="22"/>
         </w:numPr>
       </w:pPr>
       <w:r>
@@ -1034,7 +1570,7 @@
         <w:spacing w:after="20"/>
         <w:numPr>
           <w:ilvl w:val="0"/>
-          <w:numId w:val="17"/>
+          <w:numId w:val="23"/>
         </w:numPr>
       </w:pPr>
       <w:r>
@@ -1046,7 +1582,7 @@
         <w:spacing w:after="20"/>
         <w:numPr>
           <w:ilvl w:val="0"/>
-          <w:numId w:val="17"/>
+          <w:numId w:val="23"/>
         </w:numPr>
       </w:pPr>
       <w:r>
@@ -1058,7 +1594,7 @@
         <w:spacing w:after="20"/>
         <w:numPr>
           <w:ilvl w:val="0"/>
-          <w:numId w:val="17"/>
+          <w:numId w:val="23"/>
         </w:numPr>
       </w:pPr>
       <w:r>
@@ -1081,7 +1617,7 @@
         <w:spacing w:after="20"/>
         <w:numPr>
           <w:ilvl w:val="0"/>
-          <w:numId w:val="18"/>
+          <w:numId w:val="24"/>
         </w:numPr>
       </w:pPr>
       <w:r>
@@ -1093,7 +1629,7 @@
         <w:spacing w:after="20"/>
         <w:numPr>
           <w:ilvl w:val="0"/>
-          <w:numId w:val="18"/>
+          <w:numId w:val="24"/>
         </w:numPr>
       </w:pPr>
       <w:r>
@@ -1105,7 +1641,7 @@
         <w:spacing w:after="20"/>
         <w:numPr>
           <w:ilvl w:val="0"/>
-          <w:numId w:val="18"/>
+          <w:numId w:val="24"/>
         </w:numPr>
       </w:pPr>
       <w:r>
@@ -1128,7 +1664,7 @@
         <w:spacing w:after="20"/>
         <w:numPr>
           <w:ilvl w:val="0"/>
-          <w:numId w:val="19"/>
+          <w:numId w:val="25"/>
         </w:numPr>
       </w:pPr>
       <w:r>
@@ -1140,7 +1676,7 @@
         <w:spacing w:after="20"/>
         <w:numPr>
           <w:ilvl w:val="0"/>
-          <w:numId w:val="19"/>
+          <w:numId w:val="25"/>
         </w:numPr>
       </w:pPr>
       <w:r>
@@ -1152,7 +1688,7 @@
         <w:spacing w:after="20"/>
         <w:numPr>
           <w:ilvl w:val="0"/>
-          <w:numId w:val="19"/>
+          <w:numId w:val="25"/>
         </w:numPr>
       </w:pPr>
       <w:r>
@@ -1187,7 +1723,7 @@
         <w:spacing w:after="20"/>
         <w:numPr>
           <w:ilvl w:val="0"/>
-          <w:numId w:val="20"/>
+          <w:numId w:val="26"/>
         </w:numPr>
       </w:pPr>
       <w:r>
@@ -1199,7 +1735,7 @@
         <w:spacing w:after="20"/>
         <w:numPr>
           <w:ilvl w:val="0"/>
-          <w:numId w:val="20"/>
+          <w:numId w:val="26"/>
         </w:numPr>
       </w:pPr>
       <w:r>
@@ -1211,7 +1747,7 @@
         <w:spacing w:after="20"/>
         <w:numPr>
           <w:ilvl w:val="0"/>
-          <w:numId w:val="20"/>
+          <w:numId w:val="26"/>
         </w:numPr>
       </w:pPr>
       <w:r>
@@ -1246,7 +1782,7 @@
         <w:spacing w:after="20"/>
         <w:numPr>
           <w:ilvl w:val="0"/>
-          <w:numId w:val="21"/>
+          <w:numId w:val="27"/>
         </w:numPr>
       </w:pPr>
       <w:r>
@@ -1258,7 +1794,7 @@
         <w:spacing w:after="20"/>
         <w:numPr>
           <w:ilvl w:val="0"/>
-          <w:numId w:val="21"/>
+          <w:numId w:val="27"/>
         </w:numPr>
       </w:pPr>
       <w:r>
@@ -1270,7 +1806,7 @@
         <w:spacing w:after="20"/>
         <w:numPr>
           <w:ilvl w:val="0"/>
-          <w:numId w:val="21"/>
+          <w:numId w:val="27"/>
         </w:numPr>
       </w:pPr>
       <w:r>
@@ -1539,7 +2075,7 @@
         <w:spacing w:after="20"/>
         <w:numPr>
           <w:ilvl w:val="0"/>
-          <w:numId w:val="22"/>
+          <w:numId w:val="28"/>
         </w:numPr>
       </w:pPr>
       <w:r>
@@ -1551,7 +2087,7 @@
         <w:spacing w:after="20"/>
         <w:numPr>
           <w:ilvl w:val="0"/>
-          <w:numId w:val="22"/>
+          <w:numId w:val="28"/>
         </w:numPr>
       </w:pPr>
       <w:r>
@@ -1563,7 +2099,7 @@
         <w:spacing w:after="20"/>
         <w:numPr>
           <w:ilvl w:val="0"/>
-          <w:numId w:val="22"/>
+          <w:numId w:val="28"/>
         </w:numPr>
       </w:pPr>
       <w:r>
@@ -1586,7 +2122,7 @@
         <w:spacing w:after="20"/>
         <w:numPr>
           <w:ilvl w:val="0"/>
-          <w:numId w:val="23"/>
+          <w:numId w:val="29"/>
         </w:numPr>
       </w:pPr>
       <w:r>
@@ -1598,7 +2134,7 @@
         <w:spacing w:after="20"/>
         <w:numPr>
           <w:ilvl w:val="0"/>
-          <w:numId w:val="23"/>
+          <w:numId w:val="29"/>
         </w:numPr>
       </w:pPr>
       <w:r>
@@ -1610,7 +2146,7 @@
         <w:spacing w:after="20"/>
         <w:numPr>
           <w:ilvl w:val="0"/>
-          <w:numId w:val="23"/>
+          <w:numId w:val="29"/>
         </w:numPr>
       </w:pPr>
       <w:r>
@@ -1633,7 +2169,7 @@
         <w:spacing w:after="20"/>
         <w:numPr>
           <w:ilvl w:val="0"/>
-          <w:numId w:val="24"/>
+          <w:numId w:val="30"/>
         </w:numPr>
       </w:pPr>
       <w:r>
@@ -1645,7 +2181,7 @@
         <w:spacing w:after="20"/>
         <w:numPr>
           <w:ilvl w:val="0"/>
-          <w:numId w:val="24"/>
+          <w:numId w:val="30"/>
         </w:numPr>
       </w:pPr>
       <w:r>
@@ -1657,7 +2193,7 @@
         <w:spacing w:after="20"/>
         <w:numPr>
           <w:ilvl w:val="0"/>
-          <w:numId w:val="24"/>
+          <w:numId w:val="30"/>
         </w:numPr>
       </w:pPr>
       <w:r>
@@ -1692,7 +2228,7 @@
         <w:spacing w:after="20"/>
         <w:numPr>
           <w:ilvl w:val="0"/>
-          <w:numId w:val="25"/>
+          <w:numId w:val="31"/>
         </w:numPr>
       </w:pPr>
       <w:r>
@@ -1704,7 +2240,7 @@
         <w:spacing w:after="20"/>
         <w:numPr>
           <w:ilvl w:val="0"/>
-          <w:numId w:val="25"/>
+          <w:numId w:val="31"/>
         </w:numPr>
       </w:pPr>
       <w:r>
@@ -1716,7 +2252,7 @@
         <w:spacing w:after="20"/>
         <w:numPr>
           <w:ilvl w:val="0"/>
-          <w:numId w:val="25"/>
+          <w:numId w:val="31"/>
         </w:numPr>
       </w:pPr>
       <w:r>
@@ -1751,7 +2287,7 @@
         <w:spacing w:after="20"/>
         <w:numPr>
           <w:ilvl w:val="0"/>
-          <w:numId w:val="26"/>
+          <w:numId w:val="32"/>
         </w:numPr>
       </w:pPr>
       <w:r>
@@ -1763,7 +2299,7 @@
         <w:spacing w:after="20"/>
         <w:numPr>
           <w:ilvl w:val="0"/>
-          <w:numId w:val="26"/>
+          <w:numId w:val="32"/>
         </w:numPr>
       </w:pPr>
       <w:r>
@@ -1775,7 +2311,7 @@
         <w:spacing w:after="20"/>
         <w:numPr>
           <w:ilvl w:val="0"/>
-          <w:numId w:val="26"/>
+          <w:numId w:val="32"/>
         </w:numPr>
       </w:pPr>
       <w:r>
@@ -1810,7 +2346,7 @@
         <w:spacing w:after="20"/>
         <w:numPr>
           <w:ilvl w:val="0"/>
-          <w:numId w:val="27"/>
+          <w:numId w:val="33"/>
         </w:numPr>
       </w:pPr>
       <w:r>
@@ -1822,7 +2358,7 @@
         <w:spacing w:after="20"/>
         <w:numPr>
           <w:ilvl w:val="0"/>
-          <w:numId w:val="27"/>
+          <w:numId w:val="33"/>
         </w:numPr>
       </w:pPr>
       <w:r>
@@ -1834,7 +2370,7 @@
         <w:spacing w:after="20"/>
         <w:numPr>
           <w:ilvl w:val="0"/>
-          <w:numId w:val="27"/>
+          <w:numId w:val="33"/>
         </w:numPr>
       </w:pPr>
       <w:r>
@@ -1968,7 +2504,7 @@
         <w:spacing w:after="20"/>
         <w:numPr>
           <w:ilvl w:val="0"/>
-          <w:numId w:val="28"/>
+          <w:numId w:val="34"/>
         </w:numPr>
       </w:pPr>
       <w:r>
@@ -1980,7 +2516,7 @@
         <w:spacing w:after="20"/>
         <w:numPr>
           <w:ilvl w:val="0"/>
-          <w:numId w:val="28"/>
+          <w:numId w:val="34"/>
         </w:numPr>
       </w:pPr>
       <w:r>
@@ -1992,7 +2528,7 @@
         <w:spacing w:after="20"/>
         <w:numPr>
           <w:ilvl w:val="0"/>
-          <w:numId w:val="28"/>
+          <w:numId w:val="34"/>
         </w:numPr>
       </w:pPr>
       <w:r>
@@ -2015,7 +2551,7 @@
         <w:spacing w:after="20"/>
         <w:numPr>
           <w:ilvl w:val="0"/>
-          <w:numId w:val="29"/>
+          <w:numId w:val="35"/>
         </w:numPr>
       </w:pPr>
       <w:r>
@@ -2027,7 +2563,7 @@
         <w:spacing w:after="20"/>
         <w:numPr>
           <w:ilvl w:val="0"/>
-          <w:numId w:val="29"/>
+          <w:numId w:val="35"/>
         </w:numPr>
       </w:pPr>
       <w:r>
@@ -2039,7 +2575,7 @@
         <w:spacing w:after="20"/>
         <w:numPr>
           <w:ilvl w:val="0"/>
-          <w:numId w:val="29"/>
+          <w:numId w:val="35"/>
         </w:numPr>
       </w:pPr>
       <w:r>
@@ -2062,7 +2598,7 @@
         <w:spacing w:after="20"/>
         <w:numPr>
           <w:ilvl w:val="0"/>
-          <w:numId w:val="30"/>
+          <w:numId w:val="36"/>
         </w:numPr>
       </w:pPr>
       <w:r>
@@ -2074,7 +2610,7 @@
         <w:spacing w:after="20"/>
         <w:numPr>
           <w:ilvl w:val="0"/>
-          <w:numId w:val="30"/>
+          <w:numId w:val="36"/>
         </w:numPr>
       </w:pPr>
       <w:r>
@@ -2086,7 +2622,7 @@
         <w:spacing w:after="20"/>
         <w:numPr>
           <w:ilvl w:val="0"/>
-          <w:numId w:val="30"/>
+          <w:numId w:val="36"/>
         </w:numPr>
       </w:pPr>
       <w:r>
@@ -2121,7 +2657,7 @@
         <w:spacing w:after="20"/>
         <w:numPr>
           <w:ilvl w:val="0"/>
-          <w:numId w:val="31"/>
+          <w:numId w:val="37"/>
         </w:numPr>
       </w:pPr>
       <w:r>
@@ -2133,7 +2669,7 @@
         <w:spacing w:after="20"/>
         <w:numPr>
           <w:ilvl w:val="0"/>
-          <w:numId w:val="31"/>
+          <w:numId w:val="37"/>
         </w:numPr>
       </w:pPr>
       <w:r>
@@ -2145,7 +2681,7 @@
         <w:spacing w:after="20"/>
         <w:numPr>
           <w:ilvl w:val="0"/>
-          <w:numId w:val="31"/>
+          <w:numId w:val="37"/>
         </w:numPr>
       </w:pPr>
       <w:r>
@@ -2180,7 +2716,7 @@
         <w:spacing w:after="20"/>
         <w:numPr>
           <w:ilvl w:val="0"/>
-          <w:numId w:val="32"/>
+          <w:numId w:val="38"/>
         </w:numPr>
       </w:pPr>
       <w:r>
@@ -2192,7 +2728,7 @@
         <w:spacing w:after="20"/>
         <w:numPr>
           <w:ilvl w:val="0"/>
-          <w:numId w:val="32"/>
+          <w:numId w:val="38"/>
         </w:numPr>
       </w:pPr>
       <w:r>
@@ -2204,7 +2740,7 @@
         <w:spacing w:after="20"/>
         <w:numPr>
           <w:ilvl w:val="0"/>
-          <w:numId w:val="32"/>
+          <w:numId w:val="38"/>
         </w:numPr>
       </w:pPr>
       <w:r>
@@ -2465,7 +3001,7 @@
         <w:spacing w:after="20"/>
         <w:numPr>
           <w:ilvl w:val="0"/>
-          <w:numId w:val="33"/>
+          <w:numId w:val="39"/>
         </w:numPr>
       </w:pPr>
       <w:r>
@@ -2477,7 +3013,7 @@
         <w:spacing w:after="20"/>
         <w:numPr>
           <w:ilvl w:val="0"/>
-          <w:numId w:val="33"/>
+          <w:numId w:val="39"/>
         </w:numPr>
       </w:pPr>
       <w:r>
@@ -2489,7 +3025,7 @@
         <w:spacing w:after="20"/>
         <w:numPr>
           <w:ilvl w:val="0"/>
-          <w:numId w:val="33"/>
+          <w:numId w:val="39"/>
         </w:numPr>
       </w:pPr>
       <w:r>
@@ -2512,7 +3048,7 @@
         <w:spacing w:after="20"/>
         <w:numPr>
           <w:ilvl w:val="0"/>
-          <w:numId w:val="34"/>
+          <w:numId w:val="40"/>
         </w:numPr>
       </w:pPr>
       <w:r>
@@ -2524,7 +3060,7 @@
         <w:spacing w:after="20"/>
         <w:numPr>
           <w:ilvl w:val="0"/>
-          <w:numId w:val="34"/>
+          <w:numId w:val="40"/>
         </w:numPr>
       </w:pPr>
       <w:r>
@@ -2536,7 +3072,7 @@
         <w:spacing w:after="20"/>
         <w:numPr>
           <w:ilvl w:val="0"/>
-          <w:numId w:val="34"/>
+          <w:numId w:val="40"/>
         </w:numPr>
       </w:pPr>
       <w:r>
@@ -2559,7 +3095,7 @@
         <w:spacing w:after="20"/>
         <w:numPr>
           <w:ilvl w:val="0"/>
-          <w:numId w:val="35"/>
+          <w:numId w:val="41"/>
         </w:numPr>
       </w:pPr>
       <w:r>
@@ -2571,7 +3107,7 @@
         <w:spacing w:after="20"/>
         <w:numPr>
           <w:ilvl w:val="0"/>
-          <w:numId w:val="35"/>
+          <w:numId w:val="41"/>
         </w:numPr>
       </w:pPr>
       <w:r>
@@ -2583,7 +3119,7 @@
         <w:spacing w:after="20"/>
         <w:numPr>
           <w:ilvl w:val="0"/>
-          <w:numId w:val="35"/>
+          <w:numId w:val="41"/>
         </w:numPr>
       </w:pPr>
       <w:r>
@@ -2618,7 +3154,7 @@
         <w:spacing w:after="20"/>
         <w:numPr>
           <w:ilvl w:val="0"/>
-          <w:numId w:val="36"/>
+          <w:numId w:val="42"/>
         </w:numPr>
       </w:pPr>
       <w:r>
@@ -2630,7 +3166,7 @@
         <w:spacing w:after="20"/>
         <w:numPr>
           <w:ilvl w:val="0"/>
-          <w:numId w:val="36"/>
+          <w:numId w:val="42"/>
         </w:numPr>
       </w:pPr>
       <w:r>
@@ -2642,7 +3178,7 @@
         <w:spacing w:after="20"/>
         <w:numPr>
           <w:ilvl w:val="0"/>
-          <w:numId w:val="36"/>
+          <w:numId w:val="42"/>
         </w:numPr>
       </w:pPr>
       <w:r>
@@ -2677,7 +3213,7 @@
         <w:spacing w:after="20"/>
         <w:numPr>
           <w:ilvl w:val="0"/>
-          <w:numId w:val="37"/>
+          <w:numId w:val="43"/>
         </w:numPr>
       </w:pPr>
       <w:r>
@@ -2689,7 +3225,7 @@
         <w:spacing w:after="20"/>
         <w:numPr>
           <w:ilvl w:val="0"/>
-          <w:numId w:val="37"/>
+          <w:numId w:val="43"/>
         </w:numPr>
       </w:pPr>
       <w:r>
@@ -2701,7 +3237,7 @@
         <w:spacing w:after="20"/>
         <w:numPr>
           <w:ilvl w:val="0"/>
-          <w:numId w:val="37"/>
+          <w:numId w:val="43"/>
         </w:numPr>
       </w:pPr>
       <w:r>
@@ -2736,7 +3272,7 @@
         <w:spacing w:after="20"/>
         <w:numPr>
           <w:ilvl w:val="0"/>
-          <w:numId w:val="38"/>
+          <w:numId w:val="44"/>
         </w:numPr>
       </w:pPr>
       <w:r>
@@ -2748,7 +3284,7 @@
         <w:spacing w:after="20"/>
         <w:numPr>
           <w:ilvl w:val="0"/>
-          <w:numId w:val="38"/>
+          <w:numId w:val="44"/>
         </w:numPr>
       </w:pPr>
       <w:r>
@@ -2760,7 +3296,7 @@
         <w:spacing w:after="20"/>
         <w:numPr>
           <w:ilvl w:val="0"/>
-          <w:numId w:val="38"/>
+          <w:numId w:val="44"/>
         </w:numPr>
       </w:pPr>
       <w:r>
@@ -2894,7 +3430,7 @@
         <w:spacing w:after="20"/>
         <w:numPr>
           <w:ilvl w:val="0"/>
-          <w:numId w:val="39"/>
+          <w:numId w:val="45"/>
         </w:numPr>
       </w:pPr>
       <w:r>
@@ -2906,7 +3442,7 @@
         <w:spacing w:after="20"/>
         <w:numPr>
           <w:ilvl w:val="0"/>
-          <w:numId w:val="39"/>
+          <w:numId w:val="45"/>
         </w:numPr>
       </w:pPr>
       <w:r>
@@ -2918,7 +3454,7 @@
         <w:spacing w:after="20"/>
         <w:numPr>
           <w:ilvl w:val="0"/>
-          <w:numId w:val="39"/>
+          <w:numId w:val="45"/>
         </w:numPr>
       </w:pPr>
       <w:r>
@@ -2941,7 +3477,7 @@
         <w:spacing w:after="20"/>
         <w:numPr>
           <w:ilvl w:val="0"/>
-          <w:numId w:val="40"/>
+          <w:numId w:val="46"/>
         </w:numPr>
       </w:pPr>
       <w:r>
@@ -2953,7 +3489,7 @@
         <w:spacing w:after="20"/>
         <w:numPr>
           <w:ilvl w:val="0"/>
-          <w:numId w:val="40"/>
+          <w:numId w:val="46"/>
         </w:numPr>
       </w:pPr>
       <w:r>
@@ -2965,7 +3501,7 @@
         <w:spacing w:after="20"/>
         <w:numPr>
           <w:ilvl w:val="0"/>
-          <w:numId w:val="40"/>
+          <w:numId w:val="46"/>
         </w:numPr>
       </w:pPr>
       <w:r>
@@ -2988,7 +3524,7 @@
         <w:spacing w:after="20"/>
         <w:numPr>
           <w:ilvl w:val="0"/>
-          <w:numId w:val="41"/>
+          <w:numId w:val="47"/>
         </w:numPr>
       </w:pPr>
       <w:r>
@@ -3000,7 +3536,7 @@
         <w:spacing w:after="20"/>
         <w:numPr>
           <w:ilvl w:val="0"/>
-          <w:numId w:val="41"/>
+          <w:numId w:val="47"/>
         </w:numPr>
       </w:pPr>
       <w:r>
@@ -3012,7 +3548,7 @@
         <w:spacing w:after="20"/>
         <w:numPr>
           <w:ilvl w:val="0"/>
-          <w:numId w:val="41"/>
+          <w:numId w:val="47"/>
         </w:numPr>
       </w:pPr>
       <w:r>
@@ -3047,7 +3583,7 @@
         <w:spacing w:after="20"/>
         <w:numPr>
           <w:ilvl w:val="0"/>
-          <w:numId w:val="42"/>
+          <w:numId w:val="48"/>
         </w:numPr>
       </w:pPr>
       <w:r>
@@ -3059,7 +3595,7 @@
         <w:spacing w:after="20"/>
         <w:numPr>
           <w:ilvl w:val="0"/>
-          <w:numId w:val="42"/>
+          <w:numId w:val="48"/>
         </w:numPr>
       </w:pPr>
       <w:r>
@@ -3071,7 +3607,7 @@
         <w:spacing w:after="20"/>
         <w:numPr>
           <w:ilvl w:val="0"/>
-          <w:numId w:val="42"/>
+          <w:numId w:val="48"/>
         </w:numPr>
       </w:pPr>
       <w:r>
@@ -3106,7 +3642,7 @@
         <w:spacing w:after="20"/>
         <w:numPr>
           <w:ilvl w:val="0"/>
-          <w:numId w:val="43"/>
+          <w:numId w:val="49"/>
         </w:numPr>
       </w:pPr>
       <w:r>
@@ -3118,7 +3654,7 @@
         <w:spacing w:after="20"/>
         <w:numPr>
           <w:ilvl w:val="0"/>
-          <w:numId w:val="43"/>
+          <w:numId w:val="49"/>
         </w:numPr>
       </w:pPr>
       <w:r>
@@ -3130,7 +3666,7 @@
         <w:spacing w:after="20"/>
         <w:numPr>
           <w:ilvl w:val="0"/>
-          <w:numId w:val="43"/>
+          <w:numId w:val="49"/>
         </w:numPr>
       </w:pPr>
       <w:r>
@@ -3391,7 +3927,7 @@
         <w:spacing w:after="20"/>
         <w:numPr>
           <w:ilvl w:val="0"/>
-          <w:numId w:val="44"/>
+          <w:numId w:val="50"/>
         </w:numPr>
       </w:pPr>
       <w:r>
@@ -3403,7 +3939,7 @@
         <w:spacing w:after="20"/>
         <w:numPr>
           <w:ilvl w:val="0"/>
-          <w:numId w:val="44"/>
+          <w:numId w:val="50"/>
         </w:numPr>
       </w:pPr>
       <w:r>
@@ -3415,7 +3951,7 @@
         <w:spacing w:after="20"/>
         <w:numPr>
           <w:ilvl w:val="0"/>
-          <w:numId w:val="44"/>
+          <w:numId w:val="50"/>
         </w:numPr>
       </w:pPr>
       <w:r>
@@ -3438,7 +3974,7 @@
         <w:spacing w:after="20"/>
         <w:numPr>
           <w:ilvl w:val="0"/>
-          <w:numId w:val="45"/>
+          <w:numId w:val="51"/>
         </w:numPr>
       </w:pPr>
       <w:r>
@@ -3450,7 +3986,7 @@
         <w:spacing w:after="20"/>
         <w:numPr>
           <w:ilvl w:val="0"/>
-          <w:numId w:val="45"/>
+          <w:numId w:val="51"/>
         </w:numPr>
       </w:pPr>
       <w:r>
@@ -3462,7 +3998,7 @@
         <w:spacing w:after="20"/>
         <w:numPr>
           <w:ilvl w:val="0"/>
-          <w:numId w:val="45"/>
+          <w:numId w:val="51"/>
         </w:numPr>
       </w:pPr>
       <w:r>
@@ -3485,7 +4021,7 @@
         <w:spacing w:after="20"/>
         <w:numPr>
           <w:ilvl w:val="0"/>
-          <w:numId w:val="46"/>
+          <w:numId w:val="52"/>
         </w:numPr>
       </w:pPr>
       <w:r>
@@ -3497,7 +4033,7 @@
         <w:spacing w:after="20"/>
         <w:numPr>
           <w:ilvl w:val="0"/>
-          <w:numId w:val="46"/>
+          <w:numId w:val="52"/>
         </w:numPr>
       </w:pPr>
       <w:r>
@@ -3509,7 +4045,7 @@
         <w:spacing w:after="20"/>
         <w:numPr>
           <w:ilvl w:val="0"/>
-          <w:numId w:val="46"/>
+          <w:numId w:val="52"/>
         </w:numPr>
       </w:pPr>
       <w:r>
@@ -3544,7 +4080,7 @@
         <w:spacing w:after="20"/>
         <w:numPr>
           <w:ilvl w:val="0"/>
-          <w:numId w:val="47"/>
+          <w:numId w:val="53"/>
         </w:numPr>
       </w:pPr>
       <w:r>
@@ -3556,7 +4092,7 @@
         <w:spacing w:after="20"/>
         <w:numPr>
           <w:ilvl w:val="0"/>
-          <w:numId w:val="47"/>
+          <w:numId w:val="53"/>
         </w:numPr>
       </w:pPr>
       <w:r>
@@ -3568,7 +4104,7 @@
         <w:spacing w:after="20"/>
         <w:numPr>
           <w:ilvl w:val="0"/>
-          <w:numId w:val="47"/>
+          <w:numId w:val="53"/>
         </w:numPr>
       </w:pPr>
       <w:r>
@@ -3603,7 +4139,7 @@
         <w:spacing w:after="20"/>
         <w:numPr>
           <w:ilvl w:val="0"/>
-          <w:numId w:val="48"/>
+          <w:numId w:val="54"/>
         </w:numPr>
       </w:pPr>
       <w:r>
@@ -3615,7 +4151,7 @@
         <w:spacing w:after="20"/>
         <w:numPr>
           <w:ilvl w:val="0"/>
-          <w:numId w:val="48"/>
+          <w:numId w:val="54"/>
         </w:numPr>
       </w:pPr>
       <w:r>
@@ -3627,7 +4163,7 @@
         <w:spacing w:after="20"/>
         <w:numPr>
           <w:ilvl w:val="0"/>
-          <w:numId w:val="48"/>
+          <w:numId w:val="54"/>
         </w:numPr>
       </w:pPr>
       <w:r>
@@ -3761,7 +4297,7 @@
         <w:spacing w:after="20"/>
         <w:numPr>
           <w:ilvl w:val="0"/>
-          <w:numId w:val="49"/>
+          <w:numId w:val="55"/>
         </w:numPr>
       </w:pPr>
       <w:r>
@@ -3773,7 +4309,7 @@
         <w:spacing w:after="20"/>
         <w:numPr>
           <w:ilvl w:val="0"/>
-          <w:numId w:val="49"/>
+          <w:numId w:val="55"/>
         </w:numPr>
       </w:pPr>
       <w:r>
@@ -3785,7 +4321,7 @@
         <w:spacing w:after="20"/>
         <w:numPr>
           <w:ilvl w:val="0"/>
-          <w:numId w:val="49"/>
+          <w:numId w:val="55"/>
         </w:numPr>
       </w:pPr>
       <w:r>
@@ -3808,7 +4344,7 @@
         <w:spacing w:after="20"/>
         <w:numPr>
           <w:ilvl w:val="0"/>
-          <w:numId w:val="50"/>
+          <w:numId w:val="56"/>
         </w:numPr>
       </w:pPr>
       <w:r>
@@ -3820,7 +4356,7 @@
         <w:spacing w:after="20"/>
         <w:numPr>
           <w:ilvl w:val="0"/>
-          <w:numId w:val="50"/>
+          <w:numId w:val="56"/>
         </w:numPr>
       </w:pPr>
       <w:r>
@@ -3832,7 +4368,7 @@
         <w:spacing w:after="20"/>
         <w:numPr>
           <w:ilvl w:val="0"/>
-          <w:numId w:val="50"/>
+          <w:numId w:val="56"/>
         </w:numPr>
       </w:pPr>
       <w:r>
@@ -3855,7 +4391,7 @@
         <w:spacing w:after="20"/>
         <w:numPr>
           <w:ilvl w:val="0"/>
-          <w:numId w:val="51"/>
+          <w:numId w:val="57"/>
         </w:numPr>
       </w:pPr>
       <w:r>
@@ -3867,7 +4403,7 @@
         <w:spacing w:after="20"/>
         <w:numPr>
           <w:ilvl w:val="0"/>
-          <w:numId w:val="51"/>
+          <w:numId w:val="57"/>
         </w:numPr>
       </w:pPr>
       <w:r>
@@ -3879,7 +4415,7 @@
         <w:spacing w:after="20"/>
         <w:numPr>
           <w:ilvl w:val="0"/>
-          <w:numId w:val="51"/>
+          <w:numId w:val="57"/>
         </w:numPr>
       </w:pPr>
       <w:r>
@@ -3914,7 +4450,7 @@
         <w:spacing w:after="20"/>
         <w:numPr>
           <w:ilvl w:val="0"/>
-          <w:numId w:val="52"/>
+          <w:numId w:val="58"/>
         </w:numPr>
       </w:pPr>
       <w:r>
@@ -3926,7 +4462,7 @@
         <w:spacing w:after="20"/>
         <w:numPr>
           <w:ilvl w:val="0"/>
-          <w:numId w:val="52"/>
+          <w:numId w:val="58"/>
         </w:numPr>
       </w:pPr>
       <w:r>
@@ -3938,7 +4474,7 @@
         <w:spacing w:after="20"/>
         <w:numPr>
           <w:ilvl w:val="0"/>
-          <w:numId w:val="52"/>
+          <w:numId w:val="58"/>
         </w:numPr>
       </w:pPr>
       <w:r>
@@ -3973,7 +4509,7 @@
         <w:spacing w:after="20"/>
         <w:numPr>
           <w:ilvl w:val="0"/>
-          <w:numId w:val="53"/>
+          <w:numId w:val="59"/>
         </w:numPr>
       </w:pPr>
       <w:r>
@@ -3985,7 +4521,7 @@
         <w:spacing w:after="20"/>
         <w:numPr>
           <w:ilvl w:val="0"/>
-          <w:numId w:val="53"/>
+          <w:numId w:val="59"/>
         </w:numPr>
       </w:pPr>
       <w:r>
@@ -3997,7 +4533,7 @@
         <w:spacing w:after="20"/>
         <w:numPr>
           <w:ilvl w:val="0"/>
-          <w:numId w:val="53"/>
+          <w:numId w:val="59"/>
         </w:numPr>
       </w:pPr>
       <w:r>
@@ -4258,7 +4794,7 @@
         <w:spacing w:after="20"/>
         <w:numPr>
           <w:ilvl w:val="0"/>
-          <w:numId w:val="54"/>
+          <w:numId w:val="60"/>
         </w:numPr>
       </w:pPr>
       <w:r>
@@ -4270,7 +4806,7 @@
         <w:spacing w:after="20"/>
         <w:numPr>
           <w:ilvl w:val="0"/>
-          <w:numId w:val="54"/>
+          <w:numId w:val="60"/>
         </w:numPr>
       </w:pPr>
       <w:r>
@@ -4282,7 +4818,7 @@
         <w:spacing w:after="20"/>
         <w:numPr>
           <w:ilvl w:val="0"/>
-          <w:numId w:val="54"/>
+          <w:numId w:val="60"/>
         </w:numPr>
       </w:pPr>
       <w:r>
@@ -4305,7 +4841,7 @@
         <w:spacing w:after="20"/>
         <w:numPr>
           <w:ilvl w:val="0"/>
-          <w:numId w:val="55"/>
+          <w:numId w:val="61"/>
         </w:numPr>
       </w:pPr>
       <w:r>
@@ -4317,7 +4853,7 @@
         <w:spacing w:after="20"/>
         <w:numPr>
           <w:ilvl w:val="0"/>
-          <w:numId w:val="55"/>
+          <w:numId w:val="61"/>
         </w:numPr>
       </w:pPr>
       <w:r>
@@ -4329,7 +4865,7 @@
         <w:spacing w:after="20"/>
         <w:numPr>
           <w:ilvl w:val="0"/>
-          <w:numId w:val="55"/>
+          <w:numId w:val="61"/>
         </w:numPr>
       </w:pPr>
       <w:r>
@@ -4352,7 +4888,7 @@
         <w:spacing w:after="20"/>
         <w:numPr>
           <w:ilvl w:val="0"/>
-          <w:numId w:val="56"/>
+          <w:numId w:val="62"/>
         </w:numPr>
       </w:pPr>
       <w:r>
@@ -4364,7 +4900,7 @@
         <w:spacing w:after="20"/>
         <w:numPr>
           <w:ilvl w:val="0"/>
-          <w:numId w:val="56"/>
+          <w:numId w:val="62"/>
         </w:numPr>
       </w:pPr>
       <w:r>
@@ -4376,7 +4912,7 @@
         <w:spacing w:after="20"/>
         <w:numPr>
           <w:ilvl w:val="0"/>
-          <w:numId w:val="56"/>
+          <w:numId w:val="62"/>
         </w:numPr>
       </w:pPr>
       <w:r>
@@ -4411,7 +4947,7 @@
         <w:spacing w:after="20"/>
         <w:numPr>
           <w:ilvl w:val="0"/>
-          <w:numId w:val="57"/>
+          <w:numId w:val="63"/>
         </w:numPr>
       </w:pPr>
       <w:r>
@@ -4423,7 +4959,7 @@
         <w:spacing w:after="20"/>
         <w:numPr>
           <w:ilvl w:val="0"/>
-          <w:numId w:val="57"/>
+          <w:numId w:val="63"/>
         </w:numPr>
       </w:pPr>
       <w:r>
@@ -4435,7 +4971,7 @@
         <w:spacing w:after="20"/>
         <w:numPr>
           <w:ilvl w:val="0"/>
-          <w:numId w:val="57"/>
+          <w:numId w:val="63"/>
         </w:numPr>
       </w:pPr>
       <w:r>
@@ -4470,7 +5006,7 @@
         <w:spacing w:after="20"/>
         <w:numPr>
           <w:ilvl w:val="0"/>
-          <w:numId w:val="58"/>
+          <w:numId w:val="64"/>
         </w:numPr>
       </w:pPr>
       <w:r>
@@ -4482,7 +5018,7 @@
         <w:spacing w:after="20"/>
         <w:numPr>
           <w:ilvl w:val="0"/>
-          <w:numId w:val="58"/>
+          <w:numId w:val="64"/>
         </w:numPr>
       </w:pPr>
       <w:r>
@@ -4494,7 +5030,7 @@
         <w:spacing w:after="20"/>
         <w:numPr>
           <w:ilvl w:val="0"/>
-          <w:numId w:val="58"/>
+          <w:numId w:val="64"/>
         </w:numPr>
       </w:pPr>
       <w:r>
@@ -4628,7 +5164,7 @@
         <w:spacing w:after="20"/>
         <w:numPr>
           <w:ilvl w:val="0"/>
-          <w:numId w:val="59"/>
+          <w:numId w:val="65"/>
         </w:numPr>
       </w:pPr>
       <w:r>
@@ -4640,7 +5176,7 @@
         <w:spacing w:after="20"/>
         <w:numPr>
           <w:ilvl w:val="0"/>
-          <w:numId w:val="59"/>
+          <w:numId w:val="65"/>
         </w:numPr>
       </w:pPr>
       <w:r>
@@ -4652,7 +5188,7 @@
         <w:spacing w:after="20"/>
         <w:numPr>
           <w:ilvl w:val="0"/>
-          <w:numId w:val="59"/>
+          <w:numId w:val="65"/>
         </w:numPr>
       </w:pPr>
       <w:r>
@@ -4675,7 +5211,7 @@
         <w:spacing w:after="20"/>
         <w:numPr>
           <w:ilvl w:val="0"/>
-          <w:numId w:val="60"/>
+          <w:numId w:val="66"/>
         </w:numPr>
       </w:pPr>
       <w:r>
@@ -4687,7 +5223,7 @@
         <w:spacing w:after="20"/>
         <w:numPr>
           <w:ilvl w:val="0"/>
-          <w:numId w:val="60"/>
+          <w:numId w:val="66"/>
         </w:numPr>
       </w:pPr>
       <w:r>
@@ -4699,7 +5235,7 @@
         <w:spacing w:after="20"/>
         <w:numPr>
           <w:ilvl w:val="0"/>
-          <w:numId w:val="60"/>
+          <w:numId w:val="66"/>
         </w:numPr>
       </w:pPr>
       <w:r>
@@ -4722,7 +5258,7 @@
         <w:spacing w:after="20"/>
         <w:numPr>
           <w:ilvl w:val="0"/>
-          <w:numId w:val="61"/>
+          <w:numId w:val="67"/>
         </w:numPr>
       </w:pPr>
       <w:r>
@@ -4734,7 +5270,7 @@
         <w:spacing w:after="20"/>
         <w:numPr>
           <w:ilvl w:val="0"/>
-          <w:numId w:val="61"/>
+          <w:numId w:val="67"/>
         </w:numPr>
       </w:pPr>
       <w:r>
@@ -4746,7 +5282,7 @@
         <w:spacing w:after="20"/>
         <w:numPr>
           <w:ilvl w:val="0"/>
-          <w:numId w:val="61"/>
+          <w:numId w:val="67"/>
         </w:numPr>
       </w:pPr>
       <w:r>
@@ -4781,7 +5317,7 @@
         <w:spacing w:after="20"/>
         <w:numPr>
           <w:ilvl w:val="0"/>
-          <w:numId w:val="62"/>
+          <w:numId w:val="68"/>
         </w:numPr>
       </w:pPr>
       <w:r>
@@ -4793,7 +5329,7 @@
         <w:spacing w:after="20"/>
         <w:numPr>
           <w:ilvl w:val="0"/>
-          <w:numId w:val="62"/>
+          <w:numId w:val="68"/>
         </w:numPr>
       </w:pPr>
       <w:r>
@@ -4805,7 +5341,7 @@
         <w:spacing w:after="20"/>
         <w:numPr>
           <w:ilvl w:val="0"/>
-          <w:numId w:val="62"/>
+          <w:numId w:val="68"/>
         </w:numPr>
       </w:pPr>
       <w:r>
@@ -4840,7 +5376,7 @@
         <w:spacing w:after="20"/>
         <w:numPr>
           <w:ilvl w:val="0"/>
-          <w:numId w:val="63"/>
+          <w:numId w:val="69"/>
         </w:numPr>
       </w:pPr>
       <w:r>
@@ -4852,7 +5388,7 @@
         <w:spacing w:after="20"/>
         <w:numPr>
           <w:ilvl w:val="0"/>
-          <w:numId w:val="63"/>
+          <w:numId w:val="69"/>
         </w:numPr>
       </w:pPr>
       <w:r>
@@ -4864,7 +5400,7 @@
         <w:spacing w:after="20"/>
         <w:numPr>
           <w:ilvl w:val="0"/>
-          <w:numId w:val="63"/>
+          <w:numId w:val="69"/>
         </w:numPr>
       </w:pPr>
       <w:r>
@@ -4887,7 +5423,7 @@
         <w:spacing w:after="20"/>
         <w:numPr>
           <w:ilvl w:val="0"/>
-          <w:numId w:val="64"/>
+          <w:numId w:val="70"/>
         </w:numPr>
       </w:pPr>
       <w:r>
@@ -4899,7 +5435,7 @@
         <w:spacing w:after="20"/>
         <w:numPr>
           <w:ilvl w:val="0"/>
-          <w:numId w:val="64"/>
+          <w:numId w:val="70"/>
         </w:numPr>
       </w:pPr>
       <w:r>
@@ -4911,7 +5447,7 @@
         <w:spacing w:after="20"/>
         <w:numPr>
           <w:ilvl w:val="0"/>
-          <w:numId w:val="64"/>
+          <w:numId w:val="70"/>
         </w:numPr>
       </w:pPr>
       <w:r>
@@ -5180,7 +5716,7 @@
         <w:spacing w:after="20"/>
         <w:numPr>
           <w:ilvl w:val="0"/>
-          <w:numId w:val="65"/>
+          <w:numId w:val="71"/>
         </w:numPr>
       </w:pPr>
       <w:r>
@@ -5192,7 +5728,7 @@
         <w:spacing w:after="20"/>
         <w:numPr>
           <w:ilvl w:val="0"/>
-          <w:numId w:val="65"/>
+          <w:numId w:val="71"/>
         </w:numPr>
       </w:pPr>
       <w:r>
@@ -5204,7 +5740,7 @@
         <w:spacing w:after="20"/>
         <w:numPr>
           <w:ilvl w:val="0"/>
-          <w:numId w:val="65"/>
+          <w:numId w:val="71"/>
         </w:numPr>
       </w:pPr>
       <w:r>
@@ -5227,7 +5763,7 @@
         <w:spacing w:after="20"/>
         <w:numPr>
           <w:ilvl w:val="0"/>
-          <w:numId w:val="66"/>
+          <w:numId w:val="72"/>
         </w:numPr>
       </w:pPr>
       <w:r>
@@ -5239,7 +5775,7 @@
         <w:spacing w:after="20"/>
         <w:numPr>
           <w:ilvl w:val="0"/>
-          <w:numId w:val="66"/>
+          <w:numId w:val="72"/>
         </w:numPr>
       </w:pPr>
       <w:r>
@@ -5251,7 +5787,7 @@
         <w:spacing w:after="20"/>
         <w:numPr>
           <w:ilvl w:val="0"/>
-          <w:numId w:val="66"/>
+          <w:numId w:val="72"/>
         </w:numPr>
       </w:pPr>
       <w:r>
@@ -5274,7 +5810,7 @@
         <w:spacing w:after="20"/>
         <w:numPr>
           <w:ilvl w:val="0"/>
-          <w:numId w:val="67"/>
+          <w:numId w:val="73"/>
         </w:numPr>
       </w:pPr>
       <w:r>
@@ -5286,7 +5822,7 @@
         <w:spacing w:after="20"/>
         <w:numPr>
           <w:ilvl w:val="0"/>
-          <w:numId w:val="67"/>
+          <w:numId w:val="73"/>
         </w:numPr>
       </w:pPr>
       <w:r>
@@ -5298,7 +5834,7 @@
         <w:spacing w:after="20"/>
         <w:numPr>
           <w:ilvl w:val="0"/>
-          <w:numId w:val="67"/>
+          <w:numId w:val="73"/>
         </w:numPr>
       </w:pPr>
       <w:r>
@@ -5333,7 +5869,7 @@
         <w:spacing w:after="20"/>
         <w:numPr>
           <w:ilvl w:val="0"/>
-          <w:numId w:val="68"/>
+          <w:numId w:val="74"/>
         </w:numPr>
       </w:pPr>
       <w:r>
@@ -5345,7 +5881,7 @@
         <w:spacing w:after="20"/>
         <w:numPr>
           <w:ilvl w:val="0"/>
-          <w:numId w:val="68"/>
+          <w:numId w:val="74"/>
         </w:numPr>
       </w:pPr>
       <w:r>
@@ -5357,7 +5893,7 @@
         <w:spacing w:after="20"/>
         <w:numPr>
           <w:ilvl w:val="0"/>
-          <w:numId w:val="68"/>
+          <w:numId w:val="74"/>
         </w:numPr>
       </w:pPr>
       <w:r>
@@ -5392,7 +5928,7 @@
         <w:spacing w:after="20"/>
         <w:numPr>
           <w:ilvl w:val="0"/>
-          <w:numId w:val="69"/>
+          <w:numId w:val="75"/>
         </w:numPr>
       </w:pPr>
       <w:r>
@@ -5404,7 +5940,7 @@
         <w:spacing w:after="20"/>
         <w:numPr>
           <w:ilvl w:val="0"/>
-          <w:numId w:val="69"/>
+          <w:numId w:val="75"/>
         </w:numPr>
       </w:pPr>
       <w:r>
@@ -5416,7 +5952,7 @@
         <w:spacing w:after="20"/>
         <w:numPr>
           <w:ilvl w:val="0"/>
-          <w:numId w:val="69"/>
+          <w:numId w:val="75"/>
         </w:numPr>
       </w:pPr>
       <w:r>
@@ -5550,7 +6086,7 @@
         <w:spacing w:after="20"/>
         <w:numPr>
           <w:ilvl w:val="0"/>
-          <w:numId w:val="70"/>
+          <w:numId w:val="76"/>
         </w:numPr>
       </w:pPr>
       <w:r>
@@ -5562,7 +6098,7 @@
         <w:spacing w:after="20"/>
         <w:numPr>
           <w:ilvl w:val="0"/>
-          <w:numId w:val="70"/>
+          <w:numId w:val="76"/>
         </w:numPr>
       </w:pPr>
       <w:r>
@@ -5574,7 +6110,7 @@
         <w:spacing w:after="20"/>
         <w:numPr>
           <w:ilvl w:val="0"/>
-          <w:numId w:val="70"/>
+          <w:numId w:val="76"/>
         </w:numPr>
       </w:pPr>
       <w:r>
@@ -5597,7 +6133,7 @@
         <w:spacing w:after="20"/>
         <w:numPr>
           <w:ilvl w:val="0"/>
-          <w:numId w:val="71"/>
+          <w:numId w:val="77"/>
         </w:numPr>
       </w:pPr>
       <w:r>
@@ -5609,7 +6145,7 @@
         <w:spacing w:after="20"/>
         <w:numPr>
           <w:ilvl w:val="0"/>
-          <w:numId w:val="71"/>
+          <w:numId w:val="77"/>
         </w:numPr>
       </w:pPr>
       <w:r>
@@ -5621,7 +6157,7 @@
         <w:spacing w:after="20"/>
         <w:numPr>
           <w:ilvl w:val="0"/>
-          <w:numId w:val="71"/>
+          <w:numId w:val="77"/>
         </w:numPr>
       </w:pPr>
       <w:r>
@@ -5644,7 +6180,7 @@
         <w:spacing w:after="20"/>
         <w:numPr>
           <w:ilvl w:val="0"/>
-          <w:numId w:val="72"/>
+          <w:numId w:val="78"/>
         </w:numPr>
       </w:pPr>
       <w:r>
@@ -5656,7 +6192,7 @@
         <w:spacing w:after="20"/>
         <w:numPr>
           <w:ilvl w:val="0"/>
-          <w:numId w:val="72"/>
+          <w:numId w:val="78"/>
         </w:numPr>
       </w:pPr>
       <w:r>
@@ -5668,7 +6204,7 @@
         <w:spacing w:after="20"/>
         <w:numPr>
           <w:ilvl w:val="0"/>
-          <w:numId w:val="72"/>
+          <w:numId w:val="78"/>
         </w:numPr>
       </w:pPr>
       <w:r>
@@ -5703,7 +6239,7 @@
         <w:spacing w:after="20"/>
         <w:numPr>
           <w:ilvl w:val="0"/>
-          <w:numId w:val="73"/>
+          <w:numId w:val="79"/>
         </w:numPr>
       </w:pPr>
       <w:r>
@@ -5715,7 +6251,7 @@
         <w:spacing w:after="20"/>
         <w:numPr>
           <w:ilvl w:val="0"/>
-          <w:numId w:val="73"/>
+          <w:numId w:val="79"/>
         </w:numPr>
       </w:pPr>
       <w:r>
@@ -5727,7 +6263,7 @@
         <w:spacing w:after="20"/>
         <w:numPr>
           <w:ilvl w:val="0"/>
-          <w:numId w:val="73"/>
+          <w:numId w:val="79"/>
         </w:numPr>
       </w:pPr>
       <w:r>
@@ -5762,7 +6298,7 @@
         <w:spacing w:after="20"/>
         <w:numPr>
           <w:ilvl w:val="0"/>
-          <w:numId w:val="74"/>
+          <w:numId w:val="80"/>
         </w:numPr>
       </w:pPr>
       <w:r>
@@ -5774,7 +6310,7 @@
         <w:spacing w:after="20"/>
         <w:numPr>
           <w:ilvl w:val="0"/>
-          <w:numId w:val="74"/>
+          <w:numId w:val="80"/>
         </w:numPr>
       </w:pPr>
       <w:r>
@@ -5786,7 +6322,7 @@
         <w:spacing w:after="20"/>
         <w:numPr>
           <w:ilvl w:val="0"/>
-          <w:numId w:val="74"/>
+          <w:numId w:val="80"/>
         </w:numPr>
       </w:pPr>
       <w:r>
@@ -6039,7 +6575,7 @@
         <w:spacing w:after="20"/>
         <w:numPr>
           <w:ilvl w:val="0"/>
-          <w:numId w:val="75"/>
+          <w:numId w:val="81"/>
         </w:numPr>
       </w:pPr>
       <w:r>
@@ -6051,7 +6587,7 @@
         <w:spacing w:after="20"/>
         <w:numPr>
           <w:ilvl w:val="0"/>
-          <w:numId w:val="75"/>
+          <w:numId w:val="81"/>
         </w:numPr>
       </w:pPr>
       <w:r>
@@ -6063,7 +6599,7 @@
         <w:spacing w:after="20"/>
         <w:numPr>
           <w:ilvl w:val="0"/>
-          <w:numId w:val="75"/>
+          <w:numId w:val="81"/>
         </w:numPr>
       </w:pPr>
       <w:r>
@@ -6086,7 +6622,7 @@
         <w:spacing w:after="20"/>
         <w:numPr>
           <w:ilvl w:val="0"/>
-          <w:numId w:val="76"/>
+          <w:numId w:val="82"/>
         </w:numPr>
       </w:pPr>
       <w:r>
@@ -6098,7 +6634,7 @@
         <w:spacing w:after="20"/>
         <w:numPr>
           <w:ilvl w:val="0"/>
-          <w:numId w:val="76"/>
+          <w:numId w:val="82"/>
         </w:numPr>
       </w:pPr>
       <w:r>
@@ -6110,7 +6646,7 @@
         <w:spacing w:after="20"/>
         <w:numPr>
           <w:ilvl w:val="0"/>
-          <w:numId w:val="76"/>
+          <w:numId w:val="82"/>
         </w:numPr>
       </w:pPr>
       <w:r>
@@ -6133,7 +6669,7 @@
         <w:spacing w:after="20"/>
         <w:numPr>
           <w:ilvl w:val="0"/>
-          <w:numId w:val="77"/>
+          <w:numId w:val="83"/>
         </w:numPr>
       </w:pPr>
       <w:r>
@@ -6145,7 +6681,7 @@
         <w:spacing w:after="20"/>
         <w:numPr>
           <w:ilvl w:val="0"/>
-          <w:numId w:val="77"/>
+          <w:numId w:val="83"/>
         </w:numPr>
       </w:pPr>
       <w:r>
@@ -6157,7 +6693,7 @@
         <w:spacing w:after="20"/>
         <w:numPr>
           <w:ilvl w:val="0"/>
-          <w:numId w:val="77"/>
+          <w:numId w:val="83"/>
         </w:numPr>
       </w:pPr>
       <w:r>
@@ -6192,7 +6728,7 @@
         <w:spacing w:after="20"/>
         <w:numPr>
           <w:ilvl w:val="0"/>
-          <w:numId w:val="78"/>
+          <w:numId w:val="84"/>
         </w:numPr>
       </w:pPr>
       <w:r>
@@ -6204,7 +6740,7 @@
         <w:spacing w:after="20"/>
         <w:numPr>
           <w:ilvl w:val="0"/>
-          <w:numId w:val="78"/>
+          <w:numId w:val="84"/>
         </w:numPr>
       </w:pPr>
       <w:r>
@@ -6216,7 +6752,7 @@
         <w:spacing w:after="20"/>
         <w:numPr>
           <w:ilvl w:val="0"/>
-          <w:numId w:val="78"/>
+          <w:numId w:val="84"/>
         </w:numPr>
       </w:pPr>
       <w:r>
@@ -6342,7 +6878,7 @@
         <w:spacing w:after="20"/>
         <w:numPr>
           <w:ilvl w:val="0"/>
-          <w:numId w:val="79"/>
+          <w:numId w:val="85"/>
         </w:numPr>
       </w:pPr>
       <w:r>
@@ -6354,7 +6890,7 @@
         <w:spacing w:after="20"/>
         <w:numPr>
           <w:ilvl w:val="0"/>
-          <w:numId w:val="79"/>
+          <w:numId w:val="85"/>
         </w:numPr>
       </w:pPr>
       <w:r>
@@ -6366,7 +6902,7 @@
         <w:spacing w:after="20"/>
         <w:numPr>
           <w:ilvl w:val="0"/>
-          <w:numId w:val="79"/>
+          <w:numId w:val="85"/>
         </w:numPr>
       </w:pPr>
       <w:r>
@@ -6389,7 +6925,7 @@
         <w:spacing w:after="20"/>
         <w:numPr>
           <w:ilvl w:val="0"/>
-          <w:numId w:val="80"/>
+          <w:numId w:val="86"/>
         </w:numPr>
       </w:pPr>
       <w:r>
@@ -6401,7 +6937,7 @@
         <w:spacing w:after="20"/>
         <w:numPr>
           <w:ilvl w:val="0"/>
-          <w:numId w:val="80"/>
+          <w:numId w:val="86"/>
         </w:numPr>
       </w:pPr>
       <w:r>
@@ -6413,7 +6949,7 @@
         <w:spacing w:after="20"/>
         <w:numPr>
           <w:ilvl w:val="0"/>
-          <w:numId w:val="80"/>
+          <w:numId w:val="86"/>
         </w:numPr>
       </w:pPr>
       <w:r>
@@ -6436,7 +6972,7 @@
         <w:spacing w:after="20"/>
         <w:numPr>
           <w:ilvl w:val="0"/>
-          <w:numId w:val="81"/>
+          <w:numId w:val="87"/>
         </w:numPr>
       </w:pPr>
       <w:r>
@@ -6448,7 +6984,7 @@
         <w:spacing w:after="20"/>
         <w:numPr>
           <w:ilvl w:val="0"/>
-          <w:numId w:val="81"/>
+          <w:numId w:val="87"/>
         </w:numPr>
       </w:pPr>
       <w:r>
@@ -6460,7 +6996,7 @@
         <w:spacing w:after="20"/>
         <w:numPr>
           <w:ilvl w:val="0"/>
-          <w:numId w:val="81"/>
+          <w:numId w:val="87"/>
         </w:numPr>
       </w:pPr>
       <w:r>
@@ -6495,7 +7031,7 @@
         <w:spacing w:after="20"/>
         <w:numPr>
           <w:ilvl w:val="0"/>
-          <w:numId w:val="82"/>
+          <w:numId w:val="88"/>
         </w:numPr>
       </w:pPr>
       <w:r>
@@ -6507,7 +7043,7 @@
         <w:spacing w:after="20"/>
         <w:numPr>
           <w:ilvl w:val="0"/>
-          <w:numId w:val="82"/>
+          <w:numId w:val="88"/>
         </w:numPr>
       </w:pPr>
       <w:r>
@@ -6519,7 +7055,7 @@
         <w:spacing w:after="20"/>
         <w:numPr>
           <w:ilvl w:val="0"/>
-          <w:numId w:val="82"/>
+          <w:numId w:val="88"/>
         </w:numPr>
       </w:pPr>
       <w:r>
@@ -7233,6 +7769,42 @@
       <w:startOverride w:val="1"/>
     </w:lvlOverride>
   </w:num>
+  <w:num w:numId="83">
+    <w:abstractNumId w:val="9"/>
+    <w:lvlOverride w:ilvl="0">
+      <w:startOverride w:val="1"/>
+    </w:lvlOverride>
+  </w:num>
+  <w:num w:numId="84">
+    <w:abstractNumId w:val="9"/>
+    <w:lvlOverride w:ilvl="0">
+      <w:startOverride w:val="1"/>
+    </w:lvlOverride>
+  </w:num>
+  <w:num w:numId="85">
+    <w:abstractNumId w:val="9"/>
+    <w:lvlOverride w:ilvl="0">
+      <w:startOverride w:val="1"/>
+    </w:lvlOverride>
+  </w:num>
+  <w:num w:numId="86">
+    <w:abstractNumId w:val="9"/>
+    <w:lvlOverride w:ilvl="0">
+      <w:startOverride w:val="1"/>
+    </w:lvlOverride>
+  </w:num>
+  <w:num w:numId="87">
+    <w:abstractNumId w:val="9"/>
+    <w:lvlOverride w:ilvl="0">
+      <w:startOverride w:val="1"/>
+    </w:lvlOverride>
+  </w:num>
+  <w:num w:numId="88">
+    <w:abstractNumId w:val="9"/>
+    <w:lvlOverride w:ilvl="0">
+      <w:startOverride w:val="1"/>
+    </w:lvlOverride>
+  </w:num>
 </w:numbering>
 </file>
 

</xml_diff>